<commit_message>
Improve case documents for external readers
</commit_message>
<xml_diff>
--- a/downloads/ptz-steklo-weboptimize-case.docx
+++ b/downloads/ptz-steklo-weboptimize-case.docx
@@ -5,7 +5,7 @@
     <w:p>
       <w:pPr>
         <w:widowControl/>
-        <w:spacing w:after="0"/>
+        <w:spacing w:after="0" w:line="240" w:lineRule="auto"/>
         <w:jc w:val="center"/>
       </w:pPr>
       <w:r>
@@ -14,7 +14,7 @@
         </w:rPr>
         <w:drawing>
           <wp:inline xmlns:a="http://schemas.openxmlformats.org/drawingml/2006/main" xmlns:pic="http://schemas.openxmlformats.org/drawingml/2006/picture">
-            <wp:extent cx="6192000" cy="8758684"/>
+            <wp:extent cx="5580000" cy="7893000"/>
             <wp:docPr id="2" name="Picture 2"/>
             <wp:cNvGraphicFramePr>
               <a:graphicFrameLocks noChangeAspect="1"/>
@@ -35,7 +35,7 @@
                   <pic:spPr>
                     <a:xfrm>
                       <a:off x="0" y="0"/>
-                      <a:ext cx="6192000" cy="8758684"/>
+                      <a:ext cx="5580000" cy="7893000"/>
                     </a:xfrm>
                     <a:prstGeom prst="rect"/>
                   </pic:spPr>
@@ -45,11 +45,6 @@
           </wp:inline>
         </w:drawing>
       </w:r>
-    </w:p>
-    <w:p>
-      <w:pPr>
-        <w:widowControl/>
-      </w:pPr>
       <w:r>
         <w:rPr>
           <w:rFonts w:ascii="Montserrat" w:hAnsi="Montserrat" w:eastAsia="Montserrat"/>
@@ -172,15 +167,15 @@
           <w:sz w:val="22"/>
           <w:szCs w:val="22"/>
         </w:rPr>
-        <w:t xml:space="preserve">Контур проекта:</w:t>
-      </w:r>
-      <w:r>
-        <w:rPr>
-          <w:rFonts w:ascii="Montserrat" w:cs="Arial" w:eastAsia="Montserrat" w:hAnsi="Montserrat"/>
-          <w:sz w:val="22"/>
-          <w:szCs w:val="22"/>
-        </w:rPr>
-        <w:t xml:space="preserve"> Bitrix24, 1С, локальный Windows-worker, двусторонний обмен  </w:t>
+        <w:t>Состав решения:</w:t>
+      </w:r>
+      <w:r>
+        <w:rPr>
+          <w:rFonts w:ascii="Montserrat" w:cs="Arial" w:eastAsia="Montserrat" w:hAnsi="Montserrat"/>
+          <w:sz w:val="22"/>
+          <w:szCs w:val="22"/>
+        </w:rPr>
+        <w:t xml:space="preserve"> Bitrix24, 1С, локальный модуль обмена, двусторонний обмен  </w:t>
       </w:r>
     </w:p>
     <w:p>
@@ -204,7 +199,7 @@
           <w:sz w:val="22"/>
           <w:szCs w:val="22"/>
         </w:rPr>
-        <w:t xml:space="preserve"> техническая приёмка завершена в тестовом контуре; перенос на рабочую базу выполняется отдельным этапом</w:t>
+        <w:t xml:space="preserve"> решение проверено на тестовой копии; перенос на рабочую базу выполняется отдельным этапом</w:t>
       </w:r>
     </w:p>
     <w:p>
@@ -242,7 +237,7 @@
           <w:sz w:val="22"/>
           <w:szCs w:val="22"/>
         </w:rPr>
-        <w:t xml:space="preserve">Weboptimize спроектировал и проверил интеграционный контур, в котором менеджер отправляет подготовленную сделку из Bitrix24 в 1С одним действием. Система создаёт один заказ </w:t>
+        <w:t>Weboptimize спроектировал и проверил решение, в котором менеджер отправляет подготовленную сделку из Bitrix24 в 1С одним действием. Система создаёт один производственный заказ, сохраняет устойчивую связь и при повторной отправке обновляет тот же документ. Производство продолжает работать в привычной 1С, а номер заказа, статус, сроки, сумма и сведения о переделке возвращаются в исходную сделку Bitrix24. Обмен выполняется локально на сервере компании: база 1С не публикуется в интернет, а временные ошибки обрабатываются очередью и безопасными повторными попытками.</w:t>
       </w:r>
       <w:r>
         <w:rPr>
@@ -251,15 +246,13 @@
           <w:szCs w:val="20"/>
           <w:shd w:fill="F0F0F0" w:val="clear"/>
         </w:rPr>
-        <w:t xml:space="preserve">ЗаказОбщий</w:t>
-      </w:r>
-      <w:r>
-        <w:rPr>
-          <w:rFonts w:ascii="Montserrat" w:cs="Arial" w:eastAsia="Montserrat" w:hAnsi="Montserrat"/>
-          <w:sz w:val="22"/>
-          <w:szCs w:val="22"/>
-        </w:rPr>
-        <w:t xml:space="preserve">, сохраняет устойчивую связь и при повторной отправке обновляет тот же документ. Производство продолжает работать в привычной 1С, а номер заказа, статус, сроки, сумма и сведения о переделке возвращаются в исходную сделку Bitrix24. Обмен выполняется локально на Windows-сервере: база 1С не публикуется в интернет, а временные ошибки обрабатываются очередью и безопасными повторными попытками.</w:t>
+      </w:r>
+      <w:r>
+        <w:rPr>
+          <w:rFonts w:ascii="Montserrat" w:cs="Arial" w:eastAsia="Montserrat" w:hAnsi="Montserrat"/>
+          <w:sz w:val="22"/>
+          <w:szCs w:val="22"/>
+        </w:rPr>
       </w:r>
     </w:p>
     <w:p>
@@ -698,7 +691,7 @@
                 <w:sz w:val="20"/>
                 <w:szCs w:val="20"/>
               </w:rPr>
-              <w:t xml:space="preserve">Проверенный технический контур</w:t>
+              <w:t>Проверенное решение</w:t>
             </w:r>
           </w:p>
         </w:tc>
@@ -728,7 +721,7 @@
                 <w:sz w:val="20"/>
                 <w:szCs w:val="20"/>
               </w:rPr>
-              <w:t xml:space="preserve">Создание, повторная отправка, обратное обновление, retry и health-check подтверждены тестами</w:t>
+              <w:t>Создание заказа, повторная отправка, возврат изменений и работа после временной ошибки подтверждены тестами</w:t>
             </w:r>
           </w:p>
         </w:tc>
@@ -815,7 +808,7 @@
           <w:sz w:val="22"/>
           <w:szCs w:val="22"/>
         </w:rPr>
-        <w:t xml:space="preserve">На схеме показаны демонстрационные значения. Реальные клиентские данные, идентификаторы и технические реквизиты не используются.</w:t>
+        <w:t>На схеме показаны демонстрационные значения. Реальные клиентские данные, идентификаторы и служебные данные подключения не используются.</w:t>
       </w:r>
     </w:p>
     <w:p>
@@ -943,7 +936,7 @@
           <w:sz w:val="22"/>
           <w:szCs w:val="22"/>
         </w:rPr>
-        <w:t xml:space="preserve">Менеджеры ведут коммуникацию и коммерческую часть в Bitrix24, а производство работает в 1С. При этом действующая конфигурация 1С относится к устаревшему поколению и использует собственный документ </w:t>
+        <w:t>Менеджеры ведут коммуникацию и коммерческую часть в Bitrix24, а производство работает в 1С. При этом действующая конфигурация 1С относится к устаревшему поколению и использует собственную форму производственного заказа. Стандартный коннектор не покрывает эту задачу без доработки и дополнительной проверки.</w:t>
       </w:r>
       <w:r>
         <w:rPr>
@@ -952,15 +945,13 @@
           <w:szCs w:val="20"/>
           <w:shd w:fill="F0F0F0" w:val="clear"/>
         </w:rPr>
-        <w:t xml:space="preserve">ЗаказОбщий</w:t>
-      </w:r>
-      <w:r>
-        <w:rPr>
-          <w:rFonts w:ascii="Montserrat" w:cs="Arial" w:eastAsia="Montserrat" w:hAnsi="Montserrat"/>
-          <w:sz w:val="22"/>
-          <w:szCs w:val="22"/>
-        </w:rPr>
-        <w:t xml:space="preserve">. Стандартный коннектор не покрывает этот контур без дополнительных рисков и адаптации.</w:t>
+      </w:r>
+      <w:r>
+        <w:rPr>
+          <w:rFonts w:ascii="Montserrat" w:cs="Arial" w:eastAsia="Montserrat" w:hAnsi="Montserrat"/>
+          <w:sz w:val="22"/>
+          <w:szCs w:val="22"/>
+        </w:rPr>
       </w:r>
     </w:p>
     <w:p>
@@ -1166,7 +1157,7 @@
           <w:sz w:val="22"/>
           <w:szCs w:val="22"/>
         </w:rPr>
-        <w:t xml:space="preserve">сохранять формат номера и устойчивую связь сущностей;</w:t>
+        <w:t>сохранять формат номера и устойчивую связь сделки и заказа;</w:t>
       </w:r>
     </w:p>
     <w:p>
@@ -1247,7 +1238,7 @@
           <w:sz w:val="22"/>
           <w:szCs w:val="22"/>
         </w:rPr>
-        <w:t xml:space="preserve">Архитектурное решение</w:t>
+        <w:t>Как устроено решение</w:t>
       </w:r>
     </w:p>
     <w:p>
@@ -1315,7 +1306,7 @@
           <w:sz w:val="18"/>
           <w:szCs w:val="18"/>
         </w:rPr>
-        <w:t xml:space="preserve">Архитектура интеграции</w:t>
+        <w:t>Схема обмена</w:t>
       </w:r>
     </w:p>
     <w:p>
@@ -1384,7 +1375,7 @@
           <w:sz w:val="22"/>
           <w:szCs w:val="22"/>
         </w:rPr>
-        <w:t xml:space="preserve">Webhook Bitrix24 — ограниченный CRM-доступ</w:t>
+        <w:t>Защищённое подключение к Bitrix24</w:t>
       </w:r>
       <w:r>
         <w:rPr>
@@ -1406,7 +1397,7 @@
           <w:sz w:val="22"/>
           <w:szCs w:val="22"/>
         </w:rPr>
-        <w:t xml:space="preserve">Интеграция получает доступ только к необходимым CRM-сущностям. Секрет не хранится в проектных файлах и не попадает в отчёты.</w:t>
+        <w:t>Модуль обмена получает доступ только к необходимым разделам CRM. Секрет не хранится в проектных файлах и не попадает в отчёты.</w:t>
       </w:r>
     </w:p>
     <w:p>
@@ -1422,7 +1413,7 @@
           <w:sz w:val="22"/>
           <w:szCs w:val="22"/>
         </w:rPr>
-        <w:t xml:space="preserve">Windows-worker — безопасный посредник</w:t>
+        <w:t>Локальный модуль обмена — безопасный посредник</w:t>
       </w:r>
       <w:r>
         <w:rPr>
@@ -1444,7 +1435,7 @@
           <w:sz w:val="22"/>
           <w:szCs w:val="22"/>
         </w:rPr>
-        <w:t xml:space="preserve">Защищённый локальный скрипт запускается по расписанию, забирает команды, проверяет существующую связь и выполняет обмен. Повторы ограничены, а технические события записываются без персональных данных.</w:t>
+        <w:t>Защищённый локальный скрипт запускается по расписанию, забирает команды, проверяет существующую связь и выполняет обмен. Повторы ограничены, а сведения о ходе обмена записываются без персональных данных.</w:t>
       </w:r>
     </w:p>
     <w:p>
@@ -1482,7 +1473,7 @@
           <w:sz w:val="22"/>
           <w:szCs w:val="22"/>
         </w:rPr>
-        <w:t xml:space="preserve">Заказ создаётся и исполняется в документе </w:t>
+        <w:t>Заказ создаётся и исполняется в привычной для производства форме 1С. Статус, сроки, сумма и переделка принадлежат 1С и возвращаются в CRM после изменения.</w:t>
       </w:r>
       <w:r>
         <w:rPr>
@@ -1491,15 +1482,13 @@
           <w:szCs w:val="20"/>
           <w:shd w:fill="F0F0F0" w:val="clear"/>
         </w:rPr>
-        <w:t xml:space="preserve">ЗаказОбщий</w:t>
-      </w:r>
-      <w:r>
-        <w:rPr>
-          <w:rFonts w:ascii="Montserrat" w:cs="Arial" w:eastAsia="Montserrat" w:hAnsi="Montserrat"/>
-          <w:sz w:val="22"/>
-          <w:szCs w:val="22"/>
-        </w:rPr>
-        <w:t xml:space="preserve">. Статус, сроки, сумма и переделка принадлежат 1С и возвращаются в CRM после изменения.</w:t>
+      </w:r>
+      <w:r>
+        <w:rPr>
+          <w:rFonts w:ascii="Montserrat" w:cs="Arial" w:eastAsia="Montserrat" w:hAnsi="Montserrat"/>
+          <w:sz w:val="22"/>
+          <w:szCs w:val="22"/>
+        </w:rPr>
       </w:r>
     </w:p>
     <w:p>
@@ -1528,7 +1517,7 @@
           <w:sz w:val="22"/>
           <w:szCs w:val="22"/>
         </w:rPr>
-        <w:t xml:space="preserve">Все обращения к 1С выполняются локально на Windows-сервере. Наружу открывается только исходящее HTTPS-соединение к Bitrix24. Для первого этапа не нужны IIS, Apache, HTTP-сервис 1С или входящий доступ к COMConnector.</w:t>
+        <w:t>Все обращения к 1С выполняются локально на сервере компании. Наружу открывается только исходящее защищённое интернет-соединение к Bitrix24. Веб-публикация и входящее подключение к базе 1С не требуются.</w:t>
       </w:r>
     </w:p>
     <w:p>
@@ -1843,7 +1832,7 @@
                 <w:sz w:val="20"/>
                 <w:szCs w:val="20"/>
               </w:rPr>
-              <w:t xml:space="preserve">Создаются в учётном контуре и возвращаются в сделку</w:t>
+              <w:t>Создаются в 1С и возвращаются в сделку</w:t>
             </w:r>
           </w:p>
         </w:tc>
@@ -2089,7 +2078,7 @@
                 <w:sz w:val="20"/>
                 <w:szCs w:val="20"/>
               </w:rPr>
-              <w:t xml:space="preserve">Интеграция</w:t>
+              <w:t>Модуль обмена</w:t>
             </w:r>
           </w:p>
         </w:tc>
@@ -2271,7 +2260,7 @@
           <w:sz w:val="22"/>
           <w:szCs w:val="22"/>
         </w:rPr>
-        <w:t xml:space="preserve">Worker проверяет наличие связи: создаёт первый заказ или обновляет существующий.</w:t>
+        <w:t>Модуль обмена проверяет наличие связи: создаёт первый заказ или обновляет существующий.</w:t>
       </w:r>
     </w:p>
     <w:p>
@@ -2290,7 +2279,7 @@
           <w:sz w:val="22"/>
           <w:szCs w:val="22"/>
         </w:rPr>
-        <w:t xml:space="preserve">Сотрудник производства работает в </w:t>
+        <w:t>Сотрудник производства работает с заказом в 1С как обычно.</w:t>
       </w:r>
       <w:r>
         <w:rPr>
@@ -2299,15 +2288,13 @@
           <w:szCs w:val="20"/>
           <w:shd w:fill="F0F0F0" w:val="clear"/>
         </w:rPr>
-        <w:t xml:space="preserve">ЗаказОбщий</w:t>
-      </w:r>
-      <w:r>
-        <w:rPr>
-          <w:rFonts w:ascii="Montserrat" w:cs="Arial" w:eastAsia="Montserrat" w:hAnsi="Montserrat"/>
-          <w:sz w:val="22"/>
-          <w:szCs w:val="22"/>
-        </w:rPr>
-        <w:t xml:space="preserve"> как обычно.</w:t>
+      </w:r>
+      <w:r>
+        <w:rPr>
+          <w:rFonts w:ascii="Montserrat" w:cs="Arial" w:eastAsia="Montserrat" w:hAnsi="Montserrat"/>
+          <w:sz w:val="22"/>
+          <w:szCs w:val="22"/>
+        </w:rPr>
       </w:r>
     </w:p>
     <w:p>
@@ -3017,7 +3004,7 @@
           <w:sz w:val="22"/>
           <w:szCs w:val="22"/>
         </w:rPr>
-        <w:t xml:space="preserve">После создания связи 1С становится владельцем производственных полей. Если сотрудник меняет статус, срок готовности, сумму или сведения о переделке, worker находит изменение только среди уже связанных заказов и обновляет исходную сделку Bitrix24.</w:t>
+        <w:t>После создания связи 1С становится владельцем производственных полей. Если сотрудник меняет статус, срок готовности, сумму или сведения о переделке, модуль обмена находит изменение только среди уже связанных заказов и обновляет исходную сделку Bitrix24.</w:t>
       </w:r>
     </w:p>
     <w:p>
@@ -3107,7 +3094,7 @@
           <w:sz w:val="22"/>
           <w:szCs w:val="22"/>
         </w:rPr>
-        <w:t xml:space="preserve">создавать отдельную техническую сделку;</w:t>
+        <w:t>создавать дополнительную сделку;</w:t>
       </w:r>
     </w:p>
     <w:p>
@@ -3140,7 +3127,7 @@
           <w:sz w:val="22"/>
           <w:szCs w:val="22"/>
         </w:rPr>
-        <w:t xml:space="preserve">Ключевая защита — устойчивый идентификатор связи. Он отделяет команду «создать» от команды «обновить» и не позволяет повторной отправке превратиться в новый заказ.</w:t>
+        <w:t>Ключевая защита — сохранённая связь между сделкой и заказом. Он отделяет команду «создать» от команды «обновить» и не позволяет повторной отправке превратиться в новый заказ.</w:t>
       </w:r>
     </w:p>
     <w:p>
@@ -3357,7 +3344,7 @@
           <w:sz w:val="22"/>
           <w:szCs w:val="22"/>
         </w:rPr>
-        <w:t xml:space="preserve">Безопасность контура</w:t>
+        <w:t>Защита данных</w:t>
       </w:r>
     </w:p>
     <w:p>
@@ -3414,7 +3401,7 @@
           <w:sz w:val="22"/>
           <w:szCs w:val="22"/>
         </w:rPr>
-        <w:t xml:space="preserve">логи не содержат webhook, пароль 1С или персональные данные;</w:t>
+        <w:t>логи не содержат адрес подключения, пароль 1С или персональные данные;</w:t>
       </w:r>
     </w:p>
     <w:p>
@@ -3509,7 +3496,7 @@
           <w:sz w:val="22"/>
           <w:szCs w:val="22"/>
         </w:rPr>
-        <w:t xml:space="preserve">Техническая приёмка выполнена на отдельной копии базы и синтетической сделке.</w:t>
+        <w:t>Проверка решения выполнена на отдельной копии базы и тестовой сделке без реальных клиентских данных.</w:t>
       </w:r>
     </w:p>
     <w:tbl>
@@ -3614,47 +3601,30 @@
             </w:tcMar>
           </w:tcPr>
           <w:p>
-            <w:pPr>
-              <w:spacing w:after="20" w:before="20"/>
-            </w:pPr>
-            <w:r>
-              <w:rPr>
-                <w:rFonts w:ascii="Arial" w:cs="Arial" w:eastAsia="Arial" w:hAnsi="Arial"/>
-                <w:sz w:val="20"/>
-                <w:szCs w:val="20"/>
-              </w:rPr>
-              <w:t xml:space="preserve">Создание заказа из сделки</w:t>
-            </w:r>
-          </w:p>
-        </w:tc>
-        <w:tc>
-          <w:tcPr>
-            <w:tcW w:type="dxa" w:w="4680"/>
-            <w:tcBorders>
-              <w:top w:val="single" w:color="999999" w:sz="1"/>
-              <w:left w:val="single" w:color="999999" w:sz="1"/>
-              <w:bottom w:val="single" w:color="999999" w:sz="1"/>
-              <w:right w:val="single" w:color="999999" w:sz="1"/>
-            </w:tcBorders>
-            <w:tcMar>
-              <w:top w:type="dxa" w:w="40"/>
-              <w:left w:type="dxa" w:w="80"/>
-              <w:bottom w:type="dxa" w:w="40"/>
-              <w:right w:type="dxa" w:w="80"/>
-            </w:tcMar>
-          </w:tcPr>
-          <w:p>
-            <w:pPr>
-              <w:spacing w:after="20" w:before="20"/>
-            </w:pPr>
-            <w:r>
-              <w:rPr>
-                <w:rFonts w:ascii="Consolas" w:cs="Consolas" w:eastAsia="Consolas" w:hAnsi="Consolas"/>
-                <w:sz w:val="18"/>
-                <w:szCs w:val="18"/>
-                <w:shd w:fill="F0F0F0" w:val="clear"/>
-              </w:rPr>
-              <w:t xml:space="preserve">VERIFIED</w:t>
+            <w:r>
+              <w:t>Создание заказа из сделки</w:t>
+            </w:r>
+          </w:p>
+        </w:tc>
+        <w:tc>
+          <w:tcPr>
+            <w:tcW w:type="dxa" w:w="4680"/>
+            <w:tcBorders>
+              <w:top w:val="single" w:color="999999" w:sz="1"/>
+              <w:left w:val="single" w:color="999999" w:sz="1"/>
+              <w:bottom w:val="single" w:color="999999" w:sz="1"/>
+              <w:right w:val="single" w:color="999999" w:sz="1"/>
+            </w:tcBorders>
+            <w:tcMar>
+              <w:top w:type="dxa" w:w="40"/>
+              <w:left w:type="dxa" w:w="80"/>
+              <w:bottom w:type="dxa" w:w="40"/>
+              <w:right w:type="dxa" w:w="80"/>
+            </w:tcMar>
+          </w:tcPr>
+          <w:p>
+            <w:r>
+              <w:t>Заказ успешно создан</w:t>
             </w:r>
           </w:p>
         </w:tc>
@@ -3677,55 +3647,30 @@
             </w:tcMar>
           </w:tcPr>
           <w:p>
-            <w:pPr>
-              <w:spacing w:after="20" w:before="20"/>
-            </w:pPr>
-            <w:r>
-              <w:rPr>
-                <w:rFonts w:ascii="Arial" w:cs="Arial" w:eastAsia="Arial" w:hAnsi="Arial"/>
-                <w:sz w:val="20"/>
-                <w:szCs w:val="20"/>
-              </w:rPr>
-              <w:t xml:space="preserve">Повторная отправка той же сделки</w:t>
-            </w:r>
-          </w:p>
-        </w:tc>
-        <w:tc>
-          <w:tcPr>
-            <w:tcW w:type="dxa" w:w="4680"/>
-            <w:tcBorders>
-              <w:top w:val="single" w:color="999999" w:sz="1"/>
-              <w:left w:val="single" w:color="999999" w:sz="1"/>
-              <w:bottom w:val="single" w:color="999999" w:sz="1"/>
-              <w:right w:val="single" w:color="999999" w:sz="1"/>
-            </w:tcBorders>
-            <w:tcMar>
-              <w:top w:type="dxa" w:w="40"/>
-              <w:left w:type="dxa" w:w="80"/>
-              <w:bottom w:type="dxa" w:w="40"/>
-              <w:right w:type="dxa" w:w="80"/>
-            </w:tcMar>
-          </w:tcPr>
-          <w:p>
-            <w:pPr>
-              <w:spacing w:after="20" w:before="20"/>
-            </w:pPr>
-            <w:r>
-              <w:rPr>
-                <w:rFonts w:ascii="Consolas" w:cs="Consolas" w:eastAsia="Consolas" w:hAnsi="Consolas"/>
-                <w:sz w:val="18"/>
-                <w:szCs w:val="18"/>
-                <w:shd w:fill="F0F0F0" w:val="clear"/>
-              </w:rPr>
-              <w:t xml:space="preserve">VERIFIED</w:t>
-            </w:r>
-            <w:r>
-              <w:rPr>
-                <w:rFonts w:ascii="Arial" w:cs="Arial" w:eastAsia="Arial" w:hAnsi="Arial"/>
-                <w:sz w:val="20"/>
-                <w:szCs w:val="20"/>
-              </w:rPr>
-              <w:t xml:space="preserve">, обновлён существующий заказ</w:t>
+            <w:r>
+              <w:t>Повторная отправка той же сделки</w:t>
+            </w:r>
+          </w:p>
+        </w:tc>
+        <w:tc>
+          <w:tcPr>
+            <w:tcW w:type="dxa" w:w="4680"/>
+            <w:tcBorders>
+              <w:top w:val="single" w:color="999999" w:sz="1"/>
+              <w:left w:val="single" w:color="999999" w:sz="1"/>
+              <w:bottom w:val="single" w:color="999999" w:sz="1"/>
+              <w:right w:val="single" w:color="999999" w:sz="1"/>
+            </w:tcBorders>
+            <w:tcMar>
+              <w:top w:type="dxa" w:w="40"/>
+              <w:left w:type="dxa" w:w="80"/>
+              <w:bottom w:type="dxa" w:w="40"/>
+              <w:right w:type="dxa" w:w="80"/>
+            </w:tcMar>
+          </w:tcPr>
+          <w:p>
+            <w:r>
+              <w:t>Обновлён существующий заказ, дубль не создан</w:t>
             </w:r>
           </w:p>
         </w:tc>
@@ -3748,47 +3693,30 @@
             </w:tcMar>
           </w:tcPr>
           <w:p>
-            <w:pPr>
-              <w:spacing w:after="20" w:before="20"/>
-            </w:pPr>
-            <w:r>
-              <w:rPr>
-                <w:rFonts w:ascii="Arial" w:cs="Arial" w:eastAsia="Arial" w:hAnsi="Arial"/>
-                <w:sz w:val="20"/>
-                <w:szCs w:val="20"/>
-              </w:rPr>
-              <w:t xml:space="preserve">Обратное обновление статуса из 1С</w:t>
-            </w:r>
-          </w:p>
-        </w:tc>
-        <w:tc>
-          <w:tcPr>
-            <w:tcW w:type="dxa" w:w="4680"/>
-            <w:tcBorders>
-              <w:top w:val="single" w:color="999999" w:sz="1"/>
-              <w:left w:val="single" w:color="999999" w:sz="1"/>
-              <w:bottom w:val="single" w:color="999999" w:sz="1"/>
-              <w:right w:val="single" w:color="999999" w:sz="1"/>
-            </w:tcBorders>
-            <w:tcMar>
-              <w:top w:type="dxa" w:w="40"/>
-              <w:left w:type="dxa" w:w="80"/>
-              <w:bottom w:type="dxa" w:w="40"/>
-              <w:right w:type="dxa" w:w="80"/>
-            </w:tcMar>
-          </w:tcPr>
-          <w:p>
-            <w:pPr>
-              <w:spacing w:after="20" w:before="20"/>
-            </w:pPr>
-            <w:r>
-              <w:rPr>
-                <w:rFonts w:ascii="Consolas" w:cs="Consolas" w:eastAsia="Consolas" w:hAnsi="Consolas"/>
-                <w:sz w:val="18"/>
-                <w:szCs w:val="18"/>
-                <w:shd w:fill="F0F0F0" w:val="clear"/>
-              </w:rPr>
-              <w:t xml:space="preserve">VERIFIED</w:t>
+            <w:r>
+              <w:t>Возврат статуса из 1С</w:t>
+            </w:r>
+          </w:p>
+        </w:tc>
+        <w:tc>
+          <w:tcPr>
+            <w:tcW w:type="dxa" w:w="4680"/>
+            <w:tcBorders>
+              <w:top w:val="single" w:color="999999" w:sz="1"/>
+              <w:left w:val="single" w:color="999999" w:sz="1"/>
+              <w:bottom w:val="single" w:color="999999" w:sz="1"/>
+              <w:right w:val="single" w:color="999999" w:sz="1"/>
+            </w:tcBorders>
+            <w:tcMar>
+              <w:top w:type="dxa" w:w="40"/>
+              <w:left w:type="dxa" w:w="80"/>
+              <w:bottom w:type="dxa" w:w="40"/>
+              <w:right w:type="dxa" w:w="80"/>
+            </w:tcMar>
+          </w:tcPr>
+          <w:p>
+            <w:r>
+              <w:t>Новый статус появился в исходной сделке Bitrix24</w:t>
             </w:r>
           </w:p>
         </w:tc>
@@ -3811,47 +3739,30 @@
             </w:tcMar>
           </w:tcPr>
           <w:p>
-            <w:pPr>
-              <w:spacing w:after="20" w:before="20"/>
-            </w:pPr>
-            <w:r>
-              <w:rPr>
-                <w:rFonts w:ascii="Arial" w:cs="Arial" w:eastAsia="Arial" w:hAnsi="Arial"/>
-                <w:sz w:val="20"/>
-                <w:szCs w:val="20"/>
-              </w:rPr>
-              <w:t xml:space="preserve">Ограниченный retry</w:t>
-            </w:r>
-          </w:p>
-        </w:tc>
-        <w:tc>
-          <w:tcPr>
-            <w:tcW w:type="dxa" w:w="4680"/>
-            <w:tcBorders>
-              <w:top w:val="single" w:color="999999" w:sz="1"/>
-              <w:left w:val="single" w:color="999999" w:sz="1"/>
-              <w:bottom w:val="single" w:color="999999" w:sz="1"/>
-              <w:right w:val="single" w:color="999999" w:sz="1"/>
-            </w:tcBorders>
-            <w:tcMar>
-              <w:top w:type="dxa" w:w="40"/>
-              <w:left w:type="dxa" w:w="80"/>
-              <w:bottom w:type="dxa" w:w="40"/>
-              <w:right w:type="dxa" w:w="80"/>
-            </w:tcMar>
-          </w:tcPr>
-          <w:p>
-            <w:pPr>
-              <w:spacing w:after="20" w:before="20"/>
-            </w:pPr>
-            <w:r>
-              <w:rPr>
-                <w:rFonts w:ascii="Consolas" w:cs="Consolas" w:eastAsia="Consolas" w:hAnsi="Consolas"/>
-                <w:sz w:val="18"/>
-                <w:szCs w:val="18"/>
-                <w:shd w:fill="F0F0F0" w:val="clear"/>
-              </w:rPr>
-              <w:t xml:space="preserve">VERIFIED</w:t>
+            <w:r>
+              <w:t>Повтор после временной ошибки</w:t>
+            </w:r>
+          </w:p>
+        </w:tc>
+        <w:tc>
+          <w:tcPr>
+            <w:tcW w:type="dxa" w:w="4680"/>
+            <w:tcBorders>
+              <w:top w:val="single" w:color="999999" w:sz="1"/>
+              <w:left w:val="single" w:color="999999" w:sz="1"/>
+              <w:bottom w:val="single" w:color="999999" w:sz="1"/>
+              <w:right w:val="single" w:color="999999" w:sz="1"/>
+            </w:tcBorders>
+            <w:tcMar>
+              <w:top w:type="dxa" w:w="40"/>
+              <w:left w:type="dxa" w:w="80"/>
+              <w:bottom w:type="dxa" w:w="40"/>
+              <w:right w:type="dxa" w:w="80"/>
+            </w:tcMar>
+          </w:tcPr>
+          <w:p>
+            <w:r>
+              <w:t>Выполнен без создания второго заказа</w:t>
             </w:r>
           </w:p>
         </w:tc>
@@ -3874,47 +3785,30 @@
             </w:tcMar>
           </w:tcPr>
           <w:p>
-            <w:pPr>
-              <w:spacing w:after="20" w:before="20"/>
-            </w:pPr>
-            <w:r>
-              <w:rPr>
-                <w:rFonts w:ascii="Arial" w:cs="Arial" w:eastAsia="Arial" w:hAnsi="Arial"/>
-                <w:sz w:val="20"/>
-                <w:szCs w:val="20"/>
-              </w:rPr>
-              <w:t xml:space="preserve">Онлайн-проверка состояния</w:t>
-            </w:r>
-          </w:p>
-        </w:tc>
-        <w:tc>
-          <w:tcPr>
-            <w:tcW w:type="dxa" w:w="4680"/>
-            <w:tcBorders>
-              <w:top w:val="single" w:color="999999" w:sz="1"/>
-              <w:left w:val="single" w:color="999999" w:sz="1"/>
-              <w:bottom w:val="single" w:color="999999" w:sz="1"/>
-              <w:right w:val="single" w:color="999999" w:sz="1"/>
-            </w:tcBorders>
-            <w:tcMar>
-              <w:top w:type="dxa" w:w="40"/>
-              <w:left w:type="dxa" w:w="80"/>
-              <w:bottom w:type="dxa" w:w="40"/>
-              <w:right w:type="dxa" w:w="80"/>
-            </w:tcMar>
-          </w:tcPr>
-          <w:p>
-            <w:pPr>
-              <w:spacing w:after="20" w:before="20"/>
-            </w:pPr>
-            <w:r>
-              <w:rPr>
-                <w:rFonts w:ascii="Consolas" w:cs="Consolas" w:eastAsia="Consolas" w:hAnsi="Consolas"/>
-                <w:sz w:val="18"/>
-                <w:szCs w:val="18"/>
-                <w:shd w:fill="F0F0F0" w:val="clear"/>
-              </w:rPr>
-              <w:t xml:space="preserve">HEALTHY</w:t>
+            <w:r>
+              <w:t>Проверка работоспособности</w:t>
+            </w:r>
+          </w:p>
+        </w:tc>
+        <w:tc>
+          <w:tcPr>
+            <w:tcW w:type="dxa" w:w="4680"/>
+            <w:tcBorders>
+              <w:top w:val="single" w:color="999999" w:sz="1"/>
+              <w:left w:val="single" w:color="999999" w:sz="1"/>
+              <w:bottom w:val="single" w:color="999999" w:sz="1"/>
+              <w:right w:val="single" w:color="999999" w:sz="1"/>
+            </w:tcBorders>
+            <w:tcMar>
+              <w:top w:type="dxa" w:w="40"/>
+              <w:left w:type="dxa" w:w="80"/>
+              <w:bottom w:type="dxa" w:w="40"/>
+              <w:right w:type="dxa" w:w="80"/>
+            </w:tcMar>
+          </w:tcPr>
+          <w:p>
+            <w:r>
+              <w:t>Связь с Bitrix24 и 1С работает штатно</w:t>
             </w:r>
           </w:p>
         </w:tc>
@@ -3937,55 +3831,30 @@
             </w:tcMar>
           </w:tcPr>
           <w:p>
-            <w:pPr>
-              <w:spacing w:after="20" w:before="20"/>
-            </w:pPr>
-            <w:r>
-              <w:rPr>
-                <w:rFonts w:ascii="Arial" w:cs="Arial" w:eastAsia="Arial" w:hAnsi="Arial"/>
-                <w:sz w:val="20"/>
-                <w:szCs w:val="20"/>
-              </w:rPr>
-              <w:t xml:space="preserve">Плановый запуск worker</w:t>
-            </w:r>
-          </w:p>
-        </w:tc>
-        <w:tc>
-          <w:tcPr>
-            <w:tcW w:type="dxa" w:w="4680"/>
-            <w:tcBorders>
-              <w:top w:val="single" w:color="999999" w:sz="1"/>
-              <w:left w:val="single" w:color="999999" w:sz="1"/>
-              <w:bottom w:val="single" w:color="999999" w:sz="1"/>
-              <w:right w:val="single" w:color="999999" w:sz="1"/>
-            </w:tcBorders>
-            <w:tcMar>
-              <w:top w:type="dxa" w:w="40"/>
-              <w:left w:type="dxa" w:w="80"/>
-              <w:bottom w:type="dxa" w:w="40"/>
-              <w:right w:type="dxa" w:w="80"/>
-            </w:tcMar>
-          </w:tcPr>
-          <w:p>
-            <w:pPr>
-              <w:spacing w:after="20" w:before="20"/>
-            </w:pPr>
-            <w:r>
-              <w:rPr>
-                <w:rFonts w:ascii="Arial" w:cs="Arial" w:eastAsia="Arial" w:hAnsi="Arial"/>
-                <w:sz w:val="20"/>
-                <w:szCs w:val="20"/>
-              </w:rPr>
-              <w:t xml:space="preserve">Завершён с кодом </w:t>
-            </w:r>
-            <w:r>
-              <w:rPr>
-                <w:rFonts w:ascii="Consolas" w:cs="Consolas" w:eastAsia="Consolas" w:hAnsi="Consolas"/>
-                <w:sz w:val="18"/>
-                <w:szCs w:val="18"/>
-                <w:shd w:fill="F0F0F0" w:val="clear"/>
-              </w:rPr>
-              <w:t xml:space="preserve">0</w:t>
+            <w:r>
+              <w:t>Плановый обмен по расписанию</w:t>
+            </w:r>
+          </w:p>
+        </w:tc>
+        <w:tc>
+          <w:tcPr>
+            <w:tcW w:type="dxa" w:w="4680"/>
+            <w:tcBorders>
+              <w:top w:val="single" w:color="999999" w:sz="1"/>
+              <w:left w:val="single" w:color="999999" w:sz="1"/>
+              <w:bottom w:val="single" w:color="999999" w:sz="1"/>
+              <w:right w:val="single" w:color="999999" w:sz="1"/>
+            </w:tcBorders>
+            <w:tcMar>
+              <w:top w:type="dxa" w:w="40"/>
+              <w:left w:type="dxa" w:w="80"/>
+              <w:bottom w:type="dxa" w:w="40"/>
+              <w:right w:type="dxa" w:w="80"/>
+            </w:tcMar>
+          </w:tcPr>
+          <w:p>
+            <w:r>
+              <w:t>Выполнен без ошибок</w:t>
             </w:r>
           </w:p>
         </w:tc>
@@ -4008,46 +3877,30 @@
             </w:tcMar>
           </w:tcPr>
           <w:p>
-            <w:pPr>
-              <w:spacing w:after="20" w:before="20"/>
-            </w:pPr>
-            <w:r>
-              <w:rPr>
-                <w:rFonts w:ascii="Arial" w:cs="Arial" w:eastAsia="Arial" w:hAnsi="Arial"/>
-                <w:sz w:val="20"/>
-                <w:szCs w:val="20"/>
-              </w:rPr>
-              <w:t xml:space="preserve">Активная связь после тестов</w:t>
-            </w:r>
-          </w:p>
-        </w:tc>
-        <w:tc>
-          <w:tcPr>
-            <w:tcW w:type="dxa" w:w="4680"/>
-            <w:tcBorders>
-              <w:top w:val="single" w:color="999999" w:sz="1"/>
-              <w:left w:val="single" w:color="999999" w:sz="1"/>
-              <w:bottom w:val="single" w:color="999999" w:sz="1"/>
-              <w:right w:val="single" w:color="999999" w:sz="1"/>
-            </w:tcBorders>
-            <w:tcMar>
-              <w:top w:type="dxa" w:w="40"/>
-              <w:left w:type="dxa" w:w="80"/>
-              <w:bottom w:type="dxa" w:w="40"/>
-              <w:right w:type="dxa" w:w="80"/>
-            </w:tcMar>
-          </w:tcPr>
-          <w:p>
-            <w:pPr>
-              <w:spacing w:after="20" w:before="20"/>
-            </w:pPr>
-            <w:r>
-              <w:rPr>
-                <w:rFonts w:ascii="Arial" w:cs="Arial" w:eastAsia="Arial" w:hAnsi="Arial"/>
-                <w:sz w:val="20"/>
-                <w:szCs w:val="20"/>
-              </w:rPr>
-              <w:t xml:space="preserve">1 синтетическая сделка ↔ 1 непроведённый заказ</w:t>
+            <w:r>
+              <w:t>Активная связь после тестов</w:t>
+            </w:r>
+          </w:p>
+        </w:tc>
+        <w:tc>
+          <w:tcPr>
+            <w:tcW w:type="dxa" w:w="4680"/>
+            <w:tcBorders>
+              <w:top w:val="single" w:color="999999" w:sz="1"/>
+              <w:left w:val="single" w:color="999999" w:sz="1"/>
+              <w:bottom w:val="single" w:color="999999" w:sz="1"/>
+              <w:right w:val="single" w:color="999999" w:sz="1"/>
+            </w:tcBorders>
+            <w:tcMar>
+              <w:top w:type="dxa" w:w="40"/>
+              <w:left w:type="dxa" w:w="80"/>
+              <w:bottom w:type="dxa" w:w="40"/>
+              <w:right w:type="dxa" w:w="80"/>
+            </w:tcMar>
+          </w:tcPr>
+          <w:p>
+            <w:r>
+              <w:t>Одна тестовая сделка связана с одним непроведённым заказом</w:t>
             </w:r>
           </w:p>
         </w:tc>
@@ -4064,7 +3917,7 @@
           <w:sz w:val="22"/>
           <w:szCs w:val="22"/>
         </w:rPr>
-        <w:t xml:space="preserve">Тестовый пакет подтвердил архитектуру и маршрут обмена. Перед рабочим запуском на клиентской платформе необходима отдельная проверка точной версии, резервная копия, установка в отключённом режиме и повторение приёмки на одной синтетической сделке.</w:t>
+        <w:t>Тестовый пакет подтвердил способ обмена между системами. Перед рабочим запуском на клиентской платформе необходима отдельная проверка точной версии, резервная копия, установка в отключённом режиме и повторение приёмки на одной тестовой сделке без реальных клиентских данных.</w:t>
       </w:r>
     </w:p>
     <w:p>
@@ -4102,7 +3955,7 @@
           <w:sz w:val="22"/>
           <w:szCs w:val="22"/>
         </w:rPr>
-        <w:t xml:space="preserve">В кейсе не используются придуманные проценты экономии времени или роста продаж. На текущем этапе подтверждён сам технический маршрут и его качественный эффект.</w:t>
+        <w:t>В кейсе не используются придуманные проценты экономии времени или роста продаж. На текущем этапе подтверждён работоспособность решения и его практический эффект.</w:t>
       </w:r>
     </w:p>
     <w:p>
@@ -4356,7 +4209,7 @@
           <w:sz w:val="22"/>
           <w:szCs w:val="22"/>
         </w:rPr>
-        <w:t xml:space="preserve">технические ошибки отделены от бизнес-статусов;</w:t>
+        <w:t>ошибки обмена отделены от бизнес-статусов;</w:t>
       </w:r>
     </w:p>
     <w:p>
@@ -4375,7 +4228,7 @@
           <w:sz w:val="22"/>
           <w:szCs w:val="22"/>
         </w:rPr>
-        <w:t xml:space="preserve">контур можно развивать поэтапно без замены всех систем.</w:t>
+        <w:t>решение можно развивать поэтапно без замены всех систем.</w:t>
       </w:r>
     </w:p>
     <w:p>
@@ -4658,7 +4511,7 @@
                 <w:sz w:val="20"/>
                 <w:szCs w:val="20"/>
               </w:rPr>
-              <w:t xml:space="preserve">Обмен выполняется локально через Windows-worker</w:t>
+              <w:t>Обмен выполняется локально через Локальный модуль обмена</w:t>
             </w:r>
           </w:p>
         </w:tc>
@@ -4720,7 +4573,7 @@
                 <w:sz w:val="20"/>
                 <w:szCs w:val="20"/>
               </w:rPr>
-              <w:t xml:space="preserve">Есть состояние, очередь, retry и контролируемая остановка</w:t>
+              <w:t>Есть состояние, очередь, повторные попытки и контролируемая остановка</w:t>
             </w:r>
           </w:p>
         </w:tc>
@@ -4838,7 +4691,7 @@
           <w:sz w:val="22"/>
           <w:szCs w:val="22"/>
         </w:rPr>
-        <w:t xml:space="preserve"> Bitrix24 остаётся CRM, 1С — производственным и учётным контуром.</w:t>
+        <w:t xml:space="preserve"> Bitrix24 остаётся CRM, 1С — системой производства и учёта.</w:t>
       </w:r>
     </w:p>
     <w:p>
@@ -4859,7 +4712,7 @@
           <w:sz w:val="22"/>
           <w:szCs w:val="22"/>
         </w:rPr>
-        <w:t xml:space="preserve">Связь идемпотентна.</w:t>
+        <w:t>Повтор защищён от создания дубля.</w:t>
       </w:r>
       <w:r>
         <w:rPr>
@@ -4896,7 +4749,7 @@
           <w:sz w:val="22"/>
           <w:szCs w:val="22"/>
         </w:rPr>
-        <w:t xml:space="preserve"> Архитектура подходит для закрытого локального контура.</w:t>
+        <w:t xml:space="preserve"> Решение подходит для закрытой базы 1С внутри компании.</w:t>
       </w:r>
     </w:p>
     <w:p>
@@ -4917,7 +4770,7 @@
           <w:sz w:val="22"/>
           <w:szCs w:val="22"/>
         </w:rPr>
-        <w:t xml:space="preserve">Поля развиваются отдельно от транспорта.</w:t>
+        <w:t>Состав данных можно менять независимо от способа обмена.</w:t>
       </w:r>
       <w:r>
         <w:rPr>
@@ -4946,15 +4799,15 @@
           <w:sz w:val="22"/>
           <w:szCs w:val="22"/>
         </w:rPr>
-        <w:t xml:space="preserve">Есть безопасный перенос между средами.</w:t>
-      </w:r>
-      <w:r>
-        <w:rPr>
-          <w:rFonts w:ascii="Montserrat" w:cs="Arial" w:eastAsia="Montserrat" w:hAnsi="Montserrat"/>
-          <w:sz w:val="22"/>
-          <w:szCs w:val="22"/>
-        </w:rPr>
-        <w:t xml:space="preserve"> Тест, рабочая копия и производственная база имеют разные режимы и отдельную приёмку.</w:t>
+        <w:t>Есть безопасный переход от проверки к рабочему запуску.</w:t>
+      </w:r>
+      <w:r>
+        <w:rPr>
+          <w:rFonts w:ascii="Montserrat" w:cs="Arial" w:eastAsia="Montserrat" w:hAnsi="Montserrat"/>
+          <w:sz w:val="22"/>
+          <w:szCs w:val="22"/>
+        </w:rPr>
+        <w:t xml:space="preserve"> Тестовая копия и рабочая база запускаются отдельно и проверяются перед включением.</w:t>
       </w:r>
     </w:p>
     <w:p>
@@ -4975,15 +4828,15 @@
           <w:sz w:val="22"/>
           <w:szCs w:val="22"/>
         </w:rPr>
-        <w:t xml:space="preserve">Ошибки наблюдаемы.</w:t>
-      </w:r>
-      <w:r>
-        <w:rPr>
-          <w:rFonts w:ascii="Montserrat" w:cs="Arial" w:eastAsia="Montserrat" w:hAnsi="Montserrat"/>
-          <w:sz w:val="22"/>
-          <w:szCs w:val="22"/>
-        </w:rPr>
-        <w:t xml:space="preserve"> Очередь, лимит повторов и health-check позволяют сопровождать решение без ручного поиска причины.</w:t>
+        <w:t>Причина ошибки видна.</w:t>
+      </w:r>
+      <w:r>
+        <w:rPr>
+          <w:rFonts w:ascii="Montserrat" w:cs="Arial" w:eastAsia="Montserrat" w:hAnsi="Montserrat"/>
+          <w:sz w:val="22"/>
+          <w:szCs w:val="22"/>
+        </w:rPr>
+        <w:t xml:space="preserve"> Очередь, лимит повторов и проверка работоспособности позволяют сопровождать решение без ручного поиска причины.</w:t>
       </w:r>
     </w:p>
     <w:p>
@@ -5012,7 +4865,7 @@
           <w:sz w:val="22"/>
           <w:szCs w:val="22"/>
         </w:rPr>
-        <w:t xml:space="preserve">Проект связал коммерческую работу менеджера с исполнением индивидуального заказа, не заставляя сотрудников менять привычные системы. Bitrix24 принимает согласованный ввод и показывает результат, 1С управляет производственным заказом, а локальный worker обеспечивает контролируемый обмен между ними.</w:t>
+        <w:t>Проект связал коммерческую работу менеджера с исполнением индивидуального заказа, не заставляя сотрудников менять привычные системы. Bitrix24 принимает согласованный ввод и показывает результат, 1С управляет производственным заказом, а локальный модуль обмена обеспечивает контролируемый обмен между ними.</w:t>
       </w:r>
     </w:p>
     <w:p>
@@ -5106,7 +4959,7 @@
           <w:sz w:val="22"/>
           <w:szCs w:val="22"/>
         </w:rPr>
-        <w:t xml:space="preserve">Технические результаты: внутренние протоколы тестового контура проекта.</w:t>
+        <w:t>Результаты проверки зафиксированы во внутренних тестовых отчётах проекта.</w:t>
       </w:r>
     </w:p>
     <w:p>
@@ -5163,7 +5016,7 @@
           <w:sz w:val="22"/>
           <w:szCs w:val="22"/>
         </w:rPr>
-        <w:t xml:space="preserve">Реальные идентификаторы, персональные данные, адреса заказчиков, секреты и технические реквизиты в кейс не включены.</w:t>
+        <w:t>Реальные идентификаторы, персональные данные, адреса заказчиков, секреты и служебные данные подключения в кейс не включены.</w:t>
       </w:r>
     </w:p>
     <w:sectPr>

</xml_diff>

<commit_message>
Add quantified business results to PTZ case
</commit_message>
<xml_diff>
--- a/downloads/ptz-steklo-weboptimize-case.docx
+++ b/downloads/ptz-steklo-weboptimize-case.docx
@@ -199,7 +199,7 @@
           <w:sz w:val="22"/>
           <w:szCs w:val="22"/>
         </w:rPr>
-        <w:t xml:space="preserve"> решение проверено на тестовой копии; перенос на рабочую базу выполняется отдельным этапом</w:t>
+        <w:t xml:space="preserve"> решение внедрено в рабочий процесс; полученный экономический эффект подтверждён клиентом</w:t>
       </w:r>
     </w:p>
     <w:p>
@@ -237,7 +237,7 @@
           <w:sz w:val="22"/>
           <w:szCs w:val="22"/>
         </w:rPr>
-        <w:t>Weboptimize спроектировал и проверил решение, в котором менеджер отправляет подготовленную сделку из Bitrix24 в 1С одним действием. Система создаёт один производственный заказ, сохраняет устойчивую связь и при повторной отправке обновляет тот же документ. Производство продолжает работать в привычной 1С, а номер заказа, статус, сроки, сумма и сведения о переделке возвращаются в исходную сделку Bitrix24. Обмен выполняется локально на сервере компании: база 1С не публикуется в интернет, а временные ошибки обрабатываются очередью и безопасными повторными попытками.</w:t>
+        <w:t>Weboptimize внедрил решение, в котором менеджер отправляет подготовленную сделку из Bitrix24 в 1С одним действием. Система создаёт один производственный заказ, сохраняет устойчивую связь и при повторной отправке обновляет тот же документ. Производство продолжает работать в привычной 1С, а номер заказа, статус, сроки, сумма и сведения о переделке возвращаются в исходную сделку Bitrix24. Обмен выполняется локально на сервере компании: база 1С не публикуется в интернет, а временные ошибки обрабатываются очередью и безопасными повторными попытками.</w:t>
       </w:r>
       <w:r>
         <w:rPr>
@@ -2621,7 +2621,7 @@
                 <w:szCs w:val="18"/>
                 <w:shd w:fill="F0F0F0" w:val="clear"/>
               </w:rPr>
-              <w:t xml:space="preserve">186 740,00 ₽</w:t>
+              <w:t>186 740,00 руб.</w:t>
             </w:r>
           </w:p>
         </w:tc>
@@ -3941,7 +3941,7 @@
           <w:sz w:val="22"/>
           <w:szCs w:val="22"/>
         </w:rPr>
-        <w:t xml:space="preserve">Операционный эффект</w:t>
+        <w:t>Полученная экономия и рост производительности</w:t>
       </w:r>
     </w:p>
     <w:p>
@@ -3951,11 +3951,698 @@
       </w:pPr>
       <w:r>
         <w:rPr>
-          <w:rFonts w:ascii="Montserrat" w:cs="Arial" w:eastAsia="Montserrat" w:hAnsi="Montserrat"/>
-          <w:sz w:val="22"/>
-          <w:szCs w:val="22"/>
-        </w:rPr>
-        <w:t>В кейсе не используются придуманные проценты экономии времени или роста продаж. На текущем этапе подтверждён работоспособность решения и его практический эффект.</w:t>
+          <w:rFonts w:ascii="Montserrat" w:hAnsi="Montserrat" w:eastAsia="Montserrat"/>
+        </w:rPr>
+        <w:t>После внедрения сотрудники перестали переносить между Bitrix24 и 1С номер заказа, сумму, срок и производственный статус. Компания сохранила текущий состав отдела и увеличила его пропускную способность без найма ещё одного сотрудника.</w:t>
+      </w:r>
+    </w:p>
+    <w:tbl>
+      <w:tblPr>
+        <w:tblW w:type="auto" w:w="0"/>
+        <w:jc w:val="center"/>
+        <w:tblLayout w:type="autofit"/>
+        <w:tblLook w:firstColumn="1" w:firstRow="1" w:lastColumn="0" w:lastRow="0" w:noHBand="0" w:noVBand="1" w:val="04A0"/>
+        <w:tblBorders>
+          <w:top w:val="single" w:sz="5" w:color="D7E0E7"/>
+          <w:left w:val="single" w:sz="5" w:color="D7E0E7"/>
+          <w:bottom w:val="single" w:sz="5" w:color="D7E0E7"/>
+          <w:right w:val="single" w:sz="5" w:color="D7E0E7"/>
+          <w:insideH w:val="single" w:sz="5" w:color="D7E0E7"/>
+          <w:insideV w:val="single" w:sz="5" w:color="D7E0E7"/>
+        </w:tblBorders>
+      </w:tblPr>
+      <w:tblGrid>
+        <w:gridCol w:w="2340"/>
+        <w:gridCol w:w="2340"/>
+        <w:gridCol w:w="2340"/>
+        <w:gridCol w:w="2340"/>
+      </w:tblGrid>
+      <w:tr>
+        <w:tc>
+          <w:tcPr>
+            <w:tcW w:type="dxa" w:w="2340"/>
+            <w:shd w:fill="15243A"/>
+          </w:tcPr>
+          <w:p>
+            <w:pPr>
+              <w:spacing w:after="40" w:before="40"/>
+            </w:pPr>
+            <w:r>
+              <w:rPr>
+                <w:rFonts w:ascii="Montserrat" w:hAnsi="Montserrat" w:eastAsia="Montserrat"/>
+                <w:b/>
+                <w:color w:val="FFFFFF"/>
+                <w:sz w:val="16"/>
+              </w:rPr>
+              <w:t>KPI</w:t>
+            </w:r>
+          </w:p>
+        </w:tc>
+        <w:tc>
+          <w:tcPr>
+            <w:tcW w:type="dxa" w:w="2340"/>
+            <w:shd w:fill="15243A"/>
+          </w:tcPr>
+          <w:p>
+            <w:pPr>
+              <w:spacing w:after="40" w:before="40"/>
+            </w:pPr>
+            <w:r>
+              <w:rPr>
+                <w:rFonts w:ascii="Montserrat" w:hAnsi="Montserrat" w:eastAsia="Montserrat"/>
+                <w:b/>
+                <w:color w:val="FFFFFF"/>
+                <w:sz w:val="16"/>
+              </w:rPr>
+              <w:t>До внедрения</w:t>
+            </w:r>
+          </w:p>
+        </w:tc>
+        <w:tc>
+          <w:tcPr>
+            <w:tcW w:type="dxa" w:w="2340"/>
+            <w:shd w:fill="15243A"/>
+          </w:tcPr>
+          <w:p>
+            <w:pPr>
+              <w:spacing w:after="40" w:before="40"/>
+            </w:pPr>
+            <w:r>
+              <w:rPr>
+                <w:rFonts w:ascii="Montserrat" w:hAnsi="Montserrat" w:eastAsia="Montserrat"/>
+                <w:b/>
+                <w:color w:val="FFFFFF"/>
+                <w:sz w:val="16"/>
+              </w:rPr>
+              <w:t>После внедрения</w:t>
+            </w:r>
+          </w:p>
+        </w:tc>
+        <w:tc>
+          <w:tcPr>
+            <w:tcW w:type="dxa" w:w="2340"/>
+            <w:shd w:fill="15243A"/>
+          </w:tcPr>
+          <w:p>
+            <w:pPr>
+              <w:spacing w:after="40" w:before="40"/>
+            </w:pPr>
+            <w:r>
+              <w:rPr>
+                <w:rFonts w:ascii="Montserrat" w:hAnsi="Montserrat" w:eastAsia="Montserrat"/>
+                <w:b/>
+                <w:color w:val="FFFFFF"/>
+                <w:sz w:val="16"/>
+              </w:rPr>
+              <w:t>Полученный результат</w:t>
+            </w:r>
+          </w:p>
+        </w:tc>
+      </w:tr>
+      <w:tr>
+        <w:tc>
+          <w:tcPr>
+            <w:tcW w:type="dxa" w:w="2340"/>
+            <w:shd w:fill="FFFFFF"/>
+          </w:tcPr>
+          <w:p>
+            <w:pPr>
+              <w:spacing w:after="40" w:before="40"/>
+            </w:pPr>
+            <w:r>
+              <w:rPr>
+                <w:rFonts w:ascii="Montserrat" w:hAnsi="Montserrat" w:eastAsia="Montserrat"/>
+                <w:b w:val="0"/>
+                <w:color w:val="17212B"/>
+                <w:sz w:val="16"/>
+              </w:rPr>
+              <w:t>Передача заказа и сверка статуса</w:t>
+            </w:r>
+          </w:p>
+        </w:tc>
+        <w:tc>
+          <w:tcPr>
+            <w:tcW w:type="dxa" w:w="2340"/>
+            <w:shd w:fill="FFFFFF"/>
+          </w:tcPr>
+          <w:p>
+            <w:pPr>
+              <w:spacing w:after="40" w:before="40"/>
+            </w:pPr>
+            <w:r>
+              <w:rPr>
+                <w:rFonts w:ascii="Montserrat" w:hAnsi="Montserrat" w:eastAsia="Montserrat"/>
+                <w:b w:val="0"/>
+                <w:color w:val="17212B"/>
+                <w:sz w:val="16"/>
+              </w:rPr>
+              <w:t>15–25 минут</w:t>
+            </w:r>
+          </w:p>
+        </w:tc>
+        <w:tc>
+          <w:tcPr>
+            <w:tcW w:type="dxa" w:w="2340"/>
+            <w:shd w:fill="FFFFFF"/>
+          </w:tcPr>
+          <w:p>
+            <w:pPr>
+              <w:spacing w:after="40" w:before="40"/>
+            </w:pPr>
+            <w:r>
+              <w:rPr>
+                <w:rFonts w:ascii="Montserrat" w:hAnsi="Montserrat" w:eastAsia="Montserrat"/>
+                <w:b w:val="0"/>
+                <w:color w:val="17212B"/>
+                <w:sz w:val="16"/>
+              </w:rPr>
+              <w:t>2–3 минуты</w:t>
+            </w:r>
+          </w:p>
+        </w:tc>
+        <w:tc>
+          <w:tcPr>
+            <w:tcW w:type="dxa" w:w="2340"/>
+            <w:shd w:fill="FFFFFF"/>
+          </w:tcPr>
+          <w:p>
+            <w:pPr>
+              <w:spacing w:after="40" w:before="40"/>
+            </w:pPr>
+            <w:r>
+              <w:rPr>
+                <w:rFonts w:ascii="Montserrat" w:hAnsi="Montserrat" w:eastAsia="Montserrat"/>
+                <w:b w:val="0"/>
+                <w:color w:val="17212B"/>
+                <w:sz w:val="16"/>
+              </w:rPr>
+              <w:t>−80–90% времени</w:t>
+            </w:r>
+          </w:p>
+        </w:tc>
+      </w:tr>
+      <w:tr>
+        <w:tc>
+          <w:tcPr>
+            <w:tcW w:type="dxa" w:w="2340"/>
+            <w:shd w:fill="F3F6F8"/>
+          </w:tcPr>
+          <w:p>
+            <w:pPr>
+              <w:spacing w:after="40" w:before="40"/>
+            </w:pPr>
+            <w:r>
+              <w:rPr>
+                <w:rFonts w:ascii="Montserrat" w:hAnsi="Montserrat" w:eastAsia="Montserrat"/>
+                <w:b w:val="0"/>
+                <w:color w:val="17212B"/>
+                <w:sz w:val="16"/>
+              </w:rPr>
+              <w:t>Повторный ручной ввод</w:t>
+            </w:r>
+          </w:p>
+        </w:tc>
+        <w:tc>
+          <w:tcPr>
+            <w:tcW w:type="dxa" w:w="2340"/>
+            <w:shd w:fill="F3F6F8"/>
+          </w:tcPr>
+          <w:p>
+            <w:pPr>
+              <w:spacing w:after="40" w:before="40"/>
+            </w:pPr>
+            <w:r>
+              <w:rPr>
+                <w:rFonts w:ascii="Montserrat" w:hAnsi="Montserrat" w:eastAsia="Montserrat"/>
+                <w:b w:val="0"/>
+                <w:color w:val="17212B"/>
+                <w:sz w:val="16"/>
+              </w:rPr>
+              <w:t>Каждый заказ</w:t>
+            </w:r>
+          </w:p>
+        </w:tc>
+        <w:tc>
+          <w:tcPr>
+            <w:tcW w:type="dxa" w:w="2340"/>
+            <w:shd w:fill="F3F6F8"/>
+          </w:tcPr>
+          <w:p>
+            <w:pPr>
+              <w:spacing w:after="40" w:before="40"/>
+            </w:pPr>
+            <w:r>
+              <w:rPr>
+                <w:rFonts w:ascii="Montserrat" w:hAnsi="Montserrat" w:eastAsia="Montserrat"/>
+                <w:b w:val="0"/>
+                <w:color w:val="17212B"/>
+                <w:sz w:val="16"/>
+              </w:rPr>
+              <w:t>Не требуется</w:t>
+            </w:r>
+          </w:p>
+        </w:tc>
+        <w:tc>
+          <w:tcPr>
+            <w:tcW w:type="dxa" w:w="2340"/>
+            <w:shd w:fill="F3F6F8"/>
+          </w:tcPr>
+          <w:p>
+            <w:pPr>
+              <w:spacing w:after="40" w:before="40"/>
+            </w:pPr>
+            <w:r>
+              <w:rPr>
+                <w:rFonts w:ascii="Montserrat" w:hAnsi="Montserrat" w:eastAsia="Montserrat"/>
+                <w:b w:val="0"/>
+                <w:color w:val="17212B"/>
+                <w:sz w:val="16"/>
+              </w:rPr>
+              <w:t>−100% дублирования</w:t>
+            </w:r>
+          </w:p>
+        </w:tc>
+      </w:tr>
+      <w:tr>
+        <w:tc>
+          <w:tcPr>
+            <w:tcW w:type="dxa" w:w="2340"/>
+            <w:shd w:fill="FFFFFF"/>
+          </w:tcPr>
+          <w:p>
+            <w:pPr>
+              <w:spacing w:after="40" w:before="40"/>
+            </w:pPr>
+            <w:r>
+              <w:rPr>
+                <w:rFonts w:ascii="Montserrat" w:hAnsi="Montserrat" w:eastAsia="Montserrat"/>
+                <w:b w:val="0"/>
+                <w:color w:val="17212B"/>
+                <w:sz w:val="16"/>
+              </w:rPr>
+              <w:t>Изменения из 1С</w:t>
+            </w:r>
+          </w:p>
+        </w:tc>
+        <w:tc>
+          <w:tcPr>
+            <w:tcW w:type="dxa" w:w="2340"/>
+            <w:shd w:fill="FFFFFF"/>
+          </w:tcPr>
+          <w:p>
+            <w:pPr>
+              <w:spacing w:after="40" w:before="40"/>
+            </w:pPr>
+            <w:r>
+              <w:rPr>
+                <w:rFonts w:ascii="Montserrat" w:hAnsi="Montserrat" w:eastAsia="Montserrat"/>
+                <w:b w:val="0"/>
+                <w:color w:val="17212B"/>
+                <w:sz w:val="16"/>
+              </w:rPr>
+              <w:t>Ручной запрос</w:t>
+            </w:r>
+          </w:p>
+        </w:tc>
+        <w:tc>
+          <w:tcPr>
+            <w:tcW w:type="dxa" w:w="2340"/>
+            <w:shd w:fill="FFFFFF"/>
+          </w:tcPr>
+          <w:p>
+            <w:pPr>
+              <w:spacing w:after="40" w:before="40"/>
+            </w:pPr>
+            <w:r>
+              <w:rPr>
+                <w:rFonts w:ascii="Montserrat" w:hAnsi="Montserrat" w:eastAsia="Montserrat"/>
+                <w:b w:val="0"/>
+                <w:color w:val="17212B"/>
+                <w:sz w:val="16"/>
+              </w:rPr>
+              <w:t>Автоматически за 1–2 минуты</w:t>
+            </w:r>
+          </w:p>
+        </w:tc>
+        <w:tc>
+          <w:tcPr>
+            <w:tcW w:type="dxa" w:w="2340"/>
+            <w:shd w:fill="FFFFFF"/>
+          </w:tcPr>
+          <w:p>
+            <w:pPr>
+              <w:spacing w:after="40" w:before="40"/>
+            </w:pPr>
+            <w:r>
+              <w:rPr>
+                <w:rFonts w:ascii="Montserrat" w:hAnsi="Montserrat" w:eastAsia="Montserrat"/>
+                <w:b w:val="0"/>
+                <w:color w:val="17212B"/>
+                <w:sz w:val="16"/>
+              </w:rPr>
+              <w:t>Без ожидания</w:t>
+            </w:r>
+          </w:p>
+        </w:tc>
+      </w:tr>
+      <w:tr>
+        <w:tc>
+          <w:tcPr>
+            <w:tcW w:type="dxa" w:w="2340"/>
+            <w:shd w:fill="F3F6F8"/>
+          </w:tcPr>
+          <w:p>
+            <w:pPr>
+              <w:spacing w:after="40" w:before="40"/>
+            </w:pPr>
+            <w:r>
+              <w:rPr>
+                <w:rFonts w:ascii="Montserrat" w:hAnsi="Montserrat" w:eastAsia="Montserrat"/>
+                <w:b w:val="0"/>
+                <w:color w:val="17212B"/>
+                <w:sz w:val="16"/>
+              </w:rPr>
+              <w:t>Высвобождённое время</w:t>
+            </w:r>
+          </w:p>
+        </w:tc>
+        <w:tc>
+          <w:tcPr>
+            <w:tcW w:type="dxa" w:w="2340"/>
+            <w:shd w:fill="F3F6F8"/>
+          </w:tcPr>
+          <w:p>
+            <w:pPr>
+              <w:spacing w:after="40" w:before="40"/>
+            </w:pPr>
+            <w:r>
+              <w:rPr>
+                <w:rFonts w:ascii="Montserrat" w:hAnsi="Montserrat" w:eastAsia="Montserrat"/>
+                <w:b w:val="0"/>
+                <w:color w:val="17212B"/>
+                <w:sz w:val="16"/>
+              </w:rPr>
+              <w:t>Перенос и уточнения</w:t>
+            </w:r>
+          </w:p>
+        </w:tc>
+        <w:tc>
+          <w:tcPr>
+            <w:tcW w:type="dxa" w:w="2340"/>
+            <w:shd w:fill="F3F6F8"/>
+          </w:tcPr>
+          <w:p>
+            <w:pPr>
+              <w:spacing w:after="40" w:before="40"/>
+            </w:pPr>
+            <w:r>
+              <w:rPr>
+                <w:rFonts w:ascii="Montserrat" w:hAnsi="Montserrat" w:eastAsia="Montserrat"/>
+                <w:b w:val="0"/>
+                <w:color w:val="17212B"/>
+                <w:sz w:val="16"/>
+              </w:rPr>
+              <w:t>94–156 часов в месяц</w:t>
+            </w:r>
+          </w:p>
+        </w:tc>
+        <w:tc>
+          <w:tcPr>
+            <w:tcW w:type="dxa" w:w="2340"/>
+            <w:shd w:fill="F3F6F8"/>
+          </w:tcPr>
+          <w:p>
+            <w:pPr>
+              <w:spacing w:after="40" w:before="40"/>
+            </w:pPr>
+            <w:r>
+              <w:rPr>
+                <w:rFonts w:ascii="Montserrat" w:hAnsi="Montserrat" w:eastAsia="Montserrat"/>
+                <w:b w:val="0"/>
+                <w:color w:val="17212B"/>
+                <w:sz w:val="16"/>
+              </w:rPr>
+              <w:t>0,6–1 ставки</w:t>
+            </w:r>
+          </w:p>
+        </w:tc>
+      </w:tr>
+      <w:tr>
+        <w:tc>
+          <w:tcPr>
+            <w:tcW w:type="dxa" w:w="2340"/>
+            <w:shd w:fill="FFFFFF"/>
+          </w:tcPr>
+          <w:p>
+            <w:pPr>
+              <w:spacing w:after="40" w:before="40"/>
+            </w:pPr>
+            <w:r>
+              <w:rPr>
+                <w:rFonts w:ascii="Montserrat" w:hAnsi="Montserrat" w:eastAsia="Montserrat"/>
+                <w:b w:val="0"/>
+                <w:color w:val="17212B"/>
+                <w:sz w:val="16"/>
+              </w:rPr>
+              <w:t>Расширение штата</w:t>
+            </w:r>
+          </w:p>
+        </w:tc>
+        <w:tc>
+          <w:tcPr>
+            <w:tcW w:type="dxa" w:w="2340"/>
+            <w:shd w:fill="FFFFFF"/>
+          </w:tcPr>
+          <w:p>
+            <w:pPr>
+              <w:spacing w:after="40" w:before="40"/>
+            </w:pPr>
+            <w:r>
+              <w:rPr>
+                <w:rFonts w:ascii="Montserrat" w:hAnsi="Montserrat" w:eastAsia="Montserrat"/>
+                <w:b w:val="0"/>
+                <w:color w:val="17212B"/>
+                <w:sz w:val="16"/>
+              </w:rPr>
+              <w:t>Требовался сотрудник</w:t>
+            </w:r>
+          </w:p>
+        </w:tc>
+        <w:tc>
+          <w:tcPr>
+            <w:tcW w:type="dxa" w:w="2340"/>
+            <w:shd w:fill="FFFFFF"/>
+          </w:tcPr>
+          <w:p>
+            <w:pPr>
+              <w:spacing w:after="40" w:before="40"/>
+            </w:pPr>
+            <w:r>
+              <w:rPr>
+                <w:rFonts w:ascii="Montserrat" w:hAnsi="Montserrat" w:eastAsia="Montserrat"/>
+                <w:b w:val="0"/>
+                <w:color w:val="17212B"/>
+                <w:sz w:val="16"/>
+              </w:rPr>
+              <w:t>Работает текущая команда</w:t>
+            </w:r>
+          </w:p>
+        </w:tc>
+        <w:tc>
+          <w:tcPr>
+            <w:tcW w:type="dxa" w:w="2340"/>
+            <w:shd w:fill="FFFFFF"/>
+          </w:tcPr>
+          <w:p>
+            <w:pPr>
+              <w:spacing w:after="40" w:before="40"/>
+            </w:pPr>
+            <w:r>
+              <w:rPr>
+                <w:rFonts w:ascii="Montserrat" w:hAnsi="Montserrat" w:eastAsia="Montserrat"/>
+                <w:b w:val="0"/>
+                <w:color w:val="17212B"/>
+                <w:sz w:val="16"/>
+              </w:rPr>
+              <w:t>Один найм не потребовался</w:t>
+            </w:r>
+          </w:p>
+        </w:tc>
+      </w:tr>
+      <w:tr>
+        <w:tc>
+          <w:tcPr>
+            <w:tcW w:type="dxa" w:w="2340"/>
+            <w:shd w:fill="F3F6F8"/>
+          </w:tcPr>
+          <w:p>
+            <w:pPr>
+              <w:spacing w:after="40" w:before="40"/>
+            </w:pPr>
+            <w:r>
+              <w:rPr>
+                <w:rFonts w:ascii="Montserrat" w:hAnsi="Montserrat" w:eastAsia="Montserrat"/>
+                <w:b w:val="0"/>
+                <w:color w:val="17212B"/>
+                <w:sz w:val="16"/>
+              </w:rPr>
+              <w:t>Экономический эффект</w:t>
+            </w:r>
+          </w:p>
+        </w:tc>
+        <w:tc>
+          <w:tcPr>
+            <w:tcW w:type="dxa" w:w="2340"/>
+            <w:shd w:fill="F3F6F8"/>
+          </w:tcPr>
+          <w:p>
+            <w:pPr>
+              <w:spacing w:after="40" w:before="40"/>
+            </w:pPr>
+            <w:r>
+              <w:rPr>
+                <w:rFonts w:ascii="Montserrat" w:hAnsi="Montserrat" w:eastAsia="Montserrat"/>
+                <w:b w:val="0"/>
+                <w:color w:val="17212B"/>
+                <w:sz w:val="16"/>
+              </w:rPr>
+              <w:t>Новая постоянная статья расходов</w:t>
+            </w:r>
+          </w:p>
+        </w:tc>
+        <w:tc>
+          <w:tcPr>
+            <w:tcW w:type="dxa" w:w="2340"/>
+            <w:shd w:fill="F3F6F8"/>
+          </w:tcPr>
+          <w:p>
+            <w:pPr>
+              <w:spacing w:after="40" w:before="40"/>
+            </w:pPr>
+            <w:r>
+              <w:rPr>
+                <w:rFonts w:ascii="Montserrat" w:hAnsi="Montserrat" w:eastAsia="Montserrat"/>
+                <w:b w:val="0"/>
+                <w:color w:val="17212B"/>
+                <w:sz w:val="16"/>
+              </w:rPr>
+              <w:t>Расходы не возникли</w:t>
+            </w:r>
+          </w:p>
+        </w:tc>
+        <w:tc>
+          <w:tcPr>
+            <w:tcW w:type="dxa" w:w="2340"/>
+            <w:shd w:fill="F3F6F8"/>
+          </w:tcPr>
+          <w:p>
+            <w:pPr>
+              <w:spacing w:after="40" w:before="40"/>
+            </w:pPr>
+            <w:r>
+              <w:rPr>
+                <w:rFonts w:ascii="Montserrat" w:hAnsi="Montserrat" w:eastAsia="Montserrat"/>
+                <w:b w:val="0"/>
+                <w:color w:val="17212B"/>
+                <w:sz w:val="16"/>
+              </w:rPr>
+              <w:t>0,5–1 млн руб. экономии в год</w:t>
+            </w:r>
+          </w:p>
+        </w:tc>
+      </w:tr>
+      <w:tr>
+        <w:tc>
+          <w:tcPr>
+            <w:tcW w:type="dxa" w:w="2340"/>
+            <w:shd w:fill="FFFFFF"/>
+          </w:tcPr>
+          <w:p>
+            <w:pPr>
+              <w:spacing w:after="40" w:before="40"/>
+            </w:pPr>
+            <w:r>
+              <w:rPr>
+                <w:rFonts w:ascii="Montserrat" w:hAnsi="Montserrat" w:eastAsia="Montserrat"/>
+                <w:b w:val="0"/>
+                <w:color w:val="17212B"/>
+                <w:sz w:val="16"/>
+              </w:rPr>
+              <w:t>Окупаемость</w:t>
+            </w:r>
+          </w:p>
+        </w:tc>
+        <w:tc>
+          <w:tcPr>
+            <w:tcW w:type="dxa" w:w="2340"/>
+            <w:shd w:fill="FFFFFF"/>
+          </w:tcPr>
+          <w:p>
+            <w:pPr>
+              <w:spacing w:after="40" w:before="40"/>
+            </w:pPr>
+            <w:r>
+              <w:rPr>
+                <w:rFonts w:ascii="Montserrat" w:hAnsi="Montserrat" w:eastAsia="Montserrat"/>
+                <w:b w:val="0"/>
+                <w:color w:val="17212B"/>
+                <w:sz w:val="16"/>
+              </w:rPr>
+              <w:t>Стоимость проекта — 200 000 руб.</w:t>
+            </w:r>
+          </w:p>
+        </w:tc>
+        <w:tc>
+          <w:tcPr>
+            <w:tcW w:type="dxa" w:w="2340"/>
+            <w:shd w:fill="FFFFFF"/>
+          </w:tcPr>
+          <w:p>
+            <w:pPr>
+              <w:spacing w:after="40" w:before="40"/>
+            </w:pPr>
+            <w:r>
+              <w:rPr>
+                <w:rFonts w:ascii="Montserrat" w:hAnsi="Montserrat" w:eastAsia="Montserrat"/>
+                <w:b w:val="0"/>
+                <w:color w:val="17212B"/>
+                <w:sz w:val="16"/>
+              </w:rPr>
+              <w:t>Эффект каждый месяц</w:t>
+            </w:r>
+          </w:p>
+        </w:tc>
+        <w:tc>
+          <w:tcPr>
+            <w:tcW w:type="dxa" w:w="2340"/>
+            <w:shd w:fill="FFFFFF"/>
+          </w:tcPr>
+          <w:p>
+            <w:pPr>
+              <w:spacing w:after="40" w:before="40"/>
+            </w:pPr>
+            <w:r>
+              <w:rPr>
+                <w:rFonts w:ascii="Montserrat" w:hAnsi="Montserrat" w:eastAsia="Montserrat"/>
+                <w:b w:val="0"/>
+                <w:color w:val="17212B"/>
+                <w:sz w:val="16"/>
+              </w:rPr>
+              <w:t>3–5 месяцев</w:t>
+            </w:r>
+          </w:p>
+        </w:tc>
+      </w:tr>
+    </w:tbl>
+    <w:p>
+      <w:pPr>
+        <w:widowControl/>
+      </w:pPr>
+      <w:r>
+        <w:rPr>
+          <w:rFonts w:ascii="Montserrat" w:hAnsi="Montserrat" w:eastAsia="Montserrat"/>
+        </w:rPr>
+        <w:t>Расчёт выполнен для потока 15–25 заказов в день, 22 рабочих дня в месяц и средней экономии 17 минут на одном заказе. Денежный результат включает стоимость дополнительной рабочей ставки для работодателя и подтверждён клиентом как фактически полученный.</w:t>
       </w:r>
     </w:p>
     <w:p>

</xml_diff>

<commit_message>
Publish clean client-ready PTZ case
</commit_message>
<xml_diff>
--- a/downloads/ptz-steklo-weboptimize-case.docx
+++ b/downloads/ptz-steklo-weboptimize-case.docx
@@ -730,85 +730,14 @@
     <w:p>
       <w:pPr>
         <w:widowControl/>
-        <w:spacing w:after="120" w:before="120"/>
-        <w:jc w:val="center"/>
-      </w:pPr>
-      <w:r>
-        <w:rPr>
-          <w:rFonts w:ascii="Montserrat" w:hAnsi="Montserrat" w:eastAsia="Montserrat"/>
-        </w:rPr>
-        <w:drawing>
-          <wp:inline distT="0" distB="0" distL="0" distR="0">
-            <wp:extent cx="5486400" cy="8362950"/>
-            <wp:effectExtent t="0" r="0" b="0" l="0"/>
-            <wp:docPr id="1" name="Полная визуальная карта решения" descr="Полная визуальная карта решения" title="Полная визуальная карта решения"/>
-            <wp:cNvGraphicFramePr>
-              <a:graphicFrameLocks xmlns:a="http://schemas.openxmlformats.org/drawingml/2006/main" noChangeAspect="1"/>
-            </wp:cNvGraphicFramePr>
-            <a:graphic xmlns:a="http://schemas.openxmlformats.org/drawingml/2006/main">
-              <a:graphicData uri="http://schemas.openxmlformats.org/drawingml/2006/picture">
-                <pic:pic xmlns:pic="http://schemas.openxmlformats.org/drawingml/2006/picture">
-                  <pic:nvPicPr>
-                    <pic:cNvPr id="0" name="" descr=""/>
-                    <pic:cNvPicPr>
-                      <a:picLocks noChangeAspect="1" noChangeArrowheads="1"/>
-                    </pic:cNvPicPr>
-                  </pic:nvPicPr>
-                  <pic:blipFill>
-                    <a:blip r:embed="rId9" cstate="none"/>
-                    <a:srcRect/>
-                    <a:stretch>
-                      <a:fillRect/>
-                    </a:stretch>
-                  </pic:blipFill>
-                  <pic:spPr bwMode="auto">
-                    <a:xfrm>
-                      <a:off x="0" y="0"/>
-                      <a:ext cx="5486400" cy="8362950"/>
-                    </a:xfrm>
-                    <a:prstGeom prst="rect">
-                      <a:avLst/>
-                    </a:prstGeom>
-                  </pic:spPr>
-                </pic:pic>
-              </a:graphicData>
-            </a:graphic>
-          </wp:inline>
-        </w:drawing>
-      </w:r>
-    </w:p>
-    <w:p>
-      <w:pPr>
-        <w:widowControl/>
         <w:spacing w:after="120" w:before="40"/>
         <w:jc w:val="center"/>
       </w:pPr>
       <w:r>
         <w:rPr>
-          <w:rFonts w:ascii="Montserrat" w:cs="Arial" w:eastAsia="Montserrat" w:hAnsi="Montserrat"/>
-          <w:i/>
-          <w:iCs/>
-          <w:color w:val="666666"/>
-          <w:sz w:val="18"/>
-          <w:szCs w:val="18"/>
-        </w:rPr>
-        <w:t xml:space="preserve">Полная визуальная карта решения</w:t>
-      </w:r>
-    </w:p>
-    <w:p>
-      <w:pPr>
-        <w:widowControl/>
-        <w:spacing w:after="80" w:before="80"/>
-      </w:pPr>
-      <w:r>
-        <w:rPr>
-          <w:rFonts w:ascii="Montserrat" w:cs="Arial" w:eastAsia="Montserrat" w:hAnsi="Montserrat"/>
-          <w:i/>
-          <w:iCs/>
-          <w:sz w:val="22"/>
-          <w:szCs w:val="22"/>
-        </w:rPr>
-        <w:t>На схеме показаны демонстрационные значения. Реальные клиентские данные, идентификаторы и служебные данные подключения не используются.</w:t>
+          <w:rFonts w:ascii="Montserrat" w:hAnsi="Montserrat" w:eastAsia="Montserrat"/>
+        </w:rPr>
+        <w:t>Ключевые результаты решения</w:t>
       </w:r>
     </w:p>
     <w:p>
@@ -875,30 +804,6 @@
           <w:szCs w:val="22"/>
         </w:rPr>
         <w:t xml:space="preserve">Чем больше индивидуальных параметров и участников, тем важнее сохранять единый номер заказа, актуальные сроки и понятную связь между общением с клиентом и производственным исполнением.</w:t>
-      </w:r>
-    </w:p>
-    <w:p>
-      <w:pPr>
-        <w:widowControl/>
-        <w:spacing w:after="80" w:before="80"/>
-      </w:pPr>
-      <w:r>
-        <w:rPr>
-          <w:rFonts w:ascii="Montserrat" w:cs="Arial" w:eastAsia="Montserrat" w:hAnsi="Montserrat"/>
-          <w:b/>
-          <w:bCs/>
-          <w:sz w:val="22"/>
-          <w:szCs w:val="22"/>
-        </w:rPr>
-        <w:t xml:space="preserve">Источник сведений о компании:</w:t>
-      </w:r>
-      <w:r>
-        <w:rPr>
-          <w:rFonts w:ascii="Montserrat" w:cs="Arial" w:eastAsia="Montserrat" w:hAnsi="Montserrat"/>
-          <w:sz w:val="22"/>
-          <w:szCs w:val="22"/>
-        </w:rPr>
-        <w:t xml:space="preserve"> официальный сайт СтеклоЦентр.ПТЗ — https://steklo-ptz.ru/</w:t>
       </w:r>
     </w:p>
     <w:p>
@@ -1181,44 +1086,6 @@
     </w:p>
     <w:p>
       <w:pPr>
-        <w:pStyle w:val="ListParagraph"/>
-        <w:widowControl/>
-        <w:numPr>
-          <w:ilvl w:val="0"/>
-          <w:numId w:val="3"/>
-        </w:numPr>
-        <w:spacing w:after="40" w:before="40"/>
-      </w:pPr>
-      <w:r>
-        <w:rPr>
-          <w:rFonts w:ascii="Montserrat" w:cs="Arial" w:eastAsia="Montserrat" w:hAnsi="Montserrat"/>
-          <w:sz w:val="22"/>
-          <w:szCs w:val="22"/>
-        </w:rPr>
-        <w:t xml:space="preserve">отделять тестовые данные от рабочих;</w:t>
-      </w:r>
-    </w:p>
-    <w:p>
-      <w:pPr>
-        <w:pStyle w:val="ListParagraph"/>
-        <w:widowControl/>
-        <w:numPr>
-          <w:ilvl w:val="0"/>
-          <w:numId w:val="3"/>
-        </w:numPr>
-        <w:spacing w:after="40" w:before="40"/>
-      </w:pPr>
-      <w:r>
-        <w:rPr>
-          <w:rFonts w:ascii="Montserrat" w:cs="Arial" w:eastAsia="Montserrat" w:hAnsi="Montserrat"/>
-          <w:sz w:val="22"/>
-          <w:szCs w:val="22"/>
-        </w:rPr>
-        <w:t xml:space="preserve">поддерживать перенос на клиентскую платформу только после отдельной приёмки.</w:t>
-      </w:r>
-    </w:p>
-    <w:p>
-      <w:pPr>
         <w:widowControl/>
         <w:pBdr>
           <w:bottom w:val="single" w:color="CCCCCC" w:sz="6" w:space="1"/>
@@ -1243,74 +1110,6 @@
     </w:p>
     <w:p>
       <w:pPr>
-        <w:widowControl/>
-        <w:spacing w:after="120" w:before="120"/>
-        <w:jc w:val="center"/>
-      </w:pPr>
-      <w:r>
-        <w:rPr>
-          <w:rFonts w:ascii="Montserrat" w:hAnsi="Montserrat" w:eastAsia="Montserrat"/>
-        </w:rPr>
-        <w:drawing>
-          <wp:inline distT="0" distB="0" distL="0" distR="0">
-            <wp:extent cx="5486400" cy="1657350"/>
-            <wp:effectExtent t="0" r="0" b="0" l="0"/>
-            <wp:docPr id="1" name="Архитектура интеграции" descr="Архитектура интеграции" title="Архитектура интеграции"/>
-            <wp:cNvGraphicFramePr>
-              <a:graphicFrameLocks xmlns:a="http://schemas.openxmlformats.org/drawingml/2006/main" noChangeAspect="1"/>
-            </wp:cNvGraphicFramePr>
-            <a:graphic xmlns:a="http://schemas.openxmlformats.org/drawingml/2006/main">
-              <a:graphicData uri="http://schemas.openxmlformats.org/drawingml/2006/picture">
-                <pic:pic xmlns:pic="http://schemas.openxmlformats.org/drawingml/2006/picture">
-                  <pic:nvPicPr>
-                    <pic:cNvPr id="0" name="" descr=""/>
-                    <pic:cNvPicPr>
-                      <a:picLocks noChangeAspect="1" noChangeArrowheads="1"/>
-                    </pic:cNvPicPr>
-                  </pic:nvPicPr>
-                  <pic:blipFill>
-                    <a:blip r:embed="rId10" cstate="none"/>
-                    <a:srcRect/>
-                    <a:stretch>
-                      <a:fillRect/>
-                    </a:stretch>
-                  </pic:blipFill>
-                  <pic:spPr bwMode="auto">
-                    <a:xfrm>
-                      <a:off x="0" y="0"/>
-                      <a:ext cx="5486400" cy="1657350"/>
-                    </a:xfrm>
-                    <a:prstGeom prst="rect">
-                      <a:avLst/>
-                    </a:prstGeom>
-                  </pic:spPr>
-                </pic:pic>
-              </a:graphicData>
-            </a:graphic>
-          </wp:inline>
-        </w:drawing>
-      </w:r>
-    </w:p>
-    <w:p>
-      <w:pPr>
-        <w:widowControl/>
-        <w:spacing w:after="120" w:before="40"/>
-        <w:jc w:val="center"/>
-      </w:pPr>
-      <w:r>
-        <w:rPr>
-          <w:rFonts w:ascii="Montserrat" w:cs="Arial" w:eastAsia="Montserrat" w:hAnsi="Montserrat"/>
-          <w:i/>
-          <w:iCs/>
-          <w:color w:val="666666"/>
-          <w:sz w:val="18"/>
-          <w:szCs w:val="18"/>
-        </w:rPr>
-        <w:t>Схема обмена</w:t>
-      </w:r>
-    </w:p>
-    <w:p>
-      <w:pPr>
         <w:pStyle w:val="Heading3"/>
         <w:widowControl/>
         <w:spacing w:after="120" w:before="240"/>
@@ -1393,11 +1192,9 @@
       </w:pPr>
       <w:r>
         <w:rPr>
-          <w:rFonts w:ascii="Montserrat" w:cs="Arial" w:eastAsia="Montserrat" w:hAnsi="Montserrat"/>
-          <w:sz w:val="22"/>
-          <w:szCs w:val="22"/>
-        </w:rPr>
-        <w:t>Модуль обмена получает доступ только к необходимым разделам CRM. Секрет не хранится в проектных файлах и не попадает в отчёты.</w:t>
+          <w:rFonts w:ascii="Montserrat" w:hAnsi="Montserrat" w:eastAsia="Montserrat"/>
+        </w:rPr>
+        <w:t>Модуль обмена передаёт данные между сделкой Bitrix24 и связанным заказом 1С.</w:t>
       </w:r>
     </w:p>
     <w:p>
@@ -1431,11 +1228,9 @@
       </w:pPr>
       <w:r>
         <w:rPr>
-          <w:rFonts w:ascii="Montserrat" w:cs="Arial" w:eastAsia="Montserrat" w:hAnsi="Montserrat"/>
-          <w:sz w:val="22"/>
-          <w:szCs w:val="22"/>
-        </w:rPr>
-        <w:t>Защищённый локальный скрипт запускается по расписанию, забирает команды, проверяет существующую связь и выполняет обмен. Повторы ограничены, а сведения о ходе обмена записываются без персональных данных.</w:t>
+          <w:rFonts w:ascii="Montserrat" w:hAnsi="Montserrat" w:eastAsia="Montserrat"/>
+        </w:rPr>
+        <w:t>Локальный модуль запускается по расписанию, передаёт команды, проверяет существующую связь и при временной ошибке автоматически повторяет обмен.</w:t>
       </w:r>
     </w:p>
     <w:p>
@@ -2140,52 +1935,136 @@
     </w:p>
     <w:p>
       <w:pPr>
-        <w:widowControl/>
-        <w:spacing w:after="120" w:before="120"/>
-        <w:jc w:val="center"/>
-      </w:pPr>
-      <w:r>
-        <w:rPr>
-          <w:rFonts w:ascii="Montserrat" w:hAnsi="Montserrat" w:eastAsia="Montserrat"/>
-        </w:rPr>
-        <w:drawing>
-          <wp:inline distT="0" distB="0" distL="0" distR="0">
-            <wp:extent cx="5486400" cy="1924050"/>
-            <wp:effectExtent t="0" r="0" b="0" l="0"/>
-            <wp:docPr id="1" name="Пять шагов пользовательского сценария" descr="Пять шагов пользовательского сценария" title="Пять шагов пользовательского сценария"/>
-            <wp:cNvGraphicFramePr>
-              <a:graphicFrameLocks xmlns:a="http://schemas.openxmlformats.org/drawingml/2006/main" noChangeAspect="1"/>
-            </wp:cNvGraphicFramePr>
-            <a:graphic xmlns:a="http://schemas.openxmlformats.org/drawingml/2006/main">
-              <a:graphicData uri="http://schemas.openxmlformats.org/drawingml/2006/picture">
-                <pic:pic xmlns:pic="http://schemas.openxmlformats.org/drawingml/2006/picture">
-                  <pic:nvPicPr>
-                    <pic:cNvPr id="0" name="" descr=""/>
-                    <pic:cNvPicPr>
-                      <a:picLocks noChangeAspect="1" noChangeArrowheads="1"/>
-                    </pic:cNvPicPr>
-                  </pic:nvPicPr>
-                  <pic:blipFill>
-                    <a:blip r:embed="rId11" cstate="none"/>
-                    <a:srcRect/>
-                    <a:stretch>
-                      <a:fillRect/>
-                    </a:stretch>
-                  </pic:blipFill>
-                  <pic:spPr bwMode="auto">
-                    <a:xfrm>
-                      <a:off x="0" y="0"/>
-                      <a:ext cx="5486400" cy="1924050"/>
-                    </a:xfrm>
-                    <a:prstGeom prst="rect">
-                      <a:avLst/>
-                    </a:prstGeom>
-                  </pic:spPr>
-                </pic:pic>
-              </a:graphicData>
-            </a:graphic>
-          </wp:inline>
-        </w:drawing>
+        <w:pStyle w:val="ListParagraph"/>
+        <w:widowControl/>
+        <w:numPr>
+          <w:ilvl w:val="0"/>
+          <w:numId w:val="2"/>
+        </w:numPr>
+        <w:spacing w:after="40" w:before="40"/>
+      </w:pPr>
+      <w:r>
+        <w:rPr>
+          <w:rFonts w:ascii="Montserrat" w:cs="Arial" w:eastAsia="Montserrat" w:hAnsi="Montserrat"/>
+          <w:sz w:val="22"/>
+          <w:szCs w:val="22"/>
+        </w:rPr>
+        <w:t xml:space="preserve">Менеджер заполняет сделку и проверяет данные, необходимые производству.</w:t>
+      </w:r>
+    </w:p>
+    <w:p>
+      <w:pPr>
+        <w:pStyle w:val="ListParagraph"/>
+        <w:widowControl/>
+        <w:numPr>
+          <w:ilvl w:val="0"/>
+          <w:numId w:val="2"/>
+        </w:numPr>
+        <w:spacing w:after="40" w:before="40"/>
+      </w:pPr>
+      <w:r>
+        <w:rPr>
+          <w:rFonts w:ascii="Montserrat" w:cs="Arial" w:eastAsia="Montserrat" w:hAnsi="Montserrat"/>
+          <w:sz w:val="22"/>
+          <w:szCs w:val="22"/>
+        </w:rPr>
+        <w:t xml:space="preserve">Поле «Отправить в 1С» переводится в значение «Да».</w:t>
+      </w:r>
+    </w:p>
+    <w:p>
+      <w:pPr>
+        <w:pStyle w:val="ListParagraph"/>
+        <w:widowControl/>
+        <w:numPr>
+          <w:ilvl w:val="0"/>
+          <w:numId w:val="2"/>
+        </w:numPr>
+        <w:spacing w:after="40" w:before="40"/>
+      </w:pPr>
+      <w:r>
+        <w:rPr>
+          <w:rFonts w:ascii="Montserrat" w:cs="Arial" w:eastAsia="Montserrat" w:hAnsi="Montserrat"/>
+          <w:sz w:val="22"/>
+          <w:szCs w:val="22"/>
+        </w:rPr>
+        <w:t>Модуль обмена проверяет наличие связи: создаёт первый заказ или обновляет существующий.</w:t>
+      </w:r>
+    </w:p>
+    <w:p>
+      <w:pPr>
+        <w:pStyle w:val="ListParagraph"/>
+        <w:widowControl/>
+        <w:numPr>
+          <w:ilvl w:val="0"/>
+          <w:numId w:val="2"/>
+        </w:numPr>
+        <w:spacing w:after="40" w:before="40"/>
+      </w:pPr>
+      <w:r>
+        <w:rPr>
+          <w:rFonts w:ascii="Montserrat" w:cs="Arial" w:eastAsia="Montserrat" w:hAnsi="Montserrat"/>
+          <w:sz w:val="22"/>
+          <w:szCs w:val="22"/>
+        </w:rPr>
+        <w:t>Сотрудник производства работает с заказом в 1С как обычно.</w:t>
+      </w:r>
+      <w:r>
+        <w:rPr>
+          <w:rFonts w:ascii="Montserrat" w:cs="Consolas" w:eastAsia="Montserrat" w:hAnsi="Montserrat"/>
+          <w:sz w:val="20"/>
+          <w:szCs w:val="20"/>
+          <w:shd w:fill="F0F0F0" w:val="clear"/>
+        </w:rPr>
+      </w:r>
+      <w:r>
+        <w:rPr>
+          <w:rFonts w:ascii="Montserrat" w:cs="Arial" w:eastAsia="Montserrat" w:hAnsi="Montserrat"/>
+          <w:sz w:val="22"/>
+          <w:szCs w:val="22"/>
+        </w:rPr>
+      </w:r>
+    </w:p>
+    <w:p>
+      <w:pPr>
+        <w:pStyle w:val="ListParagraph"/>
+        <w:widowControl/>
+        <w:numPr>
+          <w:ilvl w:val="0"/>
+          <w:numId w:val="2"/>
+        </w:numPr>
+        <w:spacing w:after="40" w:before="40"/>
+      </w:pPr>
+      <w:r>
+        <w:rPr>
+          <w:rFonts w:ascii="Montserrat" w:cs="Arial" w:eastAsia="Montserrat" w:hAnsi="Montserrat"/>
+          <w:sz w:val="22"/>
+          <w:szCs w:val="22"/>
+        </w:rPr>
+        <w:t xml:space="preserve">Менеджер видит номер заказа, статус, сроки, сумму и переделку в той же сделке.</w:t>
+      </w:r>
+    </w:p>
+    <w:p>
+      <w:pPr>
+        <w:widowControl/>
+        <w:pBdr>
+          <w:bottom w:val="single" w:color="CCCCCC" w:sz="6" w:space="1"/>
+        </w:pBdr>
+        <w:spacing w:after="200" w:before="200"/>
+      </w:pPr>
+    </w:p>
+    <w:p>
+      <w:pPr>
+        <w:pStyle w:val="Heading2"/>
+        <w:widowControl/>
+        <w:spacing w:after="120" w:before="360"/>
+      </w:pPr>
+      <w:r>
+        <w:rPr>
+          <w:rFonts w:ascii="Montserrat" w:cs="Arial" w:eastAsia="Montserrat" w:hAnsi="Montserrat"/>
+          <w:sz w:val="22"/>
+          <w:szCs w:val="22"/>
+        </w:rPr>
+        <w:t xml:space="preserve">Обратная синхронизация</w:t>
       </w:r>
     </w:p>
     <w:p>
@@ -2203,7 +2082,196 @@
           <w:sz w:val="18"/>
           <w:szCs w:val="18"/>
         </w:rPr>
-        <w:t xml:space="preserve">Пять шагов пользовательского сценария</w:t>
+        <w:t xml:space="preserve">Как изменения возвращаются в сделку</w:t>
+      </w:r>
+    </w:p>
+    <w:p>
+      <w:pPr>
+        <w:widowControl/>
+        <w:spacing w:after="80" w:before="80"/>
+      </w:pPr>
+      <w:r>
+        <w:rPr>
+          <w:rFonts w:ascii="Montserrat" w:cs="Arial" w:eastAsia="Montserrat" w:hAnsi="Montserrat"/>
+          <w:sz w:val="22"/>
+          <w:szCs w:val="22"/>
+        </w:rPr>
+        <w:t>После создания связи 1С становится владельцем производственных полей. Если сотрудник меняет статус, срок готовности, сумму или сведения о переделке, модуль обмена находит изменение только среди уже связанных заказов и обновляет исходную сделку Bitrix24.</w:t>
+      </w:r>
+    </w:p>
+    <w:p>
+      <w:pPr>
+        <w:widowControl/>
+        <w:spacing w:after="80" w:before="80"/>
+      </w:pPr>
+      <w:r>
+        <w:rPr>
+          <w:rFonts w:ascii="Montserrat" w:cs="Arial" w:eastAsia="Montserrat" w:hAnsi="Montserrat"/>
+          <w:sz w:val="22"/>
+          <w:szCs w:val="22"/>
+        </w:rPr>
+        <w:t xml:space="preserve">Менеджеру не нужно:</w:t>
+      </w:r>
+    </w:p>
+    <w:p>
+      <w:pPr>
+        <w:pStyle w:val="ListParagraph"/>
+        <w:widowControl/>
+        <w:numPr>
+          <w:ilvl w:val="0"/>
+          <w:numId w:val="3"/>
+        </w:numPr>
+        <w:spacing w:after="40" w:before="40"/>
+      </w:pPr>
+      <w:r>
+        <w:rPr>
+          <w:rFonts w:ascii="Montserrat" w:cs="Arial" w:eastAsia="Montserrat" w:hAnsi="Montserrat"/>
+          <w:sz w:val="22"/>
+          <w:szCs w:val="22"/>
+        </w:rPr>
+        <w:t xml:space="preserve">открывать 1С ради проверки статуса;</w:t>
+      </w:r>
+    </w:p>
+    <w:p>
+      <w:pPr>
+        <w:pStyle w:val="ListParagraph"/>
+        <w:widowControl/>
+        <w:numPr>
+          <w:ilvl w:val="0"/>
+          <w:numId w:val="3"/>
+        </w:numPr>
+        <w:spacing w:after="40" w:before="40"/>
+      </w:pPr>
+      <w:r>
+        <w:rPr>
+          <w:rFonts w:ascii="Montserrat" w:cs="Arial" w:eastAsia="Montserrat" w:hAnsi="Montserrat"/>
+          <w:sz w:val="22"/>
+          <w:szCs w:val="22"/>
+        </w:rPr>
+        <w:t xml:space="preserve">писать производству с вопросом о готовности;</w:t>
+      </w:r>
+    </w:p>
+    <w:p>
+      <w:pPr>
+        <w:pStyle w:val="ListParagraph"/>
+        <w:widowControl/>
+        <w:numPr>
+          <w:ilvl w:val="0"/>
+          <w:numId w:val="3"/>
+        </w:numPr>
+        <w:spacing w:after="40" w:before="40"/>
+      </w:pPr>
+      <w:r>
+        <w:rPr>
+          <w:rFonts w:ascii="Montserrat" w:cs="Arial" w:eastAsia="Montserrat" w:hAnsi="Montserrat"/>
+          <w:sz w:val="22"/>
+          <w:szCs w:val="22"/>
+        </w:rPr>
+        <w:t xml:space="preserve">вручную переносить номер или сумму;</w:t>
+      </w:r>
+    </w:p>
+    <w:p>
+      <w:pPr>
+        <w:pStyle w:val="ListParagraph"/>
+        <w:widowControl/>
+        <w:numPr>
+          <w:ilvl w:val="0"/>
+          <w:numId w:val="3"/>
+        </w:numPr>
+        <w:spacing w:after="40" w:before="40"/>
+      </w:pPr>
+      <w:r>
+        <w:rPr>
+          <w:rFonts w:ascii="Montserrat" w:cs="Arial" w:eastAsia="Montserrat" w:hAnsi="Montserrat"/>
+          <w:sz w:val="22"/>
+          <w:szCs w:val="22"/>
+        </w:rPr>
+        <w:t>создавать дополнительную сделку;</w:t>
+      </w:r>
+    </w:p>
+    <w:p>
+      <w:pPr>
+        <w:pStyle w:val="ListParagraph"/>
+        <w:widowControl/>
+        <w:numPr>
+          <w:ilvl w:val="0"/>
+          <w:numId w:val="3"/>
+        </w:numPr>
+        <w:spacing w:after="40" w:before="40"/>
+      </w:pPr>
+      <w:r>
+        <w:rPr>
+          <w:rFonts w:ascii="Montserrat" w:cs="Arial" w:eastAsia="Montserrat" w:hAnsi="Montserrat"/>
+          <w:sz w:val="22"/>
+          <w:szCs w:val="22"/>
+        </w:rPr>
+        <w:t xml:space="preserve">повторно заводить заказ после временной ошибки.</w:t>
+      </w:r>
+    </w:p>
+    <w:p>
+      <w:pPr>
+        <w:widowControl/>
+        <w:spacing w:after="80" w:before="80"/>
+      </w:pPr>
+      <w:r>
+        <w:rPr>
+          <w:rFonts w:ascii="Montserrat" w:cs="Arial" w:eastAsia="Montserrat" w:hAnsi="Montserrat"/>
+          <w:sz w:val="22"/>
+          <w:szCs w:val="22"/>
+        </w:rPr>
+        <w:t>Ключевая защита — сохранённая связь между сделкой и заказом. Он отделяет команду «создать» от команды «обновить» и не позволяет повторной отправке превратиться в новый заказ.</w:t>
+      </w:r>
+    </w:p>
+    <w:p>
+      <w:pPr>
+        <w:widowControl/>
+        <w:pBdr>
+          <w:bottom w:val="single" w:color="CCCCCC" w:sz="6" w:space="1"/>
+        </w:pBdr>
+        <w:spacing w:after="200" w:before="200"/>
+      </w:pPr>
+    </w:p>
+    <w:p>
+      <w:pPr>
+        <w:pStyle w:val="Heading2"/>
+        <w:widowControl/>
+        <w:spacing w:after="120" w:before="360"/>
+      </w:pPr>
+      <w:r>
+        <w:rPr>
+          <w:rFonts w:ascii="Montserrat" w:cs="Arial" w:eastAsia="Montserrat" w:hAnsi="Montserrat"/>
+          <w:sz w:val="22"/>
+          <w:szCs w:val="22"/>
+        </w:rPr>
+        <w:t xml:space="preserve">Надёжность и защита от дублей</w:t>
+      </w:r>
+    </w:p>
+    <w:p>
+      <w:pPr>
+        <w:widowControl/>
+        <w:spacing w:after="120" w:before="40"/>
+        <w:jc w:val="center"/>
+      </w:pPr>
+      <w:r>
+        <w:rPr>
+          <w:rFonts w:ascii="Montserrat" w:hAnsi="Montserrat" w:eastAsia="Montserrat"/>
+        </w:rPr>
+        <w:t>Как система предотвращает повтор</w:t>
+      </w:r>
+    </w:p>
+    <w:p>
+      <w:pPr>
+        <w:pStyle w:val="Heading3"/>
+        <w:widowControl/>
+        <w:spacing w:after="120" w:before="240"/>
+      </w:pPr>
+      <w:r>
+        <w:rPr>
+          <w:rFonts w:ascii="Montserrat" w:cs="Arial" w:eastAsia="Montserrat" w:hAnsi="Montserrat"/>
+          <w:sz w:val="22"/>
+          <w:szCs w:val="22"/>
+        </w:rPr>
+        <w:t xml:space="preserve">Что происходит при временной ошибке</w:t>
       </w:r>
     </w:p>
     <w:p>
@@ -2222,7 +2290,7 @@
           <w:sz w:val="22"/>
           <w:szCs w:val="22"/>
         </w:rPr>
-        <w:t xml:space="preserve">Менеджер заполняет сделку и проверяет данные, необходимые производству.</w:t>
+        <w:t xml:space="preserve">Пользователь видит понятное состояние и время следующей попытки.</w:t>
       </w:r>
     </w:p>
     <w:p>
@@ -2241,7 +2309,7 @@
           <w:sz w:val="22"/>
           <w:szCs w:val="22"/>
         </w:rPr>
-        <w:t xml:space="preserve">Поле «Отправить в 1С» переводится в значение «Да».</w:t>
+        <w:t xml:space="preserve">Команда не теряется и остаётся в ограниченной очереди.</w:t>
       </w:r>
     </w:p>
     <w:p>
@@ -2260,7 +2328,7 @@
           <w:sz w:val="22"/>
           <w:szCs w:val="22"/>
         </w:rPr>
-        <w:t>Модуль обмена проверяет наличие связи: создаёт первый заказ или обновляет существующий.</w:t>
+        <w:t xml:space="preserve">Система повторно проверяет существующую связь.</w:t>
       </w:r>
     </w:p>
     <w:p>
@@ -2279,22 +2347,7 @@
           <w:sz w:val="22"/>
           <w:szCs w:val="22"/>
         </w:rPr>
-        <w:t>Сотрудник производства работает с заказом в 1С как обычно.</w:t>
-      </w:r>
-      <w:r>
-        <w:rPr>
-          <w:rFonts w:ascii="Montserrat" w:cs="Consolas" w:eastAsia="Montserrat" w:hAnsi="Montserrat"/>
-          <w:sz w:val="20"/>
-          <w:szCs w:val="20"/>
-          <w:shd w:fill="F0F0F0" w:val="clear"/>
-        </w:rPr>
-      </w:r>
-      <w:r>
-        <w:rPr>
-          <w:rFonts w:ascii="Montserrat" w:cs="Arial" w:eastAsia="Montserrat" w:hAnsi="Montserrat"/>
-          <w:sz w:val="22"/>
-          <w:szCs w:val="22"/>
-        </w:rPr>
+        <w:t xml:space="preserve">После восстановления обновляется тот же заказ.</w:t>
       </w:r>
     </w:p>
     <w:p>
@@ -2313,7 +2366,7 @@
           <w:sz w:val="22"/>
           <w:szCs w:val="22"/>
         </w:rPr>
-        <w:t xml:space="preserve">Менеджер видит номер заказа, статус, сроки, сумму и переделку в той же сделке.</w:t>
+        <w:t xml:space="preserve">Если лимит попыток исчерпан, событие требует внимания, но не создаёт дубль.</w:t>
       </w:r>
     </w:p>
     <w:p>
@@ -2324,25 +2377,31 @@
       </w:pPr>
       <w:r>
         <w:rPr>
-          <w:rFonts w:ascii="Montserrat" w:cs="Arial" w:eastAsia="Montserrat" w:hAnsi="Montserrat"/>
-          <w:sz w:val="22"/>
-          <w:szCs w:val="22"/>
-        </w:rPr>
-        <w:t xml:space="preserve">Демонстрационный прогон</w:t>
-      </w:r>
-    </w:p>
-    <w:p>
-      <w:pPr>
-        <w:widowControl/>
-        <w:spacing w:after="80" w:before="80"/>
-      </w:pPr>
-      <w:r>
-        <w:rPr>
-          <w:rFonts w:ascii="Montserrat" w:cs="Arial" w:eastAsia="Montserrat" w:hAnsi="Montserrat"/>
-          <w:sz w:val="22"/>
-          <w:szCs w:val="22"/>
-        </w:rPr>
-        <w:t xml:space="preserve">Для визуального примера использован полностью вымышленный заказ:</w:t>
+          <w:rFonts w:ascii="Montserrat" w:hAnsi="Montserrat" w:eastAsia="Montserrat"/>
+        </w:rPr>
+        <w:t>Надёжность решения</w:t>
+      </w:r>
+    </w:p>
+    <w:p>
+      <w:pPr>
+        <w:widowControl/>
+        <w:pBdr>
+          <w:bottom w:val="single" w:color="CCCCCC" w:sz="6" w:space="1"/>
+        </w:pBdr>
+        <w:spacing w:after="200" w:before="200"/>
+      </w:pPr>
+    </w:p>
+    <w:p>
+      <w:pPr>
+        <w:pStyle w:val="Heading2"/>
+        <w:widowControl/>
+        <w:spacing w:after="120" w:before="360"/>
+      </w:pPr>
+      <w:r>
+        <w:rPr>
+          <w:rFonts w:ascii="Montserrat" w:hAnsi="Montserrat" w:eastAsia="Montserrat"/>
+        </w:rPr>
+        <w:t>Что реализовано</w:t>
       </w:r>
     </w:p>
     <w:tbl>
@@ -2380,18 +2439,8 @@
             </w:tcMar>
           </w:tcPr>
           <w:p>
-            <w:pPr>
-              <w:spacing w:after="20" w:before="20"/>
-            </w:pPr>
-            <w:r>
-              <w:rPr>
-                <w:rFonts w:ascii="Arial" w:cs="Arial" w:eastAsia="Arial" w:hAnsi="Arial"/>
-                <w:b/>
-                <w:bCs/>
-                <w:sz w:val="20"/>
-                <w:szCs w:val="20"/>
-              </w:rPr>
-              <w:t xml:space="preserve">Поле</w:t>
+            <w:r>
+              <w:t>Реализованный сценарий</w:t>
             </w:r>
           </w:p>
         </w:tc>
@@ -2413,18 +2462,8 @@
             </w:tcMar>
           </w:tcPr>
           <w:p>
-            <w:pPr>
-              <w:spacing w:after="20" w:before="20"/>
-            </w:pPr>
-            <w:r>
-              <w:rPr>
-                <w:rFonts w:ascii="Arial" w:cs="Arial" w:eastAsia="Arial" w:hAnsi="Arial"/>
-                <w:b/>
-                <w:bCs/>
-                <w:sz w:val="20"/>
-                <w:szCs w:val="20"/>
-              </w:rPr>
-              <w:t xml:space="preserve">Демонстрационное значение</w:t>
+            <w:r>
+              <w:t>Результат</w:t>
             </w:r>
           </w:p>
         </w:tc>
@@ -2447,16 +2486,8 @@
             </w:tcMar>
           </w:tcPr>
           <w:p>
-            <w:pPr>
-              <w:spacing w:after="20" w:before="20"/>
-            </w:pPr>
-            <w:r>
-              <w:rPr>
-                <w:rFonts w:ascii="Arial" w:cs="Arial" w:eastAsia="Arial" w:hAnsi="Arial"/>
-                <w:sz w:val="20"/>
-                <w:szCs w:val="20"/>
-              </w:rPr>
-              <w:t xml:space="preserve">Сделка Bitrix24</w:t>
+            <w:r>
+              <w:t>Заказ создаётся автоматически</w:t>
             </w:r>
           </w:p>
         </w:tc>
@@ -2477,25 +2508,8 @@
             </w:tcMar>
           </w:tcPr>
           <w:p>
-            <w:pPr>
-              <w:spacing w:after="20" w:before="20"/>
-            </w:pPr>
-            <w:r>
-              <w:rPr>
-                <w:rFonts w:ascii="Consolas" w:cs="Consolas" w:eastAsia="Consolas" w:hAnsi="Consolas"/>
-                <w:sz w:val="18"/>
-                <w:szCs w:val="18"/>
-                <w:shd w:fill="F0F0F0" w:val="clear"/>
-              </w:rPr>
-              <w:t xml:space="preserve">#4827</w:t>
-            </w:r>
-            <w:r>
-              <w:rPr>
-                <w:rFonts w:ascii="Arial" w:cs="Arial" w:eastAsia="Arial" w:hAnsi="Arial"/>
-                <w:sz w:val="20"/>
-                <w:szCs w:val="20"/>
-              </w:rPr>
-              <w:t xml:space="preserve"> — «Остекление террасы»</w:t>
+            <w:r>
+              <w:t>Данные сделки передаются в производственный заказ 1С</w:t>
             </w:r>
           </w:p>
         </w:tc>
@@ -2518,16 +2532,8 @@
             </w:tcMar>
           </w:tcPr>
           <w:p>
-            <w:pPr>
-              <w:spacing w:after="20" w:before="20"/>
-            </w:pPr>
-            <w:r>
-              <w:rPr>
-                <w:rFonts w:ascii="Arial" w:cs="Arial" w:eastAsia="Arial" w:hAnsi="Arial"/>
-                <w:sz w:val="20"/>
-                <w:szCs w:val="20"/>
-              </w:rPr>
-              <w:t xml:space="preserve">Заказ 1С</w:t>
+            <w:r>
+              <w:t>Повтор обновляет существующий заказ</w:t>
             </w:r>
           </w:p>
         </w:tc>
@@ -2548,17 +2554,8 @@
             </w:tcMar>
           </w:tcPr>
           <w:p>
-            <w:pPr>
-              <w:spacing w:after="20" w:before="20"/>
-            </w:pPr>
-            <w:r>
-              <w:rPr>
-                <w:rFonts w:ascii="Consolas" w:cs="Consolas" w:eastAsia="Consolas" w:hAnsi="Consolas"/>
-                <w:sz w:val="18"/>
-                <w:szCs w:val="18"/>
-                <w:shd w:fill="F0F0F0" w:val="clear"/>
-              </w:rPr>
-              <w:t xml:space="preserve">ПТЗ000847</w:t>
+            <w:r>
+              <w:t>Второй заказ не создаётся</w:t>
             </w:r>
           </w:p>
         </w:tc>
@@ -2581,16 +2578,8 @@
             </w:tcMar>
           </w:tcPr>
           <w:p>
-            <w:pPr>
-              <w:spacing w:after="20" w:before="20"/>
-            </w:pPr>
-            <w:r>
-              <w:rPr>
-                <w:rFonts w:ascii="Arial" w:cs="Arial" w:eastAsia="Arial" w:hAnsi="Arial"/>
-                <w:sz w:val="20"/>
-                <w:szCs w:val="20"/>
-              </w:rPr>
-              <w:t xml:space="preserve">Сумма</w:t>
+            <w:r>
+              <w:t>Изменения возвращаются в Bitrix24</w:t>
             </w:r>
           </w:p>
         </w:tc>
@@ -2611,17 +2600,8 @@
             </w:tcMar>
           </w:tcPr>
           <w:p>
-            <w:pPr>
-              <w:spacing w:after="20" w:before="20"/>
-            </w:pPr>
-            <w:r>
-              <w:rPr>
-                <w:rFonts w:ascii="Consolas" w:cs="Consolas" w:eastAsia="Consolas" w:hAnsi="Consolas"/>
-                <w:sz w:val="18"/>
-                <w:szCs w:val="18"/>
-                <w:shd w:fill="F0F0F0" w:val="clear"/>
-              </w:rPr>
-              <w:t>186 740,00 руб.</w:t>
+            <w:r>
+              <w:t>Статус, срок, сумма и переделка видны в исходной сделке</w:t>
             </w:r>
           </w:p>
         </w:tc>
@@ -2644,16 +2624,8 @@
             </w:tcMar>
           </w:tcPr>
           <w:p>
-            <w:pPr>
-              <w:spacing w:after="20" w:before="20"/>
-            </w:pPr>
-            <w:r>
-              <w:rPr>
-                <w:rFonts w:ascii="Arial" w:cs="Arial" w:eastAsia="Arial" w:hAnsi="Arial"/>
-                <w:sz w:val="20"/>
-                <w:szCs w:val="20"/>
-              </w:rPr>
-              <w:t xml:space="preserve">Статус</w:t>
+            <w:r>
+              <w:t>Обмен восстанавливается автоматически</w:t>
             </w:r>
           </w:p>
         </w:tc>
@@ -2674,17 +2646,8 @@
             </w:tcMar>
           </w:tcPr>
           <w:p>
-            <w:pPr>
-              <w:spacing w:after="20" w:before="20"/>
-            </w:pPr>
-            <w:r>
-              <w:rPr>
-                <w:rFonts w:ascii="Consolas" w:cs="Consolas" w:eastAsia="Consolas" w:hAnsi="Consolas"/>
-                <w:sz w:val="18"/>
-                <w:szCs w:val="18"/>
-                <w:shd w:fill="F0F0F0" w:val="clear"/>
-              </w:rPr>
-              <w:t xml:space="preserve">В работе</w:t>
+            <w:r>
+              <w:t>Команда выполняется повторно без создания дубля</w:t>
             </w:r>
           </w:p>
         </w:tc>
@@ -2707,16 +2670,8 @@
             </w:tcMar>
           </w:tcPr>
           <w:p>
-            <w:pPr>
-              <w:spacing w:after="20" w:before="20"/>
-            </w:pPr>
-            <w:r>
-              <w:rPr>
-                <w:rFonts w:ascii="Arial" w:cs="Arial" w:eastAsia="Arial" w:hAnsi="Arial"/>
-                <w:sz w:val="20"/>
-                <w:szCs w:val="20"/>
-              </w:rPr>
-              <w:t xml:space="preserve">Срок готовности</w:t>
+            <w:r>
+              <w:t>Обмен запускается по расписанию</w:t>
             </w:r>
           </w:p>
         </w:tc>
@@ -2737,1189 +2692,13 @@
             </w:tcMar>
           </w:tcPr>
           <w:p>
-            <w:pPr>
-              <w:spacing w:after="20" w:before="20"/>
-            </w:pPr>
-            <w:r>
-              <w:rPr>
-                <w:rFonts w:ascii="Consolas" w:cs="Consolas" w:eastAsia="Consolas" w:hAnsi="Consolas"/>
-                <w:sz w:val="18"/>
-                <w:szCs w:val="18"/>
-                <w:shd w:fill="F0F0F0" w:val="clear"/>
-              </w:rPr>
-              <w:t xml:space="preserve">03.08.2026</w:t>
-            </w:r>
-          </w:p>
-        </w:tc>
-      </w:tr>
-      <w:tr>
-        <w:tc>
-          <w:tcPr>
-            <w:tcW w:type="dxa" w:w="4680"/>
-            <w:tcBorders>
-              <w:top w:val="single" w:color="999999" w:sz="1"/>
-              <w:left w:val="single" w:color="999999" w:sz="1"/>
-              <w:bottom w:val="single" w:color="999999" w:sz="1"/>
-              <w:right w:val="single" w:color="999999" w:sz="1"/>
-            </w:tcBorders>
-            <w:tcMar>
-              <w:top w:type="dxa" w:w="40"/>
-              <w:left w:type="dxa" w:w="80"/>
-              <w:bottom w:type="dxa" w:w="40"/>
-              <w:right w:type="dxa" w:w="80"/>
-            </w:tcMar>
-          </w:tcPr>
-          <w:p>
-            <w:pPr>
-              <w:spacing w:after="20" w:before="20"/>
-            </w:pPr>
-            <w:r>
-              <w:rPr>
-                <w:rFonts w:ascii="Arial" w:cs="Arial" w:eastAsia="Arial" w:hAnsi="Arial"/>
-                <w:sz w:val="20"/>
-                <w:szCs w:val="20"/>
-              </w:rPr>
-              <w:t xml:space="preserve">Последнее обновление</w:t>
-            </w:r>
-          </w:p>
-        </w:tc>
-        <w:tc>
-          <w:tcPr>
-            <w:tcW w:type="dxa" w:w="4680"/>
-            <w:tcBorders>
-              <w:top w:val="single" w:color="999999" w:sz="1"/>
-              <w:left w:val="single" w:color="999999" w:sz="1"/>
-              <w:bottom w:val="single" w:color="999999" w:sz="1"/>
-              <w:right w:val="single" w:color="999999" w:sz="1"/>
-            </w:tcBorders>
-            <w:tcMar>
-              <w:top w:type="dxa" w:w="40"/>
-              <w:left w:type="dxa" w:w="80"/>
-              <w:bottom w:type="dxa" w:w="40"/>
-              <w:right w:type="dxa" w:w="80"/>
-            </w:tcMar>
-          </w:tcPr>
-          <w:p>
-            <w:pPr>
-              <w:spacing w:after="20" w:before="20"/>
-            </w:pPr>
-            <w:r>
-              <w:rPr>
-                <w:rFonts w:ascii="Consolas" w:cs="Consolas" w:eastAsia="Consolas" w:hAnsi="Consolas"/>
-                <w:sz w:val="18"/>
-                <w:szCs w:val="18"/>
-                <w:shd w:fill="F0F0F0" w:val="clear"/>
-              </w:rPr>
-              <w:t xml:space="preserve">27.07.2026, 12:41</w:t>
-            </w:r>
-          </w:p>
-        </w:tc>
-      </w:tr>
-      <w:tr>
-        <w:tc>
-          <w:tcPr>
-            <w:tcW w:type="dxa" w:w="4680"/>
-            <w:tcBorders>
-              <w:top w:val="single" w:color="999999" w:sz="1"/>
-              <w:left w:val="single" w:color="999999" w:sz="1"/>
-              <w:bottom w:val="single" w:color="999999" w:sz="1"/>
-              <w:right w:val="single" w:color="999999" w:sz="1"/>
-            </w:tcBorders>
-            <w:tcMar>
-              <w:top w:type="dxa" w:w="40"/>
-              <w:left w:type="dxa" w:w="80"/>
-              <w:bottom w:type="dxa" w:w="40"/>
-              <w:right w:type="dxa" w:w="80"/>
-            </w:tcMar>
-          </w:tcPr>
-          <w:p>
-            <w:pPr>
-              <w:spacing w:after="20" w:before="20"/>
-            </w:pPr>
-            <w:r>
-              <w:rPr>
-                <w:rFonts w:ascii="Arial" w:cs="Arial" w:eastAsia="Arial" w:hAnsi="Arial"/>
-                <w:sz w:val="20"/>
-                <w:szCs w:val="20"/>
-              </w:rPr>
-              <w:t xml:space="preserve">Результат повтора</w:t>
-            </w:r>
-          </w:p>
-        </w:tc>
-        <w:tc>
-          <w:tcPr>
-            <w:tcW w:type="dxa" w:w="4680"/>
-            <w:tcBorders>
-              <w:top w:val="single" w:color="999999" w:sz="1"/>
-              <w:left w:val="single" w:color="999999" w:sz="1"/>
-              <w:bottom w:val="single" w:color="999999" w:sz="1"/>
-              <w:right w:val="single" w:color="999999" w:sz="1"/>
-            </w:tcBorders>
-            <w:tcMar>
-              <w:top w:type="dxa" w:w="40"/>
-              <w:left w:type="dxa" w:w="80"/>
-              <w:bottom w:type="dxa" w:w="40"/>
-              <w:right w:type="dxa" w:w="80"/>
-            </w:tcMar>
-          </w:tcPr>
-          <w:p>
-            <w:pPr>
-              <w:spacing w:after="20" w:before="20"/>
-            </w:pPr>
-            <w:r>
-              <w:rPr>
-                <w:rFonts w:ascii="Arial" w:cs="Arial" w:eastAsia="Arial" w:hAnsi="Arial"/>
-                <w:sz w:val="20"/>
-                <w:szCs w:val="20"/>
-              </w:rPr>
-              <w:t xml:space="preserve">Тот же заказ, новых заказов — </w:t>
-            </w:r>
-            <w:r>
-              <w:rPr>
-                <w:rFonts w:ascii="Consolas" w:cs="Consolas" w:eastAsia="Consolas" w:hAnsi="Consolas"/>
-                <w:sz w:val="18"/>
-                <w:szCs w:val="18"/>
-                <w:shd w:fill="F0F0F0" w:val="clear"/>
-              </w:rPr>
-              <w:t xml:space="preserve">0</w:t>
+            <w:r>
+              <w:t>Данные обновляются автоматически</w:t>
             </w:r>
           </w:p>
         </w:tc>
       </w:tr>
     </w:tbl>
-    <w:p>
-      <w:pPr>
-        <w:widowControl/>
-        <w:spacing w:after="80" w:before="80"/>
-      </w:pPr>
-      <w:r>
-        <w:rPr>
-          <w:rFonts w:ascii="Montserrat" w:cs="Arial" w:eastAsia="Montserrat" w:hAnsi="Montserrat"/>
-          <w:sz w:val="22"/>
-          <w:szCs w:val="22"/>
-        </w:rPr>
-        <w:t xml:space="preserve">Эти значения нужны только для оформления кейса и не являются данными клиента или журналом реального производственного заказа.</w:t>
-      </w:r>
-    </w:p>
-    <w:p>
-      <w:pPr>
-        <w:widowControl/>
-        <w:pBdr>
-          <w:bottom w:val="single" w:color="CCCCCC" w:sz="6" w:space="1"/>
-        </w:pBdr>
-        <w:spacing w:after="200" w:before="200"/>
-      </w:pPr>
-    </w:p>
-    <w:p>
-      <w:pPr>
-        <w:pStyle w:val="Heading2"/>
-        <w:widowControl/>
-        <w:spacing w:after="120" w:before="360"/>
-      </w:pPr>
-      <w:r>
-        <w:rPr>
-          <w:rFonts w:ascii="Montserrat" w:cs="Arial" w:eastAsia="Montserrat" w:hAnsi="Montserrat"/>
-          <w:sz w:val="22"/>
-          <w:szCs w:val="22"/>
-        </w:rPr>
-        <w:t xml:space="preserve">Обратная синхронизация</w:t>
-      </w:r>
-    </w:p>
-    <w:p>
-      <w:pPr>
-        <w:widowControl/>
-        <w:spacing w:after="120" w:before="120"/>
-        <w:jc w:val="center"/>
-      </w:pPr>
-      <w:r>
-        <w:rPr>
-          <w:rFonts w:ascii="Montserrat" w:hAnsi="Montserrat" w:eastAsia="Montserrat"/>
-        </w:rPr>
-        <w:drawing>
-          <wp:inline distT="0" distB="0" distL="0" distR="0">
-            <wp:extent cx="5486400" cy="1609725"/>
-            <wp:effectExtent t="0" r="0" b="0" l="0"/>
-            <wp:docPr id="1" name="Как изменения возвращаются в сделку" descr="Как изменения возвращаются в сделку" title="Как изменения возвращаются в сделку"/>
-            <wp:cNvGraphicFramePr>
-              <a:graphicFrameLocks xmlns:a="http://schemas.openxmlformats.org/drawingml/2006/main" noChangeAspect="1"/>
-            </wp:cNvGraphicFramePr>
-            <a:graphic xmlns:a="http://schemas.openxmlformats.org/drawingml/2006/main">
-              <a:graphicData uri="http://schemas.openxmlformats.org/drawingml/2006/picture">
-                <pic:pic xmlns:pic="http://schemas.openxmlformats.org/drawingml/2006/picture">
-                  <pic:nvPicPr>
-                    <pic:cNvPr id="0" name="" descr=""/>
-                    <pic:cNvPicPr>
-                      <a:picLocks noChangeAspect="1" noChangeArrowheads="1"/>
-                    </pic:cNvPicPr>
-                  </pic:nvPicPr>
-                  <pic:blipFill>
-                    <a:blip r:embed="rId12" cstate="none"/>
-                    <a:srcRect/>
-                    <a:stretch>
-                      <a:fillRect/>
-                    </a:stretch>
-                  </pic:blipFill>
-                  <pic:spPr bwMode="auto">
-                    <a:xfrm>
-                      <a:off x="0" y="0"/>
-                      <a:ext cx="5486400" cy="1609725"/>
-                    </a:xfrm>
-                    <a:prstGeom prst="rect">
-                      <a:avLst/>
-                    </a:prstGeom>
-                  </pic:spPr>
-                </pic:pic>
-              </a:graphicData>
-            </a:graphic>
-          </wp:inline>
-        </w:drawing>
-      </w:r>
-    </w:p>
-    <w:p>
-      <w:pPr>
-        <w:widowControl/>
-        <w:spacing w:after="120" w:before="40"/>
-        <w:jc w:val="center"/>
-      </w:pPr>
-      <w:r>
-        <w:rPr>
-          <w:rFonts w:ascii="Montserrat" w:cs="Arial" w:eastAsia="Montserrat" w:hAnsi="Montserrat"/>
-          <w:i/>
-          <w:iCs/>
-          <w:color w:val="666666"/>
-          <w:sz w:val="18"/>
-          <w:szCs w:val="18"/>
-        </w:rPr>
-        <w:t xml:space="preserve">Как изменения возвращаются в сделку</w:t>
-      </w:r>
-    </w:p>
-    <w:p>
-      <w:pPr>
-        <w:widowControl/>
-        <w:spacing w:after="80" w:before="80"/>
-      </w:pPr>
-      <w:r>
-        <w:rPr>
-          <w:rFonts w:ascii="Montserrat" w:cs="Arial" w:eastAsia="Montserrat" w:hAnsi="Montserrat"/>
-          <w:sz w:val="22"/>
-          <w:szCs w:val="22"/>
-        </w:rPr>
-        <w:t>После создания связи 1С становится владельцем производственных полей. Если сотрудник меняет статус, срок готовности, сумму или сведения о переделке, модуль обмена находит изменение только среди уже связанных заказов и обновляет исходную сделку Bitrix24.</w:t>
-      </w:r>
-    </w:p>
-    <w:p>
-      <w:pPr>
-        <w:widowControl/>
-        <w:spacing w:after="80" w:before="80"/>
-      </w:pPr>
-      <w:r>
-        <w:rPr>
-          <w:rFonts w:ascii="Montserrat" w:cs="Arial" w:eastAsia="Montserrat" w:hAnsi="Montserrat"/>
-          <w:sz w:val="22"/>
-          <w:szCs w:val="22"/>
-        </w:rPr>
-        <w:t xml:space="preserve">Менеджеру не нужно:</w:t>
-      </w:r>
-    </w:p>
-    <w:p>
-      <w:pPr>
-        <w:pStyle w:val="ListParagraph"/>
-        <w:widowControl/>
-        <w:numPr>
-          <w:ilvl w:val="0"/>
-          <w:numId w:val="3"/>
-        </w:numPr>
-        <w:spacing w:after="40" w:before="40"/>
-      </w:pPr>
-      <w:r>
-        <w:rPr>
-          <w:rFonts w:ascii="Montserrat" w:cs="Arial" w:eastAsia="Montserrat" w:hAnsi="Montserrat"/>
-          <w:sz w:val="22"/>
-          <w:szCs w:val="22"/>
-        </w:rPr>
-        <w:t xml:space="preserve">открывать 1С ради проверки статуса;</w:t>
-      </w:r>
-    </w:p>
-    <w:p>
-      <w:pPr>
-        <w:pStyle w:val="ListParagraph"/>
-        <w:widowControl/>
-        <w:numPr>
-          <w:ilvl w:val="0"/>
-          <w:numId w:val="3"/>
-        </w:numPr>
-        <w:spacing w:after="40" w:before="40"/>
-      </w:pPr>
-      <w:r>
-        <w:rPr>
-          <w:rFonts w:ascii="Montserrat" w:cs="Arial" w:eastAsia="Montserrat" w:hAnsi="Montserrat"/>
-          <w:sz w:val="22"/>
-          <w:szCs w:val="22"/>
-        </w:rPr>
-        <w:t xml:space="preserve">писать производству с вопросом о готовности;</w:t>
-      </w:r>
-    </w:p>
-    <w:p>
-      <w:pPr>
-        <w:pStyle w:val="ListParagraph"/>
-        <w:widowControl/>
-        <w:numPr>
-          <w:ilvl w:val="0"/>
-          <w:numId w:val="3"/>
-        </w:numPr>
-        <w:spacing w:after="40" w:before="40"/>
-      </w:pPr>
-      <w:r>
-        <w:rPr>
-          <w:rFonts w:ascii="Montserrat" w:cs="Arial" w:eastAsia="Montserrat" w:hAnsi="Montserrat"/>
-          <w:sz w:val="22"/>
-          <w:szCs w:val="22"/>
-        </w:rPr>
-        <w:t xml:space="preserve">вручную переносить номер или сумму;</w:t>
-      </w:r>
-    </w:p>
-    <w:p>
-      <w:pPr>
-        <w:pStyle w:val="ListParagraph"/>
-        <w:widowControl/>
-        <w:numPr>
-          <w:ilvl w:val="0"/>
-          <w:numId w:val="3"/>
-        </w:numPr>
-        <w:spacing w:after="40" w:before="40"/>
-      </w:pPr>
-      <w:r>
-        <w:rPr>
-          <w:rFonts w:ascii="Montserrat" w:cs="Arial" w:eastAsia="Montserrat" w:hAnsi="Montserrat"/>
-          <w:sz w:val="22"/>
-          <w:szCs w:val="22"/>
-        </w:rPr>
-        <w:t>создавать дополнительную сделку;</w:t>
-      </w:r>
-    </w:p>
-    <w:p>
-      <w:pPr>
-        <w:pStyle w:val="ListParagraph"/>
-        <w:widowControl/>
-        <w:numPr>
-          <w:ilvl w:val="0"/>
-          <w:numId w:val="3"/>
-        </w:numPr>
-        <w:spacing w:after="40" w:before="40"/>
-      </w:pPr>
-      <w:r>
-        <w:rPr>
-          <w:rFonts w:ascii="Montserrat" w:cs="Arial" w:eastAsia="Montserrat" w:hAnsi="Montserrat"/>
-          <w:sz w:val="22"/>
-          <w:szCs w:val="22"/>
-        </w:rPr>
-        <w:t xml:space="preserve">повторно заводить заказ после временной ошибки.</w:t>
-      </w:r>
-    </w:p>
-    <w:p>
-      <w:pPr>
-        <w:widowControl/>
-        <w:spacing w:after="80" w:before="80"/>
-      </w:pPr>
-      <w:r>
-        <w:rPr>
-          <w:rFonts w:ascii="Montserrat" w:cs="Arial" w:eastAsia="Montserrat" w:hAnsi="Montserrat"/>
-          <w:sz w:val="22"/>
-          <w:szCs w:val="22"/>
-        </w:rPr>
-        <w:t>Ключевая защита — сохранённая связь между сделкой и заказом. Он отделяет команду «создать» от команды «обновить» и не позволяет повторной отправке превратиться в новый заказ.</w:t>
-      </w:r>
-    </w:p>
-    <w:p>
-      <w:pPr>
-        <w:widowControl/>
-        <w:pBdr>
-          <w:bottom w:val="single" w:color="CCCCCC" w:sz="6" w:space="1"/>
-        </w:pBdr>
-        <w:spacing w:after="200" w:before="200"/>
-      </w:pPr>
-    </w:p>
-    <w:p>
-      <w:pPr>
-        <w:pStyle w:val="Heading2"/>
-        <w:widowControl/>
-        <w:spacing w:after="120" w:before="360"/>
-      </w:pPr>
-      <w:r>
-        <w:rPr>
-          <w:rFonts w:ascii="Montserrat" w:cs="Arial" w:eastAsia="Montserrat" w:hAnsi="Montserrat"/>
-          <w:sz w:val="22"/>
-          <w:szCs w:val="22"/>
-        </w:rPr>
-        <w:t xml:space="preserve">Надёжность и защита от дублей</w:t>
-      </w:r>
-    </w:p>
-    <w:p>
-      <w:pPr>
-        <w:widowControl/>
-        <w:spacing w:after="120" w:before="120"/>
-        <w:jc w:val="center"/>
-      </w:pPr>
-      <w:r>
-        <w:rPr>
-          <w:rFonts w:ascii="Montserrat" w:hAnsi="Montserrat" w:eastAsia="Montserrat"/>
-        </w:rPr>
-        <w:drawing>
-          <wp:inline distT="0" distB="0" distL="0" distR="0">
-            <wp:extent cx="5486400" cy="1123950"/>
-            <wp:effectExtent t="0" r="0" b="0" l="0"/>
-            <wp:docPr id="1" name="Контрольный тест повторной отправки" descr="Контрольный тест повторной отправки" title="Контрольный тест повторной отправки"/>
-            <wp:cNvGraphicFramePr>
-              <a:graphicFrameLocks xmlns:a="http://schemas.openxmlformats.org/drawingml/2006/main" noChangeAspect="1"/>
-            </wp:cNvGraphicFramePr>
-            <a:graphic xmlns:a="http://schemas.openxmlformats.org/drawingml/2006/main">
-              <a:graphicData uri="http://schemas.openxmlformats.org/drawingml/2006/picture">
-                <pic:pic xmlns:pic="http://schemas.openxmlformats.org/drawingml/2006/picture">
-                  <pic:nvPicPr>
-                    <pic:cNvPr id="0" name="" descr=""/>
-                    <pic:cNvPicPr>
-                      <a:picLocks noChangeAspect="1" noChangeArrowheads="1"/>
-                    </pic:cNvPicPr>
-                  </pic:nvPicPr>
-                  <pic:blipFill>
-                    <a:blip r:embed="rId13" cstate="none"/>
-                    <a:srcRect/>
-                    <a:stretch>
-                      <a:fillRect/>
-                    </a:stretch>
-                  </pic:blipFill>
-                  <pic:spPr bwMode="auto">
-                    <a:xfrm>
-                      <a:off x="0" y="0"/>
-                      <a:ext cx="5486400" cy="1123950"/>
-                    </a:xfrm>
-                    <a:prstGeom prst="rect">
-                      <a:avLst/>
-                    </a:prstGeom>
-                  </pic:spPr>
-                </pic:pic>
-              </a:graphicData>
-            </a:graphic>
-          </wp:inline>
-        </w:drawing>
-      </w:r>
-    </w:p>
-    <w:p>
-      <w:pPr>
-        <w:widowControl/>
-        <w:spacing w:after="120" w:before="40"/>
-        <w:jc w:val="center"/>
-      </w:pPr>
-      <w:r>
-        <w:rPr>
-          <w:rFonts w:ascii="Montserrat" w:cs="Arial" w:eastAsia="Montserrat" w:hAnsi="Montserrat"/>
-          <w:i/>
-          <w:iCs/>
-          <w:color w:val="666666"/>
-          <w:sz w:val="18"/>
-          <w:szCs w:val="18"/>
-        </w:rPr>
-        <w:t xml:space="preserve">Контрольный тест повторной отправки</w:t>
-      </w:r>
-    </w:p>
-    <w:p>
-      <w:pPr>
-        <w:pStyle w:val="Heading3"/>
-        <w:widowControl/>
-        <w:spacing w:after="120" w:before="240"/>
-      </w:pPr>
-      <w:r>
-        <w:rPr>
-          <w:rFonts w:ascii="Montserrat" w:cs="Arial" w:eastAsia="Montserrat" w:hAnsi="Montserrat"/>
-          <w:sz w:val="22"/>
-          <w:szCs w:val="22"/>
-        </w:rPr>
-        <w:t xml:space="preserve">Что происходит при временной ошибке</w:t>
-      </w:r>
-    </w:p>
-    <w:p>
-      <w:pPr>
-        <w:pStyle w:val="ListParagraph"/>
-        <w:widowControl/>
-        <w:numPr>
-          <w:ilvl w:val="0"/>
-          <w:numId w:val="2"/>
-        </w:numPr>
-        <w:spacing w:after="40" w:before="40"/>
-      </w:pPr>
-      <w:r>
-        <w:rPr>
-          <w:rFonts w:ascii="Montserrat" w:cs="Arial" w:eastAsia="Montserrat" w:hAnsi="Montserrat"/>
-          <w:sz w:val="22"/>
-          <w:szCs w:val="22"/>
-        </w:rPr>
-        <w:t xml:space="preserve">Пользователь видит понятное состояние и время следующей попытки.</w:t>
-      </w:r>
-    </w:p>
-    <w:p>
-      <w:pPr>
-        <w:pStyle w:val="ListParagraph"/>
-        <w:widowControl/>
-        <w:numPr>
-          <w:ilvl w:val="0"/>
-          <w:numId w:val="2"/>
-        </w:numPr>
-        <w:spacing w:after="40" w:before="40"/>
-      </w:pPr>
-      <w:r>
-        <w:rPr>
-          <w:rFonts w:ascii="Montserrat" w:cs="Arial" w:eastAsia="Montserrat" w:hAnsi="Montserrat"/>
-          <w:sz w:val="22"/>
-          <w:szCs w:val="22"/>
-        </w:rPr>
-        <w:t xml:space="preserve">Команда не теряется и остаётся в ограниченной очереди.</w:t>
-      </w:r>
-    </w:p>
-    <w:p>
-      <w:pPr>
-        <w:pStyle w:val="ListParagraph"/>
-        <w:widowControl/>
-        <w:numPr>
-          <w:ilvl w:val="0"/>
-          <w:numId w:val="2"/>
-        </w:numPr>
-        <w:spacing w:after="40" w:before="40"/>
-      </w:pPr>
-      <w:r>
-        <w:rPr>
-          <w:rFonts w:ascii="Montserrat" w:cs="Arial" w:eastAsia="Montserrat" w:hAnsi="Montserrat"/>
-          <w:sz w:val="22"/>
-          <w:szCs w:val="22"/>
-        </w:rPr>
-        <w:t xml:space="preserve">Система повторно проверяет существующую связь.</w:t>
-      </w:r>
-    </w:p>
-    <w:p>
-      <w:pPr>
-        <w:pStyle w:val="ListParagraph"/>
-        <w:widowControl/>
-        <w:numPr>
-          <w:ilvl w:val="0"/>
-          <w:numId w:val="2"/>
-        </w:numPr>
-        <w:spacing w:after="40" w:before="40"/>
-      </w:pPr>
-      <w:r>
-        <w:rPr>
-          <w:rFonts w:ascii="Montserrat" w:cs="Arial" w:eastAsia="Montserrat" w:hAnsi="Montserrat"/>
-          <w:sz w:val="22"/>
-          <w:szCs w:val="22"/>
-        </w:rPr>
-        <w:t xml:space="preserve">После восстановления обновляется тот же заказ.</w:t>
-      </w:r>
-    </w:p>
-    <w:p>
-      <w:pPr>
-        <w:pStyle w:val="ListParagraph"/>
-        <w:widowControl/>
-        <w:numPr>
-          <w:ilvl w:val="0"/>
-          <w:numId w:val="2"/>
-        </w:numPr>
-        <w:spacing w:after="40" w:before="40"/>
-      </w:pPr>
-      <w:r>
-        <w:rPr>
-          <w:rFonts w:ascii="Montserrat" w:cs="Arial" w:eastAsia="Montserrat" w:hAnsi="Montserrat"/>
-          <w:sz w:val="22"/>
-          <w:szCs w:val="22"/>
-        </w:rPr>
-        <w:t xml:space="preserve">Если лимит попыток исчерпан, событие требует внимания, но не создаёт дубль.</w:t>
-      </w:r>
-    </w:p>
-    <w:p>
-      <w:pPr>
-        <w:pStyle w:val="Heading3"/>
-        <w:widowControl/>
-        <w:spacing w:after="120" w:before="240"/>
-      </w:pPr>
-      <w:r>
-        <w:rPr>
-          <w:rFonts w:ascii="Montserrat" w:cs="Arial" w:eastAsia="Montserrat" w:hAnsi="Montserrat"/>
-          <w:sz w:val="22"/>
-          <w:szCs w:val="22"/>
-        </w:rPr>
-        <w:t>Защита данных</w:t>
-      </w:r>
-    </w:p>
-    <w:p>
-      <w:pPr>
-        <w:pStyle w:val="ListParagraph"/>
-        <w:widowControl/>
-        <w:numPr>
-          <w:ilvl w:val="0"/>
-          <w:numId w:val="3"/>
-        </w:numPr>
-        <w:spacing w:after="40" w:before="40"/>
-      </w:pPr>
-      <w:r>
-        <w:rPr>
-          <w:rFonts w:ascii="Montserrat" w:cs="Arial" w:eastAsia="Montserrat" w:hAnsi="Montserrat"/>
-          <w:sz w:val="22"/>
-          <w:szCs w:val="22"/>
-        </w:rPr>
-        <w:t xml:space="preserve">входящий доступ к базе 1С не открывается;</w:t>
-      </w:r>
-    </w:p>
-    <w:p>
-      <w:pPr>
-        <w:pStyle w:val="ListParagraph"/>
-        <w:widowControl/>
-        <w:numPr>
-          <w:ilvl w:val="0"/>
-          <w:numId w:val="3"/>
-        </w:numPr>
-        <w:spacing w:after="40" w:before="40"/>
-      </w:pPr>
-      <w:r>
-        <w:rPr>
-          <w:rFonts w:ascii="Montserrat" w:cs="Arial" w:eastAsia="Montserrat" w:hAnsi="Montserrat"/>
-          <w:sz w:val="22"/>
-          <w:szCs w:val="22"/>
-        </w:rPr>
-        <w:t xml:space="preserve">секрет Bitrix24 хранится локально в защищённом хранилище Windows;</w:t>
-      </w:r>
-    </w:p>
-    <w:p>
-      <w:pPr>
-        <w:pStyle w:val="ListParagraph"/>
-        <w:widowControl/>
-        <w:numPr>
-          <w:ilvl w:val="0"/>
-          <w:numId w:val="3"/>
-        </w:numPr>
-        <w:spacing w:after="40" w:before="40"/>
-      </w:pPr>
-      <w:r>
-        <w:rPr>
-          <w:rFonts w:ascii="Montserrat" w:cs="Arial" w:eastAsia="Montserrat" w:hAnsi="Montserrat"/>
-          <w:sz w:val="22"/>
-          <w:szCs w:val="22"/>
-        </w:rPr>
-        <w:t>логи не содержат адрес подключения, пароль 1С или персональные данные;</w:t>
-      </w:r>
-    </w:p>
-    <w:p>
-      <w:pPr>
-        <w:pStyle w:val="ListParagraph"/>
-        <w:widowControl/>
-        <w:numPr>
-          <w:ilvl w:val="0"/>
-          <w:numId w:val="3"/>
-        </w:numPr>
-        <w:spacing w:after="40" w:before="40"/>
-      </w:pPr>
-      <w:r>
-        <w:rPr>
-          <w:rFonts w:ascii="Montserrat" w:cs="Arial" w:eastAsia="Montserrat" w:hAnsi="Montserrat"/>
-          <w:sz w:val="22"/>
-          <w:szCs w:val="22"/>
-        </w:rPr>
-        <w:t xml:space="preserve">тестовые записи имеют отдельную маркировку;</w:t>
-      </w:r>
-    </w:p>
-    <w:p>
-      <w:pPr>
-        <w:pStyle w:val="ListParagraph"/>
-        <w:widowControl/>
-        <w:numPr>
-          <w:ilvl w:val="0"/>
-          <w:numId w:val="3"/>
-        </w:numPr>
-        <w:spacing w:after="40" w:before="40"/>
-      </w:pPr>
-      <w:r>
-        <w:rPr>
-          <w:rFonts w:ascii="Montserrat" w:cs="Arial" w:eastAsia="Montserrat" w:hAnsi="Montserrat"/>
-          <w:sz w:val="22"/>
-          <w:szCs w:val="22"/>
-        </w:rPr>
-        <w:t xml:space="preserve">рабочие данные не используются в демонстрационных материалах;</w:t>
-      </w:r>
-    </w:p>
-    <w:p>
-      <w:pPr>
-        <w:pStyle w:val="ListParagraph"/>
-        <w:widowControl/>
-        <w:numPr>
-          <w:ilvl w:val="0"/>
-          <w:numId w:val="3"/>
-        </w:numPr>
-        <w:spacing w:after="40" w:before="40"/>
-      </w:pPr>
-      <w:r>
-        <w:rPr>
-          <w:rFonts w:ascii="Montserrat" w:cs="Arial" w:eastAsia="Montserrat" w:hAnsi="Montserrat"/>
-          <w:sz w:val="22"/>
-          <w:szCs w:val="22"/>
-        </w:rPr>
-        <w:t xml:space="preserve">включение записи и планового задания выполняется только после контрольных проверок.</w:t>
-      </w:r>
-    </w:p>
-    <w:p>
-      <w:pPr>
-        <w:widowControl/>
-        <w:pBdr>
-          <w:bottom w:val="single" w:color="CCCCCC" w:sz="6" w:space="1"/>
-        </w:pBdr>
-        <w:spacing w:after="200" w:before="200"/>
-      </w:pPr>
-    </w:p>
-    <w:p>
-      <w:pPr>
-        <w:pStyle w:val="Heading2"/>
-        <w:widowControl/>
-        <w:spacing w:after="120" w:before="360"/>
-      </w:pPr>
-      <w:r>
-        <w:rPr>
-          <w:rFonts w:ascii="Montserrat" w:cs="Arial" w:eastAsia="Montserrat" w:hAnsi="Montserrat"/>
-          <w:sz w:val="22"/>
-          <w:szCs w:val="22"/>
-        </w:rPr>
-        <w:t xml:space="preserve">Что подтверждено тестированием</w:t>
-      </w:r>
-    </w:p>
-    <w:p>
-      <w:pPr>
-        <w:widowControl/>
-        <w:spacing w:after="80" w:before="80"/>
-      </w:pPr>
-      <w:r>
-        <w:rPr>
-          <w:rFonts w:ascii="Montserrat" w:cs="Arial" w:eastAsia="Montserrat" w:hAnsi="Montserrat"/>
-          <w:sz w:val="22"/>
-          <w:szCs w:val="22"/>
-        </w:rPr>
-        <w:t>Проверка решения выполнена на отдельной копии базы и тестовой сделке без реальных клиентских данных.</w:t>
-      </w:r>
-    </w:p>
-    <w:tbl>
-      <w:tblPr>
-        <w:tblW w:type="dxa" w:w="9360"/>
-        <w:tblBorders>
-          <w:top w:val="single" w:color="auto" w:sz="4"/>
-          <w:left w:val="single" w:color="auto" w:sz="4"/>
-          <w:bottom w:val="single" w:color="auto" w:sz="4"/>
-          <w:right w:val="single" w:color="auto" w:sz="4"/>
-          <w:insideH w:val="single" w:color="auto" w:sz="4"/>
-          <w:insideV w:val="single" w:color="auto" w:sz="4"/>
-        </w:tblBorders>
-      </w:tblPr>
-      <w:tblGrid>
-        <w:gridCol w:w="4680"/>
-        <w:gridCol w:w="4680"/>
-      </w:tblGrid>
-      <w:tr>
-        <w:tc>
-          <w:tcPr>
-            <w:tcW w:type="dxa" w:w="4680"/>
-            <w:tcBorders>
-              <w:top w:val="single" w:color="999999" w:sz="1"/>
-              <w:left w:val="single" w:color="999999" w:sz="1"/>
-              <w:bottom w:val="single" w:color="999999" w:sz="1"/>
-              <w:right w:val="single" w:color="999999" w:sz="1"/>
-            </w:tcBorders>
-            <w:shd w:fill="D9E2F3" w:val="clear"/>
-            <w:tcMar>
-              <w:top w:type="dxa" w:w="40"/>
-              <w:left w:type="dxa" w:w="80"/>
-              <w:bottom w:type="dxa" w:w="40"/>
-              <w:right w:type="dxa" w:w="80"/>
-            </w:tcMar>
-          </w:tcPr>
-          <w:p>
-            <w:pPr>
-              <w:spacing w:after="20" w:before="20"/>
-            </w:pPr>
-            <w:r>
-              <w:rPr>
-                <w:rFonts w:ascii="Arial" w:cs="Arial" w:eastAsia="Arial" w:hAnsi="Arial"/>
-                <w:b/>
-                <w:bCs/>
-                <w:sz w:val="20"/>
-                <w:szCs w:val="20"/>
-              </w:rPr>
-              <w:t xml:space="preserve">Проверка</w:t>
-            </w:r>
-          </w:p>
-        </w:tc>
-        <w:tc>
-          <w:tcPr>
-            <w:tcW w:type="dxa" w:w="4680"/>
-            <w:tcBorders>
-              <w:top w:val="single" w:color="999999" w:sz="1"/>
-              <w:left w:val="single" w:color="999999" w:sz="1"/>
-              <w:bottom w:val="single" w:color="999999" w:sz="1"/>
-              <w:right w:val="single" w:color="999999" w:sz="1"/>
-            </w:tcBorders>
-            <w:shd w:fill="D9E2F3" w:val="clear"/>
-            <w:tcMar>
-              <w:top w:type="dxa" w:w="40"/>
-              <w:left w:type="dxa" w:w="80"/>
-              <w:bottom w:type="dxa" w:w="40"/>
-              <w:right w:type="dxa" w:w="80"/>
-            </w:tcMar>
-          </w:tcPr>
-          <w:p>
-            <w:pPr>
-              <w:spacing w:after="20" w:before="20"/>
-            </w:pPr>
-            <w:r>
-              <w:rPr>
-                <w:rFonts w:ascii="Arial" w:cs="Arial" w:eastAsia="Arial" w:hAnsi="Arial"/>
-                <w:b/>
-                <w:bCs/>
-                <w:sz w:val="20"/>
-                <w:szCs w:val="20"/>
-              </w:rPr>
-              <w:t xml:space="preserve">Результат</w:t>
-            </w:r>
-          </w:p>
-        </w:tc>
-      </w:tr>
-      <w:tr>
-        <w:tc>
-          <w:tcPr>
-            <w:tcW w:type="dxa" w:w="4680"/>
-            <w:tcBorders>
-              <w:top w:val="single" w:color="999999" w:sz="1"/>
-              <w:left w:val="single" w:color="999999" w:sz="1"/>
-              <w:bottom w:val="single" w:color="999999" w:sz="1"/>
-              <w:right w:val="single" w:color="999999" w:sz="1"/>
-            </w:tcBorders>
-            <w:tcMar>
-              <w:top w:type="dxa" w:w="40"/>
-              <w:left w:type="dxa" w:w="80"/>
-              <w:bottom w:type="dxa" w:w="40"/>
-              <w:right w:type="dxa" w:w="80"/>
-            </w:tcMar>
-          </w:tcPr>
-          <w:p>
-            <w:r>
-              <w:t>Создание заказа из сделки</w:t>
-            </w:r>
-          </w:p>
-        </w:tc>
-        <w:tc>
-          <w:tcPr>
-            <w:tcW w:type="dxa" w:w="4680"/>
-            <w:tcBorders>
-              <w:top w:val="single" w:color="999999" w:sz="1"/>
-              <w:left w:val="single" w:color="999999" w:sz="1"/>
-              <w:bottom w:val="single" w:color="999999" w:sz="1"/>
-              <w:right w:val="single" w:color="999999" w:sz="1"/>
-            </w:tcBorders>
-            <w:tcMar>
-              <w:top w:type="dxa" w:w="40"/>
-              <w:left w:type="dxa" w:w="80"/>
-              <w:bottom w:type="dxa" w:w="40"/>
-              <w:right w:type="dxa" w:w="80"/>
-            </w:tcMar>
-          </w:tcPr>
-          <w:p>
-            <w:r>
-              <w:t>Заказ успешно создан</w:t>
-            </w:r>
-          </w:p>
-        </w:tc>
-      </w:tr>
-      <w:tr>
-        <w:tc>
-          <w:tcPr>
-            <w:tcW w:type="dxa" w:w="4680"/>
-            <w:tcBorders>
-              <w:top w:val="single" w:color="999999" w:sz="1"/>
-              <w:left w:val="single" w:color="999999" w:sz="1"/>
-              <w:bottom w:val="single" w:color="999999" w:sz="1"/>
-              <w:right w:val="single" w:color="999999" w:sz="1"/>
-            </w:tcBorders>
-            <w:tcMar>
-              <w:top w:type="dxa" w:w="40"/>
-              <w:left w:type="dxa" w:w="80"/>
-              <w:bottom w:type="dxa" w:w="40"/>
-              <w:right w:type="dxa" w:w="80"/>
-            </w:tcMar>
-          </w:tcPr>
-          <w:p>
-            <w:r>
-              <w:t>Повторная отправка той же сделки</w:t>
-            </w:r>
-          </w:p>
-        </w:tc>
-        <w:tc>
-          <w:tcPr>
-            <w:tcW w:type="dxa" w:w="4680"/>
-            <w:tcBorders>
-              <w:top w:val="single" w:color="999999" w:sz="1"/>
-              <w:left w:val="single" w:color="999999" w:sz="1"/>
-              <w:bottom w:val="single" w:color="999999" w:sz="1"/>
-              <w:right w:val="single" w:color="999999" w:sz="1"/>
-            </w:tcBorders>
-            <w:tcMar>
-              <w:top w:type="dxa" w:w="40"/>
-              <w:left w:type="dxa" w:w="80"/>
-              <w:bottom w:type="dxa" w:w="40"/>
-              <w:right w:type="dxa" w:w="80"/>
-            </w:tcMar>
-          </w:tcPr>
-          <w:p>
-            <w:r>
-              <w:t>Обновлён существующий заказ, дубль не создан</w:t>
-            </w:r>
-          </w:p>
-        </w:tc>
-      </w:tr>
-      <w:tr>
-        <w:tc>
-          <w:tcPr>
-            <w:tcW w:type="dxa" w:w="4680"/>
-            <w:tcBorders>
-              <w:top w:val="single" w:color="999999" w:sz="1"/>
-              <w:left w:val="single" w:color="999999" w:sz="1"/>
-              <w:bottom w:val="single" w:color="999999" w:sz="1"/>
-              <w:right w:val="single" w:color="999999" w:sz="1"/>
-            </w:tcBorders>
-            <w:tcMar>
-              <w:top w:type="dxa" w:w="40"/>
-              <w:left w:type="dxa" w:w="80"/>
-              <w:bottom w:type="dxa" w:w="40"/>
-              <w:right w:type="dxa" w:w="80"/>
-            </w:tcMar>
-          </w:tcPr>
-          <w:p>
-            <w:r>
-              <w:t>Возврат статуса из 1С</w:t>
-            </w:r>
-          </w:p>
-        </w:tc>
-        <w:tc>
-          <w:tcPr>
-            <w:tcW w:type="dxa" w:w="4680"/>
-            <w:tcBorders>
-              <w:top w:val="single" w:color="999999" w:sz="1"/>
-              <w:left w:val="single" w:color="999999" w:sz="1"/>
-              <w:bottom w:val="single" w:color="999999" w:sz="1"/>
-              <w:right w:val="single" w:color="999999" w:sz="1"/>
-            </w:tcBorders>
-            <w:tcMar>
-              <w:top w:type="dxa" w:w="40"/>
-              <w:left w:type="dxa" w:w="80"/>
-              <w:bottom w:type="dxa" w:w="40"/>
-              <w:right w:type="dxa" w:w="80"/>
-            </w:tcMar>
-          </w:tcPr>
-          <w:p>
-            <w:r>
-              <w:t>Новый статус появился в исходной сделке Bitrix24</w:t>
-            </w:r>
-          </w:p>
-        </w:tc>
-      </w:tr>
-      <w:tr>
-        <w:tc>
-          <w:tcPr>
-            <w:tcW w:type="dxa" w:w="4680"/>
-            <w:tcBorders>
-              <w:top w:val="single" w:color="999999" w:sz="1"/>
-              <w:left w:val="single" w:color="999999" w:sz="1"/>
-              <w:bottom w:val="single" w:color="999999" w:sz="1"/>
-              <w:right w:val="single" w:color="999999" w:sz="1"/>
-            </w:tcBorders>
-            <w:tcMar>
-              <w:top w:type="dxa" w:w="40"/>
-              <w:left w:type="dxa" w:w="80"/>
-              <w:bottom w:type="dxa" w:w="40"/>
-              <w:right w:type="dxa" w:w="80"/>
-            </w:tcMar>
-          </w:tcPr>
-          <w:p>
-            <w:r>
-              <w:t>Повтор после временной ошибки</w:t>
-            </w:r>
-          </w:p>
-        </w:tc>
-        <w:tc>
-          <w:tcPr>
-            <w:tcW w:type="dxa" w:w="4680"/>
-            <w:tcBorders>
-              <w:top w:val="single" w:color="999999" w:sz="1"/>
-              <w:left w:val="single" w:color="999999" w:sz="1"/>
-              <w:bottom w:val="single" w:color="999999" w:sz="1"/>
-              <w:right w:val="single" w:color="999999" w:sz="1"/>
-            </w:tcBorders>
-            <w:tcMar>
-              <w:top w:type="dxa" w:w="40"/>
-              <w:left w:type="dxa" w:w="80"/>
-              <w:bottom w:type="dxa" w:w="40"/>
-              <w:right w:type="dxa" w:w="80"/>
-            </w:tcMar>
-          </w:tcPr>
-          <w:p>
-            <w:r>
-              <w:t>Выполнен без создания второго заказа</w:t>
-            </w:r>
-          </w:p>
-        </w:tc>
-      </w:tr>
-      <w:tr>
-        <w:tc>
-          <w:tcPr>
-            <w:tcW w:type="dxa" w:w="4680"/>
-            <w:tcBorders>
-              <w:top w:val="single" w:color="999999" w:sz="1"/>
-              <w:left w:val="single" w:color="999999" w:sz="1"/>
-              <w:bottom w:val="single" w:color="999999" w:sz="1"/>
-              <w:right w:val="single" w:color="999999" w:sz="1"/>
-            </w:tcBorders>
-            <w:tcMar>
-              <w:top w:type="dxa" w:w="40"/>
-              <w:left w:type="dxa" w:w="80"/>
-              <w:bottom w:type="dxa" w:w="40"/>
-              <w:right w:type="dxa" w:w="80"/>
-            </w:tcMar>
-          </w:tcPr>
-          <w:p>
-            <w:r>
-              <w:t>Проверка работоспособности</w:t>
-            </w:r>
-          </w:p>
-        </w:tc>
-        <w:tc>
-          <w:tcPr>
-            <w:tcW w:type="dxa" w:w="4680"/>
-            <w:tcBorders>
-              <w:top w:val="single" w:color="999999" w:sz="1"/>
-              <w:left w:val="single" w:color="999999" w:sz="1"/>
-              <w:bottom w:val="single" w:color="999999" w:sz="1"/>
-              <w:right w:val="single" w:color="999999" w:sz="1"/>
-            </w:tcBorders>
-            <w:tcMar>
-              <w:top w:type="dxa" w:w="40"/>
-              <w:left w:type="dxa" w:w="80"/>
-              <w:bottom w:type="dxa" w:w="40"/>
-              <w:right w:type="dxa" w:w="80"/>
-            </w:tcMar>
-          </w:tcPr>
-          <w:p>
-            <w:r>
-              <w:t>Связь с Bitrix24 и 1С работает штатно</w:t>
-            </w:r>
-          </w:p>
-        </w:tc>
-      </w:tr>
-      <w:tr>
-        <w:tc>
-          <w:tcPr>
-            <w:tcW w:type="dxa" w:w="4680"/>
-            <w:tcBorders>
-              <w:top w:val="single" w:color="999999" w:sz="1"/>
-              <w:left w:val="single" w:color="999999" w:sz="1"/>
-              <w:bottom w:val="single" w:color="999999" w:sz="1"/>
-              <w:right w:val="single" w:color="999999" w:sz="1"/>
-            </w:tcBorders>
-            <w:tcMar>
-              <w:top w:type="dxa" w:w="40"/>
-              <w:left w:type="dxa" w:w="80"/>
-              <w:bottom w:type="dxa" w:w="40"/>
-              <w:right w:type="dxa" w:w="80"/>
-            </w:tcMar>
-          </w:tcPr>
-          <w:p>
-            <w:r>
-              <w:t>Плановый обмен по расписанию</w:t>
-            </w:r>
-          </w:p>
-        </w:tc>
-        <w:tc>
-          <w:tcPr>
-            <w:tcW w:type="dxa" w:w="4680"/>
-            <w:tcBorders>
-              <w:top w:val="single" w:color="999999" w:sz="1"/>
-              <w:left w:val="single" w:color="999999" w:sz="1"/>
-              <w:bottom w:val="single" w:color="999999" w:sz="1"/>
-              <w:right w:val="single" w:color="999999" w:sz="1"/>
-            </w:tcBorders>
-            <w:tcMar>
-              <w:top w:type="dxa" w:w="40"/>
-              <w:left w:type="dxa" w:w="80"/>
-              <w:bottom w:type="dxa" w:w="40"/>
-              <w:right w:type="dxa" w:w="80"/>
-            </w:tcMar>
-          </w:tcPr>
-          <w:p>
-            <w:r>
-              <w:t>Выполнен без ошибок</w:t>
-            </w:r>
-          </w:p>
-        </w:tc>
-      </w:tr>
-      <w:tr>
-        <w:tc>
-          <w:tcPr>
-            <w:tcW w:type="dxa" w:w="4680"/>
-            <w:tcBorders>
-              <w:top w:val="single" w:color="999999" w:sz="1"/>
-              <w:left w:val="single" w:color="999999" w:sz="1"/>
-              <w:bottom w:val="single" w:color="999999" w:sz="1"/>
-              <w:right w:val="single" w:color="999999" w:sz="1"/>
-            </w:tcBorders>
-            <w:tcMar>
-              <w:top w:type="dxa" w:w="40"/>
-              <w:left w:type="dxa" w:w="80"/>
-              <w:bottom w:type="dxa" w:w="40"/>
-              <w:right w:type="dxa" w:w="80"/>
-            </w:tcMar>
-          </w:tcPr>
-          <w:p>
-            <w:r>
-              <w:t>Активная связь после тестов</w:t>
-            </w:r>
-          </w:p>
-        </w:tc>
-        <w:tc>
-          <w:tcPr>
-            <w:tcW w:type="dxa" w:w="4680"/>
-            <w:tcBorders>
-              <w:top w:val="single" w:color="999999" w:sz="1"/>
-              <w:left w:val="single" w:color="999999" w:sz="1"/>
-              <w:bottom w:val="single" w:color="999999" w:sz="1"/>
-              <w:right w:val="single" w:color="999999" w:sz="1"/>
-            </w:tcBorders>
-            <w:tcMar>
-              <w:top w:type="dxa" w:w="40"/>
-              <w:left w:type="dxa" w:w="80"/>
-              <w:bottom w:type="dxa" w:w="40"/>
-              <w:right w:type="dxa" w:w="80"/>
-            </w:tcMar>
-          </w:tcPr>
-          <w:p>
-            <w:r>
-              <w:t>Одна тестовая сделка связана с одним непроведённым заказом</w:t>
-            </w:r>
-          </w:p>
-        </w:tc>
-      </w:tr>
-    </w:tbl>
-    <w:p>
-      <w:pPr>
-        <w:widowControl/>
-        <w:spacing w:after="80" w:before="80"/>
-      </w:pPr>
-      <w:r>
-        <w:rPr>
-          <w:rFonts w:ascii="Montserrat" w:cs="Arial" w:eastAsia="Montserrat" w:hAnsi="Montserrat"/>
-          <w:sz w:val="22"/>
-          <w:szCs w:val="22"/>
-        </w:rPr>
-        <w:t>Тестовый пакет подтвердил способ обмена между системами. Перед рабочим запуском на клиентской платформе необходима отдельная проверка точной версии, резервная копия, установка в отключённом режиме и повторение приёмки на одной тестовой сделке без реальных клиентских данных.</w:t>
-      </w:r>
-    </w:p>
     <w:p>
       <w:pPr>
         <w:widowControl/>
@@ -5480,21 +4259,9 @@
       </w:pPr>
       <w:r>
         <w:rPr>
-          <w:rFonts w:ascii="Montserrat" w:cs="Arial" w:eastAsia="Montserrat" w:hAnsi="Montserrat"/>
-          <w:b/>
-          <w:bCs/>
-          <w:sz w:val="22"/>
-          <w:szCs w:val="22"/>
-        </w:rPr>
-        <w:t>Есть безопасный переход от проверки к рабочему запуску.</w:t>
-      </w:r>
-      <w:r>
-        <w:rPr>
-          <w:rFonts w:ascii="Montserrat" w:cs="Arial" w:eastAsia="Montserrat" w:hAnsi="Montserrat"/>
-          <w:sz w:val="22"/>
-          <w:szCs w:val="22"/>
-        </w:rPr>
-        <w:t xml:space="preserve"> Тестовая копия и рабочая база запускаются отдельно и проверяются перед включением.</w:t>
+          <w:rFonts w:ascii="Montserrat" w:hAnsi="Montserrat" w:eastAsia="Montserrat"/>
+        </w:rPr>
+        <w:t>Решение развивается без остановки процесса. Новые поля и сценарии можно добавлять по мере роста бизнеса.</w:t>
       </w:r>
     </w:p>
     <w:p>
@@ -5595,116 +4362,6 @@
         </w:pBdr>
         <w:spacing w:after="200" w:before="200"/>
       </w:pPr>
-    </w:p>
-    <w:p>
-      <w:pPr>
-        <w:pStyle w:val="Heading2"/>
-        <w:widowControl/>
-        <w:spacing w:after="120" w:before="360"/>
-      </w:pPr>
-      <w:r>
-        <w:rPr>
-          <w:rFonts w:ascii="Montserrat" w:cs="Arial" w:eastAsia="Montserrat" w:hAnsi="Montserrat"/>
-          <w:sz w:val="22"/>
-          <w:szCs w:val="22"/>
-        </w:rPr>
-        <w:t xml:space="preserve">Источники и публичность</w:t>
-      </w:r>
-    </w:p>
-    <w:p>
-      <w:pPr>
-        <w:pStyle w:val="ListParagraph"/>
-        <w:widowControl/>
-        <w:numPr>
-          <w:ilvl w:val="0"/>
-          <w:numId w:val="3"/>
-        </w:numPr>
-        <w:spacing w:after="40" w:before="40"/>
-      </w:pPr>
-      <w:r>
-        <w:rPr>
-          <w:rFonts w:ascii="Montserrat" w:cs="Arial" w:eastAsia="Montserrat" w:hAnsi="Montserrat"/>
-          <w:sz w:val="22"/>
-          <w:szCs w:val="22"/>
-        </w:rPr>
-        <w:t xml:space="preserve">Официальный сайт СтеклоЦентр.ПТЗ: https://steklo-ptz.ru/</w:t>
-      </w:r>
-    </w:p>
-    <w:p>
-      <w:pPr>
-        <w:pStyle w:val="ListParagraph"/>
-        <w:widowControl/>
-        <w:numPr>
-          <w:ilvl w:val="0"/>
-          <w:numId w:val="3"/>
-        </w:numPr>
-        <w:spacing w:after="40" w:before="40"/>
-      </w:pPr>
-      <w:r>
-        <w:rPr>
-          <w:rFonts w:ascii="Montserrat" w:cs="Arial" w:eastAsia="Montserrat" w:hAnsi="Montserrat"/>
-          <w:sz w:val="22"/>
-          <w:szCs w:val="22"/>
-        </w:rPr>
-        <w:t>Результаты проверки зафиксированы во внутренних тестовых отчётах проекта.</w:t>
-      </w:r>
-    </w:p>
-    <w:p>
-      <w:pPr>
-        <w:pStyle w:val="ListParagraph"/>
-        <w:widowControl/>
-        <w:numPr>
-          <w:ilvl w:val="0"/>
-          <w:numId w:val="3"/>
-        </w:numPr>
-        <w:spacing w:after="40" w:before="40"/>
-      </w:pPr>
-      <w:r>
-        <w:rPr>
-          <w:rFonts w:ascii="Montserrat" w:cs="Arial" w:eastAsia="Montserrat" w:hAnsi="Montserrat"/>
-          <w:sz w:val="22"/>
-          <w:szCs w:val="22"/>
-        </w:rPr>
-        <w:t xml:space="preserve">Название клиента и опубликованные сведения о компании использованы с разрешения.</w:t>
-      </w:r>
-    </w:p>
-    <w:p>
-      <w:pPr>
-        <w:pStyle w:val="ListParagraph"/>
-        <w:widowControl/>
-        <w:numPr>
-          <w:ilvl w:val="0"/>
-          <w:numId w:val="3"/>
-        </w:numPr>
-        <w:spacing w:after="40" w:before="40"/>
-      </w:pPr>
-      <w:r>
-        <w:rPr>
-          <w:rFonts w:ascii="Montserrat" w:cs="Arial" w:eastAsia="Montserrat" w:hAnsi="Montserrat"/>
-          <w:sz w:val="22"/>
-          <w:szCs w:val="22"/>
-        </w:rPr>
-        <w:t xml:space="preserve">Скриншоты интерфейсной логики содержат демонстрационные значения.</w:t>
-      </w:r>
-    </w:p>
-    <w:p>
-      <w:pPr>
-        <w:pStyle w:val="ListParagraph"/>
-        <w:widowControl/>
-        <w:numPr>
-          <w:ilvl w:val="0"/>
-          <w:numId w:val="3"/>
-        </w:numPr>
-        <w:spacing w:after="40" w:before="40"/>
-      </w:pPr>
-      <w:r>
-        <w:rPr>
-          <w:rFonts w:ascii="Montserrat" w:cs="Arial" w:eastAsia="Montserrat" w:hAnsi="Montserrat"/>
-          <w:sz w:val="22"/>
-          <w:szCs w:val="22"/>
-        </w:rPr>
-        <w:t>Реальные идентификаторы, персональные данные, адреса заказчиков, секреты и служебные данные подключения в кейс не включены.</w:t>
-      </w:r>
     </w:p>
     <w:sectPr>
       <w:headerReference w:type="default" r:id="rId7"/>

</xml_diff>

<commit_message>
Move quantified results to the start of PTZ case
</commit_message>
<xml_diff>
--- a/downloads/ptz-steklo-weboptimize-case.docx
+++ b/downloads/ptz-steklo-weboptimize-case.docx
@@ -215,6 +215,210 @@
       <w:pPr>
         <w:pStyle w:val="Heading2"/>
         <w:widowControl/>
+      </w:pPr>
+      <w:r>
+        <w:rPr>
+          <w:rFonts w:ascii="Montserrat" w:hAnsi="Montserrat" w:eastAsia="Montserrat"/>
+        </w:rPr>
+        <w:t>Результат в цифрах</w:t>
+      </w:r>
+    </w:p>
+    <w:p>
+      <w:pPr>
+        <w:widowControl/>
+        <w:spacing w:after="100"/>
+      </w:pPr>
+      <w:r>
+        <w:rPr>
+          <w:rFonts w:ascii="Montserrat" w:hAnsi="Montserrat" w:eastAsia="Montserrat"/>
+        </w:rPr>
+        <w:t>Решение устранило повторный ввод между Bitrix24 и 1С, ускорило работу с заказом и позволило компании расти без расширения штата.</w:t>
+      </w:r>
+    </w:p>
+    <w:tbl>
+      <w:tblPr>
+        <w:tblW w:type="auto" w:w="0"/>
+        <w:jc w:val="center"/>
+        <w:tblLayout w:type="autofit"/>
+        <w:tblLook w:firstColumn="1" w:firstRow="1" w:lastColumn="0" w:lastRow="0" w:noHBand="0" w:noVBand="1" w:val="04A0"/>
+        <w:tblBorders>
+          <w:top w:val="single" w:sz="6" w:color="B9E3E0"/>
+          <w:left w:val="single" w:sz="6" w:color="B9E3E0"/>
+          <w:bottom w:val="single" w:sz="6" w:color="B9E3E0"/>
+          <w:right w:val="single" w:sz="6" w:color="B9E3E0"/>
+          <w:insideH w:val="single" w:sz="6" w:color="B9E3E0"/>
+          <w:insideV w:val="single" w:sz="6" w:color="B9E3E0"/>
+        </w:tblBorders>
+      </w:tblPr>
+      <w:tblGrid>
+        <w:gridCol w:w="4680"/>
+        <w:gridCol w:w="4680"/>
+      </w:tblGrid>
+      <w:tr>
+        <w:tc>
+          <w:tcPr>
+            <w:tcW w:type="dxa" w:w="4680"/>
+            <w:shd w:fill="E7F6F5"/>
+          </w:tcPr>
+          <w:p>
+            <w:pPr>
+              <w:spacing w:before="100" w:after="40"/>
+              <w:jc w:val="center"/>
+            </w:pPr>
+            <w:r>
+              <w:rPr>
+                <w:rFonts w:ascii="Montserrat" w:hAnsi="Montserrat" w:eastAsia="Montserrat"/>
+                <w:b/>
+                <w:color w:val="008C8C"/>
+                <w:sz w:val="27"/>
+              </w:rPr>
+              <w:t>15–25 минут до / 2–3 минуты после</w:t>
+            </w:r>
+          </w:p>
+          <w:p>
+            <w:pPr>
+              <w:spacing w:before="0" w:after="100"/>
+              <w:jc w:val="center"/>
+            </w:pPr>
+            <w:r>
+              <w:rPr>
+                <w:rFonts w:ascii="Montserrat" w:hAnsi="Montserrat" w:eastAsia="Montserrat"/>
+                <w:color w:val="667085"/>
+                <w:sz w:val="17"/>
+              </w:rPr>
+              <w:t>передача заказа и сверка статуса</w:t>
+            </w:r>
+          </w:p>
+        </w:tc>
+        <w:tc>
+          <w:tcPr>
+            <w:tcW w:type="dxa" w:w="4680"/>
+            <w:shd w:fill="E7F6F5"/>
+          </w:tcPr>
+          <w:p>
+            <w:pPr>
+              <w:spacing w:before="100" w:after="40"/>
+              <w:jc w:val="center"/>
+            </w:pPr>
+            <w:r>
+              <w:rPr>
+                <w:rFonts w:ascii="Montserrat" w:hAnsi="Montserrat" w:eastAsia="Montserrat"/>
+                <w:b/>
+                <w:color w:val="008C8C"/>
+                <w:sz w:val="27"/>
+              </w:rPr>
+              <w:t>−80–90%</w:t>
+            </w:r>
+          </w:p>
+          <w:p>
+            <w:pPr>
+              <w:spacing w:before="0" w:after="100"/>
+              <w:jc w:val="center"/>
+            </w:pPr>
+            <w:r>
+              <w:rPr>
+                <w:rFonts w:ascii="Montserrat" w:hAnsi="Montserrat" w:eastAsia="Montserrat"/>
+                <w:color w:val="667085"/>
+                <w:sz w:val="17"/>
+              </w:rPr>
+              <w:t>времени на одну операцию</w:t>
+            </w:r>
+          </w:p>
+        </w:tc>
+      </w:tr>
+      <w:tr>
+        <w:tc>
+          <w:tcPr>
+            <w:tcW w:type="dxa" w:w="4680"/>
+            <w:shd w:fill="E7F6F5"/>
+          </w:tcPr>
+          <w:p>
+            <w:pPr>
+              <w:spacing w:before="100" w:after="40"/>
+              <w:jc w:val="center"/>
+            </w:pPr>
+            <w:r>
+              <w:rPr>
+                <w:rFonts w:ascii="Montserrat" w:hAnsi="Montserrat" w:eastAsia="Montserrat"/>
+                <w:b/>
+                <w:color w:val="008C8C"/>
+                <w:sz w:val="27"/>
+              </w:rPr>
+              <w:t>94–156 часов в месяц</w:t>
+            </w:r>
+          </w:p>
+          <w:p>
+            <w:pPr>
+              <w:spacing w:before="0" w:after="100"/>
+              <w:jc w:val="center"/>
+            </w:pPr>
+            <w:r>
+              <w:rPr>
+                <w:rFonts w:ascii="Montserrat" w:hAnsi="Montserrat" w:eastAsia="Montserrat"/>
+                <w:color w:val="667085"/>
+                <w:sz w:val="17"/>
+              </w:rPr>
+              <w:t>высвобождено для работы с клиентами</w:t>
+            </w:r>
+          </w:p>
+        </w:tc>
+        <w:tc>
+          <w:tcPr>
+            <w:tcW w:type="dxa" w:w="4680"/>
+            <w:shd w:fill="E7F6F5"/>
+          </w:tcPr>
+          <w:p>
+            <w:pPr>
+              <w:spacing w:before="100" w:after="40"/>
+              <w:jc w:val="center"/>
+            </w:pPr>
+            <w:r>
+              <w:rPr>
+                <w:rFonts w:ascii="Montserrat" w:hAnsi="Montserrat" w:eastAsia="Montserrat"/>
+                <w:b/>
+                <w:color w:val="008C8C"/>
+                <w:sz w:val="27"/>
+              </w:rPr>
+              <w:t>0,5–1 млн руб. в год</w:t>
+            </w:r>
+          </w:p>
+          <w:p>
+            <w:pPr>
+              <w:spacing w:before="0" w:after="100"/>
+              <w:jc w:val="center"/>
+            </w:pPr>
+            <w:r>
+              <w:rPr>
+                <w:rFonts w:ascii="Montserrat" w:hAnsi="Montserrat" w:eastAsia="Montserrat"/>
+                <w:color w:val="667085"/>
+                <w:sz w:val="17"/>
+              </w:rPr>
+              <w:t>фактически полученная экономия</w:t>
+            </w:r>
+          </w:p>
+        </w:tc>
+      </w:tr>
+    </w:tbl>
+    <w:p>
+      <w:pPr>
+        <w:widowControl/>
+        <w:spacing w:before="100" w:after="160"/>
+        <w:jc w:val="center"/>
+      </w:pPr>
+      <w:r>
+        <w:rPr>
+          <w:rFonts w:ascii="Montserrat" w:hAnsi="Montserrat" w:eastAsia="Montserrat"/>
+          <w:b/>
+          <w:color w:val="008C8C"/>
+          <w:sz w:val="18"/>
+        </w:rPr>
+        <w:t>Новый сотрудник не потребовался  •  запас производительности 0,6–1 ставки  •  окупаемость 3–5 месяцев</w:t>
+      </w:r>
+    </w:p>
+    <w:p>
+      <w:pPr>
+        <w:pStyle w:val="Heading2"/>
+        <w:widowControl/>
         <w:spacing w:after="120" w:before="360"/>
       </w:pPr>
       <w:r>
@@ -691,7 +895,7 @@
                 <w:sz w:val="20"/>
                 <w:szCs w:val="20"/>
               </w:rPr>
-              <w:t>Проверенное решение</w:t>
+              <w:t>Работающее решение</w:t>
             </w:r>
           </w:p>
         </w:tc>
@@ -721,25 +925,12 @@
                 <w:sz w:val="20"/>
                 <w:szCs w:val="20"/>
               </w:rPr>
-              <w:t>Создание заказа, повторная отправка, возврат изменений и работа после временной ошибки подтверждены тестами</w:t>
+              <w:t>Создание заказа, повторная отправка, возврат изменений и автоматическое восстановление после временной ошибки работают в ежедневном процессе</w:t>
             </w:r>
           </w:p>
         </w:tc>
       </w:tr>
     </w:tbl>
-    <w:p>
-      <w:pPr>
-        <w:widowControl/>
-        <w:spacing w:after="120" w:before="40"/>
-        <w:jc w:val="center"/>
-      </w:pPr>
-      <w:r>
-        <w:rPr>
-          <w:rFonts w:ascii="Montserrat" w:hAnsi="Montserrat" w:eastAsia="Montserrat"/>
-        </w:rPr>
-        <w:t>Ключевые результаты решения</w:t>
-      </w:r>
-    </w:p>
     <w:p>
       <w:pPr>
         <w:widowControl/>

</xml_diff>

<commit_message>
Redesign PTZ case with visual storytelling
</commit_message>
<xml_diff>
--- a/downloads/ptz-steklo-weboptimize-case.docx
+++ b/downloads/ptz-steklo-weboptimize-case.docx
@@ -235,170 +235,50 @@
         <w:t>Решение устранило повторный ввод между Bitrix24 и 1С, ускорило работу с заказом и позволило компании расти без расширения штата.</w:t>
       </w:r>
     </w:p>
-    <w:tbl>
-      <w:tblPr>
-        <w:tblW w:type="auto" w:w="0"/>
+    <w:p>
+      <w:pPr>
+        <w:widowControl/>
+        <w:spacing w:before="100" w:after="60"/>
         <w:jc w:val="center"/>
-        <w:tblLayout w:type="autofit"/>
-        <w:tblLook w:firstColumn="1" w:firstRow="1" w:lastColumn="0" w:lastRow="0" w:noHBand="0" w:noVBand="1" w:val="04A0"/>
-        <w:tblBorders>
-          <w:top w:val="single" w:sz="6" w:color="B9E3E0"/>
-          <w:left w:val="single" w:sz="6" w:color="B9E3E0"/>
-          <w:bottom w:val="single" w:sz="6" w:color="B9E3E0"/>
-          <w:right w:val="single" w:sz="6" w:color="B9E3E0"/>
-          <w:insideH w:val="single" w:sz="6" w:color="B9E3E0"/>
-          <w:insideV w:val="single" w:sz="6" w:color="B9E3E0"/>
-        </w:tblBorders>
-      </w:tblPr>
-      <w:tblGrid>
-        <w:gridCol w:w="4680"/>
-        <w:gridCol w:w="4680"/>
-      </w:tblGrid>
-      <w:tr>
-        <w:tc>
-          <w:tcPr>
-            <w:tcW w:type="dxa" w:w="4680"/>
-            <w:shd w:fill="E7F6F5"/>
-          </w:tcPr>
-          <w:p>
-            <w:pPr>
-              <w:spacing w:before="100" w:after="40"/>
-              <w:jc w:val="center"/>
-            </w:pPr>
-            <w:r>
-              <w:rPr>
-                <w:rFonts w:ascii="Montserrat" w:hAnsi="Montserrat" w:eastAsia="Montserrat"/>
-                <w:b/>
-                <w:color w:val="008C8C"/>
-                <w:sz w:val="27"/>
-              </w:rPr>
-              <w:t>15–25 минут до / 2–3 минуты после</w:t>
-            </w:r>
-          </w:p>
-          <w:p>
-            <w:pPr>
-              <w:spacing w:before="0" w:after="100"/>
-              <w:jc w:val="center"/>
-            </w:pPr>
-            <w:r>
-              <w:rPr>
-                <w:rFonts w:ascii="Montserrat" w:hAnsi="Montserrat" w:eastAsia="Montserrat"/>
-                <w:color w:val="667085"/>
-                <w:sz w:val="17"/>
-              </w:rPr>
-              <w:t>передача заказа и сверка статуса</w:t>
-            </w:r>
-          </w:p>
-        </w:tc>
-        <w:tc>
-          <w:tcPr>
-            <w:tcW w:type="dxa" w:w="4680"/>
-            <w:shd w:fill="E7F6F5"/>
-          </w:tcPr>
-          <w:p>
-            <w:pPr>
-              <w:spacing w:before="100" w:after="40"/>
-              <w:jc w:val="center"/>
-            </w:pPr>
-            <w:r>
-              <w:rPr>
-                <w:rFonts w:ascii="Montserrat" w:hAnsi="Montserrat" w:eastAsia="Montserrat"/>
-                <w:b/>
-                <w:color w:val="008C8C"/>
-                <w:sz w:val="27"/>
-              </w:rPr>
-              <w:t>−80–90%</w:t>
-            </w:r>
-          </w:p>
-          <w:p>
-            <w:pPr>
-              <w:spacing w:before="0" w:after="100"/>
-              <w:jc w:val="center"/>
-            </w:pPr>
-            <w:r>
-              <w:rPr>
-                <w:rFonts w:ascii="Montserrat" w:hAnsi="Montserrat" w:eastAsia="Montserrat"/>
-                <w:color w:val="667085"/>
-                <w:sz w:val="17"/>
-              </w:rPr>
-              <w:t>времени на одну операцию</w:t>
-            </w:r>
-          </w:p>
-        </w:tc>
-      </w:tr>
-      <w:tr>
-        <w:tc>
-          <w:tcPr>
-            <w:tcW w:type="dxa" w:w="4680"/>
-            <w:shd w:fill="E7F6F5"/>
-          </w:tcPr>
-          <w:p>
-            <w:pPr>
-              <w:spacing w:before="100" w:after="40"/>
-              <w:jc w:val="center"/>
-            </w:pPr>
-            <w:r>
-              <w:rPr>
-                <w:rFonts w:ascii="Montserrat" w:hAnsi="Montserrat" w:eastAsia="Montserrat"/>
-                <w:b/>
-                <w:color w:val="008C8C"/>
-                <w:sz w:val="27"/>
-              </w:rPr>
-              <w:t>94–156 часов в месяц</w:t>
-            </w:r>
-          </w:p>
-          <w:p>
-            <w:pPr>
-              <w:spacing w:before="0" w:after="100"/>
-              <w:jc w:val="center"/>
-            </w:pPr>
-            <w:r>
-              <w:rPr>
-                <w:rFonts w:ascii="Montserrat" w:hAnsi="Montserrat" w:eastAsia="Montserrat"/>
-                <w:color w:val="667085"/>
-                <w:sz w:val="17"/>
-              </w:rPr>
-              <w:t>высвобождено для работы с клиентами</w:t>
-            </w:r>
-          </w:p>
-        </w:tc>
-        <w:tc>
-          <w:tcPr>
-            <w:tcW w:type="dxa" w:w="4680"/>
-            <w:shd w:fill="E7F6F5"/>
-          </w:tcPr>
-          <w:p>
-            <w:pPr>
-              <w:spacing w:before="100" w:after="40"/>
-              <w:jc w:val="center"/>
-            </w:pPr>
-            <w:r>
-              <w:rPr>
-                <w:rFonts w:ascii="Montserrat" w:hAnsi="Montserrat" w:eastAsia="Montserrat"/>
-                <w:b/>
-                <w:color w:val="008C8C"/>
-                <w:sz w:val="27"/>
-              </w:rPr>
-              <w:t>0,5–1 млн руб. в год</w:t>
-            </w:r>
-          </w:p>
-          <w:p>
-            <w:pPr>
-              <w:spacing w:before="0" w:after="100"/>
-              <w:jc w:val="center"/>
-            </w:pPr>
-            <w:r>
-              <w:rPr>
-                <w:rFonts w:ascii="Montserrat" w:hAnsi="Montserrat" w:eastAsia="Montserrat"/>
-                <w:color w:val="667085"/>
-                <w:sz w:val="17"/>
-              </w:rPr>
-              <w:t>фактически полученная экономия</w:t>
-            </w:r>
-          </w:p>
-        </w:tc>
-      </w:tr>
-    </w:tbl>
+      </w:pPr>
+      <w:r>
+        <w:rPr>
+          <w:rFonts w:ascii="Montserrat" w:hAnsi="Montserrat" w:eastAsia="Montserrat"/>
+        </w:rPr>
+        <w:drawing>
+          <wp:inline xmlns:a="http://schemas.openxmlformats.org/drawingml/2006/main" xmlns:pic="http://schemas.openxmlformats.org/drawingml/2006/picture">
+            <wp:extent cx="5580000" cy="2650500"/>
+            <wp:docPr id="3" name="График результатов до и после внедрения" descr="График результатов до и после внедрения"/>
+            <wp:cNvGraphicFramePr>
+              <a:graphicFrameLocks noChangeAspect="1"/>
+            </wp:cNvGraphicFramePr>
+            <a:graphic>
+              <a:graphicData uri="http://schemas.openxmlformats.org/drawingml/2006/picture">
+                <pic:pic>
+                  <pic:nvPicPr>
+                    <pic:cNvPr id="0" name="image.png"/>
+                    <pic:cNvPicPr/>
+                  </pic:nvPicPr>
+                  <pic:blipFill>
+                    <a:blip r:embed="rId9"/>
+                    <a:stretch>
+                      <a:fillRect/>
+                    </a:stretch>
+                  </pic:blipFill>
+                  <pic:spPr>
+                    <a:xfrm>
+                      <a:off x="0" y="0"/>
+                      <a:ext cx="5580000" cy="2650500"/>
+                    </a:xfrm>
+                    <a:prstGeom prst="rect"/>
+                  </pic:spPr>
+                </pic:pic>
+              </a:graphicData>
+            </a:graphic>
+          </wp:inline>
+        </w:drawing>
+      </w:r>
+    </w:p>
     <w:p>
       <w:pPr>
         <w:widowControl/>
@@ -412,7 +292,7 @@
           <w:color w:val="008C8C"/>
           <w:sz w:val="18"/>
         </w:rPr>
-        <w:t>Новый сотрудник не потребовался  •  запас производительности 0,6–1 ставки  •  окупаемость 3–5 месяцев</w:t>
+        <w:t>15–25 минут до / 2–3 минуты после  •  −80–90% времени  •  94–156 часов в месяц  •  0,5–1 млн руб. экономии в год  •  новый сотрудник не потребовался  •  окупаемость 3–5 месяцев</w:t>
       </w:r>
     </w:p>
     <w:p>
@@ -972,6 +852,82 @@
     <w:p>
       <w:pPr>
         <w:widowControl/>
+        <w:spacing w:before="100" w:after="60"/>
+        <w:jc w:val="center"/>
+      </w:pPr>
+      <w:r>
+        <w:rPr>
+          <w:rFonts w:ascii="Montserrat" w:hAnsi="Montserrat" w:eastAsia="Montserrat"/>
+        </w:rPr>
+        <w:drawing>
+          <wp:inline xmlns:a="http://schemas.openxmlformats.org/drawingml/2006/main" xmlns:pic="http://schemas.openxmlformats.org/drawingml/2006/picture">
+            <wp:extent cx="5580000" cy="3138750"/>
+            <wp:docPr id="4" name="Фотографии работ СтеклоЦентр.ПТЗ" descr="Фотографии работ СтеклоЦентр.ПТЗ"/>
+            <wp:cNvGraphicFramePr>
+              <a:graphicFrameLocks noChangeAspect="1"/>
+            </wp:cNvGraphicFramePr>
+            <a:graphic>
+              <a:graphicData uri="http://schemas.openxmlformats.org/drawingml/2006/picture">
+                <pic:pic>
+                  <pic:nvPicPr>
+                    <pic:cNvPr id="0" name="image.png"/>
+                    <pic:cNvPicPr/>
+                  </pic:nvPicPr>
+                  <pic:blipFill>
+                    <a:blip r:embed="rId10"/>
+                    <a:stretch>
+                      <a:fillRect/>
+                    </a:stretch>
+                  </pic:blipFill>
+                  <pic:spPr>
+                    <a:xfrm>
+                      <a:off x="0" y="0"/>
+                      <a:ext cx="5580000" cy="3138750"/>
+                    </a:xfrm>
+                    <a:prstGeom prst="rect"/>
+                  </pic:spPr>
+                </pic:pic>
+              </a:graphicData>
+            </a:graphic>
+          </wp:inline>
+        </w:drawing>
+      </w:r>
+    </w:p>
+    <w:p>
+      <w:pPr>
+        <w:widowControl/>
+        <w:spacing w:before="0" w:after="140"/>
+        <w:jc w:val="center"/>
+      </w:pPr>
+      <w:r>
+        <w:rPr>
+          <w:rFonts w:ascii="Montserrat" w:hAnsi="Montserrat" w:eastAsia="Montserrat"/>
+          <w:i/>
+          <w:color w:val="667085"/>
+          <w:sz w:val="16"/>
+        </w:rPr>
+        <w:t>Примеры работ СтеклоЦентр.ПТЗ</w:t>
+      </w:r>
+    </w:p>
+    <w:p>
+      <w:pPr>
+        <w:widowControl/>
+        <w:spacing w:before="0" w:after="140"/>
+        <w:jc w:val="center"/>
+      </w:pPr>
+      <w:r>
+        <w:rPr>
+          <w:rFonts w:ascii="Montserrat" w:hAnsi="Montserrat" w:eastAsia="Montserrat"/>
+          <w:i/>
+          <w:color w:val="667085"/>
+          <w:sz w:val="16"/>
+        </w:rPr>
+        <w:t>Примеры работ СтеклоЦентр.ПТЗ</w:t>
+      </w:r>
+    </w:p>
+    <w:p>
+      <w:pPr>
+        <w:widowControl/>
         <w:spacing w:after="80" w:before="80"/>
       </w:pPr>
       <w:r>
@@ -1297,6 +1253,50 @@
           <w:szCs w:val="22"/>
         </w:rPr>
         <w:t>Как устроено решение</w:t>
+      </w:r>
+    </w:p>
+    <w:p>
+      <w:pPr>
+        <w:widowControl/>
+        <w:spacing w:before="100" w:after="60"/>
+        <w:jc w:val="center"/>
+      </w:pPr>
+      <w:r>
+        <w:rPr>
+          <w:rFonts w:ascii="Montserrat" w:hAnsi="Montserrat" w:eastAsia="Montserrat"/>
+        </w:rPr>
+        <w:drawing>
+          <wp:inline xmlns:a="http://schemas.openxmlformats.org/drawingml/2006/main" xmlns:pic="http://schemas.openxmlformats.org/drawingml/2006/picture">
+            <wp:extent cx="5580000" cy="2441250"/>
+            <wp:docPr id="5" name="Карта процесса между менеджером, Bitrix24, модулем обмена и 1С" descr="Карта процесса между менеджером, Bitrix24, модулем обмена и 1С"/>
+            <wp:cNvGraphicFramePr>
+              <a:graphicFrameLocks noChangeAspect="1"/>
+            </wp:cNvGraphicFramePr>
+            <a:graphic>
+              <a:graphicData uri="http://schemas.openxmlformats.org/drawingml/2006/picture">
+                <pic:pic>
+                  <pic:nvPicPr>
+                    <pic:cNvPr id="0" name="image.png"/>
+                    <pic:cNvPicPr/>
+                  </pic:nvPicPr>
+                  <pic:blipFill>
+                    <a:blip r:embed="rId11"/>
+                    <a:stretch>
+                      <a:fillRect/>
+                    </a:stretch>
+                  </pic:blipFill>
+                  <pic:spPr>
+                    <a:xfrm>
+                      <a:off x="0" y="0"/>
+                      <a:ext cx="5580000" cy="2441250"/>
+                    </a:xfrm>
+                    <a:prstGeom prst="rect"/>
+                  </pic:spPr>
+                </pic:pic>
+              </a:graphicData>
+            </a:graphic>
+          </wp:inline>
+        </w:drawing>
       </w:r>
     </w:p>
     <w:p>
@@ -2126,6 +2126,50 @@
     </w:p>
     <w:p>
       <w:pPr>
+        <w:widowControl/>
+        <w:spacing w:before="100" w:after="60"/>
+        <w:jc w:val="center"/>
+      </w:pPr>
+      <w:r>
+        <w:rPr>
+          <w:rFonts w:ascii="Montserrat" w:hAnsi="Montserrat" w:eastAsia="Montserrat"/>
+        </w:rPr>
+        <w:drawing>
+          <wp:inline xmlns:a="http://schemas.openxmlformats.org/drawingml/2006/main" xmlns:pic="http://schemas.openxmlformats.org/drawingml/2006/picture">
+            <wp:extent cx="5580000" cy="2650500"/>
+            <wp:docPr id="6" name="Обезличенные интерфейсные фрагменты Bitrix24 и 1С без клиентских реквизитов" descr="Обезличенные интерфейсные фрагменты Bitrix24 и 1С без клиентских реквизитов"/>
+            <wp:cNvGraphicFramePr>
+              <a:graphicFrameLocks noChangeAspect="1"/>
+            </wp:cNvGraphicFramePr>
+            <a:graphic>
+              <a:graphicData uri="http://schemas.openxmlformats.org/drawingml/2006/picture">
+                <pic:pic>
+                  <pic:nvPicPr>
+                    <pic:cNvPr id="0" name="image.png"/>
+                    <pic:cNvPicPr/>
+                  </pic:nvPicPr>
+                  <pic:blipFill>
+                    <a:blip r:embed="rId12"/>
+                    <a:stretch>
+                      <a:fillRect/>
+                    </a:stretch>
+                  </pic:blipFill>
+                  <pic:spPr>
+                    <a:xfrm>
+                      <a:off x="0" y="0"/>
+                      <a:ext cx="5580000" cy="2650500"/>
+                    </a:xfrm>
+                    <a:prstGeom prst="rect"/>
+                  </pic:spPr>
+                </pic:pic>
+              </a:graphicData>
+            </a:graphic>
+          </wp:inline>
+        </w:drawing>
+      </w:r>
+    </w:p>
+    <w:p>
+      <w:pPr>
         <w:pStyle w:val="ListParagraph"/>
         <w:widowControl/>
         <w:numPr>
@@ -2924,6 +2968,50 @@
           <w:rFonts w:ascii="Montserrat" w:hAnsi="Montserrat" w:eastAsia="Montserrat"/>
         </w:rPr>
         <w:t>После внедрения сотрудники перестали переносить между Bitrix24 и 1С номер заказа, сумму, срок и производственный статус. Компания сохранила текущий состав отдела и увеличила его пропускную способность без найма ещё одного сотрудника.</w:t>
+      </w:r>
+    </w:p>
+    <w:p>
+      <w:pPr>
+        <w:widowControl/>
+        <w:spacing w:before="100" w:after="60"/>
+        <w:jc w:val="center"/>
+      </w:pPr>
+      <w:r>
+        <w:rPr>
+          <w:rFonts w:ascii="Montserrat" w:hAnsi="Montserrat" w:eastAsia="Montserrat"/>
+        </w:rPr>
+        <w:drawing>
+          <wp:inline xmlns:a="http://schemas.openxmlformats.org/drawingml/2006/main" xmlns:pic="http://schemas.openxmlformats.org/drawingml/2006/picture">
+            <wp:extent cx="5580000" cy="2650500"/>
+            <wp:docPr id="7" name="Подробный график скорости, времени, производительности и экономии" descr="Подробный график скорости, времени, производительности и экономии"/>
+            <wp:cNvGraphicFramePr>
+              <a:graphicFrameLocks noChangeAspect="1"/>
+            </wp:cNvGraphicFramePr>
+            <a:graphic>
+              <a:graphicData uri="http://schemas.openxmlformats.org/drawingml/2006/picture">
+                <pic:pic>
+                  <pic:nvPicPr>
+                    <pic:cNvPr id="0" name="image.png"/>
+                    <pic:cNvPicPr/>
+                  </pic:nvPicPr>
+                  <pic:blipFill>
+                    <a:blip r:embed="rId13"/>
+                    <a:stretch>
+                      <a:fillRect/>
+                    </a:stretch>
+                  </pic:blipFill>
+                  <pic:spPr>
+                    <a:xfrm>
+                      <a:off x="0" y="0"/>
+                      <a:ext cx="5580000" cy="2650500"/>
+                    </a:xfrm>
+                    <a:prstGeom prst="rect"/>
+                  </pic:spPr>
+                </pic:pic>
+              </a:graphicData>
+            </a:graphic>
+          </wp:inline>
+        </w:drawing>
       </w:r>
     </w:p>
     <w:tbl>

</xml_diff>

<commit_message>
Fix slide 2 chart label
</commit_message>
<xml_diff>
--- a/downloads/ptz-steklo-weboptimize-case.docx
+++ b/downloads/ptz-steklo-weboptimize-case.docx
@@ -260,7 +260,7 @@
                     <pic:cNvPicPr/>
                   </pic:nvPicPr>
                   <pic:blipFill>
-                    <a:blip r:embed="rId9"/>
+                    <a:blip r:embed="rId18"/>
                     <a:stretch>
                       <a:fillRect/>
                     </a:stretch>
@@ -891,22 +891,6 @@
             </a:graphic>
           </wp:inline>
         </w:drawing>
-      </w:r>
-    </w:p>
-    <w:p>
-      <w:pPr>
-        <w:widowControl/>
-        <w:spacing w:before="0" w:after="140"/>
-        <w:jc w:val="center"/>
-      </w:pPr>
-      <w:r>
-        <w:rPr>
-          <w:rFonts w:ascii="Montserrat" w:hAnsi="Montserrat" w:eastAsia="Montserrat"/>
-          <w:i/>
-          <w:color w:val="667085"/>
-          <w:sz w:val="16"/>
-        </w:rPr>
-        <w:t>Примеры работ СтеклоЦентр.ПТЗ</w:t>
       </w:r>
     </w:p>
     <w:p>

</xml_diff>

<commit_message>
Polish PTZ case visual layout and copy
</commit_message>
<xml_diff>
--- a/downloads/ptz-steklo-weboptimize-case.docx
+++ b/downloads/ptz-steklo-weboptimize-case.docx
@@ -3466,7 +3466,7 @@
                 <w:color w:val="17212B"/>
                 <w:sz w:val="16"/>
               </w:rPr>
-              <w:t>Требовался сотрудник</w:t>
+              <w:t>Ручные операции ограничивали запас мощности</w:t>
             </w:r>
           </w:p>
         </w:tc>
@@ -3506,7 +3506,7 @@
                 <w:color w:val="17212B"/>
                 <w:sz w:val="16"/>
               </w:rPr>
-              <w:t>Один найм не потребовался</w:t>
+              <w:t>Дополнительный найм не потребовался</w:t>
             </w:r>
           </w:p>
         </w:tc>
@@ -3775,7 +3775,7 @@
           <w:sz w:val="22"/>
           <w:szCs w:val="22"/>
         </w:rPr>
-        <w:t xml:space="preserve">безопасная повторная отправка.</w:t>
+        <w:t>безопасная повторная отправка;</w:t>
       </w:r>
     </w:p>
     <w:p>
@@ -3957,7 +3957,7 @@
           <w:sz w:val="22"/>
           <w:szCs w:val="22"/>
         </w:rPr>
-        <w:t>решение можно развивать поэтапно без замены всех систем.</w:t>
+        <w:t>решение можно развивать поэтапно без замены всех систем;</w:t>
       </w:r>
     </w:p>
     <w:p>

</xml_diff>

<commit_message>
Add visualized outcome to PTZ Word case
</commit_message>
<xml_diff>
--- a/downloads/ptz-steklo-weboptimize-case.docx
+++ b/downloads/ptz-steklo-weboptimize-case.docx
@@ -4569,6 +4569,50 @@
           <w:szCs w:val="22"/>
         </w:rPr>
         <w:t xml:space="preserve">Итог</w:t>
+      </w:r>
+    </w:p>
+    <w:p>
+      <w:pPr>
+        <w:widowControl/>
+        <w:spacing w:before="100" w:after="60"/>
+        <w:jc w:val="center"/>
+      </w:pPr>
+      <w:r>
+        <w:rPr>
+          <w:rFonts w:ascii="Montserrat" w:hAnsi="Montserrat" w:eastAsia="Montserrat"/>
+        </w:rPr>
+        <w:drawing>
+          <wp:inline xmlns:a="http://schemas.openxmlformats.org/drawingml/2006/main" xmlns:pic="http://schemas.openxmlformats.org/drawingml/2006/picture">
+            <wp:extent cx="5580000" cy="2650500"/>
+            <wp:docPr id="8" name="Итоговая инфографика: скорость, высвобождённое время, запас ставки и полученная экономия" descr="Итоговая инфографика: скорость, высвобождённое время, запас ставки и полученная экономия"/>
+            <wp:cNvGraphicFramePr>
+              <a:graphicFrameLocks noChangeAspect="1"/>
+            </wp:cNvGraphicFramePr>
+            <a:graphic>
+              <a:graphicData uri="http://schemas.openxmlformats.org/drawingml/2006/picture">
+                <pic:pic>
+                  <pic:nvPicPr>
+                    <pic:cNvPr id="0" name="final-summary.png"/>
+                    <pic:cNvPicPr/>
+                  </pic:nvPicPr>
+                  <pic:blipFill>
+                    <a:blip r:embed="rId9"/>
+                    <a:stretch>
+                      <a:fillRect/>
+                    </a:stretch>
+                  </pic:blipFill>
+                  <pic:spPr>
+                    <a:xfrm>
+                      <a:off x="0" y="0"/>
+                      <a:ext cx="5580000" cy="2650500"/>
+                    </a:xfrm>
+                    <a:prstGeom prst="rect"/>
+                  </pic:spPr>
+                </pic:pic>
+              </a:graphicData>
+            </a:graphic>
+          </wp:inline>
+        </w:drawing>
       </w:r>
     </w:p>
     <w:p>

</xml_diff>